<commit_message>
Se agregaron las definiciones y la problemática
</commit_message>
<xml_diff>
--- a/documentacion/SRS LOCALIA.docx
+++ b/documentacion/SRS LOCALIA.docx
@@ -85,7 +85,7 @@
                     <pic:cNvPicPr/>
                   </pic:nvPicPr>
                   <pic:blipFill>
-                    <a:blip r:embed="rId4" cstate="print">
+                    <a:blip r:embed="rId5" cstate="print">
                       <a:extLst>
                         <a:ext uri="{28A0092B-C50C-407E-A947-70E740481C1C}">
                           <a14:useLocalDpi xmlns:a14="http://schemas.microsoft.com/office/drawing/2010/main" val="0"/>
@@ -151,7 +151,7 @@
                     <pic:cNvPicPr/>
                   </pic:nvPicPr>
                   <pic:blipFill>
-                    <a:blip r:embed="rId5" cstate="print">
+                    <a:blip r:embed="rId6" cstate="print">
                       <a:extLst>
                         <a:ext uri="{28A0092B-C50C-407E-A947-70E740481C1C}">
                           <a14:useLocalDpi xmlns:a14="http://schemas.microsoft.com/office/drawing/2010/main" val="0"/>
@@ -1060,15 +1060,343 @@
     <w:p>
       <w:pPr>
         <w:pStyle w:val="Ttulo2"/>
+        <w:jc w:val="both"/>
       </w:pPr>
       <w:r>
         <w:t>1.2 Alcance del sistema</w:t>
+      </w:r>
+    </w:p>
+    <w:p>
+      <w:pPr>
+        <w:jc w:val="both"/>
+        <w:rPr>
+          <w:rFonts w:ascii="Times New Roman" w:hAnsi="Times New Roman" w:cs="Times New Roman"/>
+          <w:kern w:val="0"/>
+          <w:sz w:val="24"/>
+          <w:szCs w:val="24"/>
+          <w:lang w:eastAsia="es-MX"/>
+        </w:rPr>
+      </w:pPr>
+      <w:r>
+        <w:rPr>
+          <w:rFonts w:ascii="Times New Roman" w:hAnsi="Times New Roman" w:cs="Times New Roman"/>
+          <w:kern w:val="0"/>
+          <w:sz w:val="24"/>
+          <w:szCs w:val="24"/>
+          <w:lang w:eastAsia="es-MX"/>
+        </w:rPr>
+        <w:t>LOCALIA es una plataforma móvil orientada al fortalecimiento del turismo sostenible y al impulso del comercio local. El sistema tiene como objetivo establecer un vínculo entre los turistas y las pequeñas y medianas empresas (</w:t>
+      </w:r>
+      <w:proofErr w:type="spellStart"/>
+      <w:r>
+        <w:rPr>
+          <w:rFonts w:ascii="Times New Roman" w:hAnsi="Times New Roman" w:cs="Times New Roman"/>
+          <w:kern w:val="0"/>
+          <w:sz w:val="24"/>
+          <w:szCs w:val="24"/>
+          <w:lang w:eastAsia="es-MX"/>
+        </w:rPr>
+        <w:t>PyMEs</w:t>
+      </w:r>
+      <w:proofErr w:type="spellEnd"/>
+      <w:r>
+        <w:rPr>
+          <w:rFonts w:ascii="Times New Roman" w:hAnsi="Times New Roman" w:cs="Times New Roman"/>
+          <w:kern w:val="0"/>
+          <w:sz w:val="24"/>
+          <w:szCs w:val="24"/>
+          <w:lang w:eastAsia="es-MX"/>
+        </w:rPr>
+        <w:t>) mediante el uso de herramientas tecnológicas que faciliten la identificación de establecimientos cercanos, el acceso a información relevante sobre los negocios y la interacción entre ambas partes.</w:t>
+      </w:r>
+    </w:p>
+    <w:p>
+      <w:pPr>
+        <w:jc w:val="both"/>
+        <w:rPr>
+          <w:rFonts w:ascii="Times New Roman" w:hAnsi="Times New Roman" w:cs="Times New Roman"/>
+          <w:kern w:val="0"/>
+          <w:sz w:val="24"/>
+          <w:szCs w:val="24"/>
+          <w:lang w:eastAsia="es-MX"/>
+        </w:rPr>
+      </w:pPr>
+      <w:r>
+        <w:rPr>
+          <w:rFonts w:ascii="Times New Roman" w:hAnsi="Times New Roman" w:cs="Times New Roman"/>
+          <w:kern w:val="0"/>
+          <w:sz w:val="24"/>
+          <w:szCs w:val="24"/>
+          <w:lang w:eastAsia="es-MX"/>
+        </w:rPr>
+        <w:t xml:space="preserve">La plataforma integra mecanismos de geolocalización, pagos digitales mediante códigos QR e integración con Coppel </w:t>
+      </w:r>
+      <w:proofErr w:type="spellStart"/>
+      <w:r>
+        <w:rPr>
+          <w:rFonts w:ascii="Times New Roman" w:hAnsi="Times New Roman" w:cs="Times New Roman"/>
+          <w:kern w:val="0"/>
+          <w:sz w:val="24"/>
+          <w:szCs w:val="24"/>
+          <w:lang w:eastAsia="es-MX"/>
+        </w:rPr>
+        <w:t>Pay</w:t>
+      </w:r>
+      <w:proofErr w:type="spellEnd"/>
+      <w:r>
+        <w:rPr>
+          <w:rFonts w:ascii="Times New Roman" w:hAnsi="Times New Roman" w:cs="Times New Roman"/>
+          <w:kern w:val="0"/>
+          <w:sz w:val="24"/>
+          <w:szCs w:val="24"/>
+          <w:lang w:eastAsia="es-MX"/>
+        </w:rPr>
+        <w:t>, permitiendo realizar transacciones de manera rápida y segura. De igual manera, incorpora un sistema de recompensas que incentiva el consumo en establecimientos locales mediante la acumulación de puntos.</w:t>
+      </w:r>
+    </w:p>
+    <w:p>
+      <w:pPr>
+        <w:jc w:val="both"/>
+        <w:rPr>
+          <w:rFonts w:ascii="Times New Roman" w:hAnsi="Times New Roman" w:cs="Times New Roman"/>
+          <w:kern w:val="0"/>
+          <w:sz w:val="24"/>
+          <w:szCs w:val="24"/>
+          <w:lang w:eastAsia="es-MX"/>
+        </w:rPr>
+      </w:pPr>
+      <w:r>
+        <w:rPr>
+          <w:rFonts w:ascii="Times New Roman" w:hAnsi="Times New Roman" w:cs="Times New Roman"/>
+          <w:kern w:val="0"/>
+          <w:sz w:val="24"/>
+          <w:szCs w:val="24"/>
+          <w:lang w:eastAsia="es-MX"/>
+        </w:rPr>
+        <w:t xml:space="preserve">Desde la perspectiva técnica, la solución se implementa bajo una arquitectura de </w:t>
+      </w:r>
+      <w:proofErr w:type="spellStart"/>
+      <w:r>
+        <w:rPr>
+          <w:rFonts w:ascii="Times New Roman" w:hAnsi="Times New Roman" w:cs="Times New Roman"/>
+          <w:kern w:val="0"/>
+          <w:sz w:val="24"/>
+          <w:szCs w:val="24"/>
+          <w:lang w:eastAsia="es-MX"/>
+        </w:rPr>
+        <w:t>microservicios</w:t>
+      </w:r>
+      <w:proofErr w:type="spellEnd"/>
+      <w:r>
+        <w:rPr>
+          <w:rFonts w:ascii="Times New Roman" w:hAnsi="Times New Roman" w:cs="Times New Roman"/>
+          <w:kern w:val="0"/>
+          <w:sz w:val="24"/>
+          <w:szCs w:val="24"/>
+          <w:lang w:eastAsia="es-MX"/>
+        </w:rPr>
+        <w:t>, en la que cada componente opera de forma independiente y se especializa en una función específica, como la gestión de usuarios, la administración de negocios, el procesamiento de pagos, el sistema de recompensas, el envío de notificaciones y la asistencia inteligente. Esta estructura permite mejorar la escalabilidad, el mantenimiento y la disponibilidad del sistema, además de facilitar la incorporación de nuevas funcionalidades sin afectar el funcionamiento general de la plataforma.</w:t>
+      </w:r>
+    </w:p>
+    <w:p>
+      <w:pPr>
+        <w:pStyle w:val="Ttulo2"/>
+        <w:jc w:val="both"/>
+      </w:pPr>
+      <w:r>
+        <w:t>1.3 Definiciones, acrónimos y abreviaturas</w:t>
+      </w:r>
+    </w:p>
+    <w:p>
+      <w:pPr>
+        <w:jc w:val="both"/>
+        <w:rPr>
+          <w:rFonts w:ascii="Times New Roman" w:hAnsi="Times New Roman" w:cs="Times New Roman"/>
+          <w:kern w:val="0"/>
+          <w:sz w:val="24"/>
+          <w:szCs w:val="24"/>
+          <w:lang w:eastAsia="es-MX"/>
+        </w:rPr>
+      </w:pPr>
+      <w:r>
+        <w:rPr>
+          <w:rFonts w:ascii="Times New Roman" w:hAnsi="Times New Roman" w:cs="Times New Roman"/>
+          <w:kern w:val="0"/>
+          <w:sz w:val="24"/>
+          <w:szCs w:val="24"/>
+          <w:lang w:eastAsia="es-MX"/>
+        </w:rPr>
+        <w:t>Para una mejor comprensión del documento, es importante definir algunos conceptos que se utilizarán durante el desarrollo del proyecto.</w:t>
+      </w:r>
+    </w:p>
+    <w:p>
+      <w:pPr>
+        <w:pStyle w:val="Prrafodelista"/>
+        <w:numPr>
+          <w:ilvl w:val="0"/>
+          <w:numId w:val="4"/>
+        </w:numPr>
+        <w:tabs>
+          <w:tab w:val="num" w:pos="720"/>
+        </w:tabs>
+        <w:jc w:val="both"/>
+        <w:rPr>
+          <w:rFonts w:ascii="Times New Roman" w:hAnsi="Times New Roman" w:cs="Times New Roman"/>
+          <w:kern w:val="0"/>
+          <w:sz w:val="24"/>
+          <w:szCs w:val="24"/>
+          <w:lang w:eastAsia="es-MX"/>
+        </w:rPr>
+      </w:pPr>
+      <w:proofErr w:type="spellStart"/>
+      <w:r>
+        <w:rPr>
+          <w:rFonts w:ascii="Times New Roman" w:hAnsi="Times New Roman" w:cs="Times New Roman"/>
+          <w:kern w:val="0"/>
+          <w:sz w:val="24"/>
+          <w:szCs w:val="24"/>
+          <w:lang w:eastAsia="es-MX"/>
+        </w:rPr>
+        <w:t>PyME</w:t>
+      </w:r>
+      <w:proofErr w:type="spellEnd"/>
+      <w:r>
+        <w:rPr>
+          <w:rFonts w:ascii="Times New Roman" w:hAnsi="Times New Roman" w:cs="Times New Roman"/>
+          <w:kern w:val="0"/>
+          <w:sz w:val="24"/>
+          <w:szCs w:val="24"/>
+          <w:lang w:eastAsia="es-MX"/>
+        </w:rPr>
+        <w:t xml:space="preserve">: pequeña y mediana empresa. </w:t>
+      </w:r>
+    </w:p>
+    <w:p>
+      <w:pPr>
+        <w:pStyle w:val="Prrafodelista"/>
+        <w:numPr>
+          <w:ilvl w:val="0"/>
+          <w:numId w:val="4"/>
+        </w:numPr>
+        <w:tabs>
+          <w:tab w:val="num" w:pos="720"/>
+        </w:tabs>
+        <w:jc w:val="both"/>
+        <w:rPr>
+          <w:rFonts w:ascii="Times New Roman" w:hAnsi="Times New Roman" w:cs="Times New Roman"/>
+          <w:kern w:val="0"/>
+          <w:sz w:val="24"/>
+          <w:szCs w:val="24"/>
+          <w:lang w:eastAsia="es-MX"/>
+        </w:rPr>
+      </w:pPr>
+      <w:r>
+        <w:rPr>
+          <w:rFonts w:ascii="Times New Roman" w:hAnsi="Times New Roman" w:cs="Times New Roman"/>
+          <w:kern w:val="0"/>
+          <w:sz w:val="24"/>
+          <w:szCs w:val="24"/>
+          <w:lang w:eastAsia="es-MX"/>
+        </w:rPr>
+        <w:t xml:space="preserve">JWT (JSON Web </w:t>
+      </w:r>
+      <w:proofErr w:type="spellStart"/>
+      <w:r>
+        <w:rPr>
+          <w:rFonts w:ascii="Times New Roman" w:hAnsi="Times New Roman" w:cs="Times New Roman"/>
+          <w:kern w:val="0"/>
+          <w:sz w:val="24"/>
+          <w:szCs w:val="24"/>
+          <w:lang w:eastAsia="es-MX"/>
+        </w:rPr>
+        <w:t>Token</w:t>
+      </w:r>
+      <w:proofErr w:type="spellEnd"/>
+      <w:r>
+        <w:rPr>
+          <w:rFonts w:ascii="Times New Roman" w:hAnsi="Times New Roman" w:cs="Times New Roman"/>
+          <w:kern w:val="0"/>
+          <w:sz w:val="24"/>
+          <w:szCs w:val="24"/>
+          <w:lang w:eastAsia="es-MX"/>
+        </w:rPr>
+        <w:t xml:space="preserve">): mecanismo utilizado para la autenticación y autorización de usuarios. </w:t>
+      </w:r>
+    </w:p>
+    <w:p>
+      <w:pPr>
+        <w:pStyle w:val="Prrafodelista"/>
+        <w:numPr>
+          <w:ilvl w:val="0"/>
+          <w:numId w:val="4"/>
+        </w:numPr>
+        <w:tabs>
+          <w:tab w:val="num" w:pos="720"/>
+        </w:tabs>
+        <w:jc w:val="both"/>
+        <w:rPr>
+          <w:rFonts w:ascii="Times New Roman" w:hAnsi="Times New Roman" w:cs="Times New Roman"/>
+          <w:kern w:val="0"/>
+          <w:sz w:val="24"/>
+          <w:szCs w:val="24"/>
+          <w:lang w:eastAsia="es-MX"/>
+        </w:rPr>
+      </w:pPr>
+      <w:r>
+        <w:rPr>
+          <w:rFonts w:ascii="Times New Roman" w:hAnsi="Times New Roman" w:cs="Times New Roman"/>
+          <w:kern w:val="0"/>
+          <w:sz w:val="24"/>
+          <w:szCs w:val="24"/>
+          <w:lang w:eastAsia="es-MX"/>
+        </w:rPr>
+        <w:t xml:space="preserve">QR (Quick Response </w:t>
+      </w:r>
+      <w:proofErr w:type="spellStart"/>
+      <w:r>
+        <w:rPr>
+          <w:rFonts w:ascii="Times New Roman" w:hAnsi="Times New Roman" w:cs="Times New Roman"/>
+          <w:kern w:val="0"/>
+          <w:sz w:val="24"/>
+          <w:szCs w:val="24"/>
+          <w:lang w:eastAsia="es-MX"/>
+        </w:rPr>
+        <w:t>Cod</w:t>
       </w:r>
       <w:bookmarkStart w:id="0" w:name="_GoBack"/>
       <w:bookmarkEnd w:id="0"/>
-    </w:p>
-    <w:p>
-      <w:pPr>
+      <w:r>
+        <w:rPr>
+          <w:rFonts w:ascii="Times New Roman" w:hAnsi="Times New Roman" w:cs="Times New Roman"/>
+          <w:kern w:val="0"/>
+          <w:sz w:val="24"/>
+          <w:szCs w:val="24"/>
+          <w:lang w:eastAsia="es-MX"/>
+        </w:rPr>
+        <w:t>e</w:t>
+      </w:r>
+      <w:proofErr w:type="spellEnd"/>
+      <w:r>
+        <w:rPr>
+          <w:rFonts w:ascii="Times New Roman" w:hAnsi="Times New Roman" w:cs="Times New Roman"/>
+          <w:kern w:val="0"/>
+          <w:sz w:val="24"/>
+          <w:szCs w:val="24"/>
+          <w:lang w:eastAsia="es-MX"/>
+        </w:rPr>
+        <w:t xml:space="preserve">): código que permite realizar pagos de forma rápida. </w:t>
+      </w:r>
+    </w:p>
+    <w:p>
+      <w:pPr>
+        <w:pStyle w:val="Prrafodelista"/>
+        <w:numPr>
+          <w:ilvl w:val="0"/>
+          <w:numId w:val="4"/>
+        </w:numPr>
+        <w:tabs>
+          <w:tab w:val="num" w:pos="720"/>
+        </w:tabs>
         <w:jc w:val="both"/>
         <w:rPr>
           <w:rFonts w:ascii="Times New Roman" w:hAnsi="Times New Roman" w:cs="Times New Roman"/>
@@ -1078,16 +1406,6 @@
           <w:lang w:eastAsia="es-MX"/>
         </w:rPr>
       </w:pPr>
-      <w:r>
-        <w:rPr>
-          <w:rFonts w:ascii="Times New Roman" w:hAnsi="Times New Roman" w:cs="Times New Roman"/>
-          <w:kern w:val="0"/>
-          <w:sz w:val="24"/>
-          <w:szCs w:val="24"/>
-          <w:lang w:eastAsia="es-MX"/>
-        </w:rPr>
-        <w:t>LOCALIA es una plataforma móvil orientada al fortalecimiento del turismo sostenible y al impulso del comercio local. El sistema tiene como objetivo establecer un vínculo entre los turistas y las pequeñas y medianas empresas (</w:t>
-      </w:r>
       <w:proofErr w:type="spellStart"/>
       <w:r>
         <w:rPr>
@@ -1097,6 +1415,222 @@
           <w:szCs w:val="24"/>
           <w:lang w:eastAsia="es-MX"/>
         </w:rPr>
+        <w:lastRenderedPageBreak/>
+        <w:t>RabbitMQ</w:t>
+      </w:r>
+      <w:proofErr w:type="spellEnd"/>
+      <w:r>
+        <w:rPr>
+          <w:rFonts w:ascii="Times New Roman" w:hAnsi="Times New Roman" w:cs="Times New Roman"/>
+          <w:kern w:val="0"/>
+          <w:sz w:val="24"/>
+          <w:szCs w:val="24"/>
+          <w:lang w:eastAsia="es-MX"/>
+        </w:rPr>
+        <w:t xml:space="preserve">: herramienta utilizada para la comunicación entre los </w:t>
+      </w:r>
+      <w:proofErr w:type="spellStart"/>
+      <w:r>
+        <w:rPr>
+          <w:rFonts w:ascii="Times New Roman" w:hAnsi="Times New Roman" w:cs="Times New Roman"/>
+          <w:kern w:val="0"/>
+          <w:sz w:val="24"/>
+          <w:szCs w:val="24"/>
+          <w:lang w:eastAsia="es-MX"/>
+        </w:rPr>
+        <w:t>microservicios</w:t>
+      </w:r>
+      <w:proofErr w:type="spellEnd"/>
+      <w:r>
+        <w:rPr>
+          <w:rFonts w:ascii="Times New Roman" w:hAnsi="Times New Roman" w:cs="Times New Roman"/>
+          <w:kern w:val="0"/>
+          <w:sz w:val="24"/>
+          <w:szCs w:val="24"/>
+          <w:lang w:eastAsia="es-MX"/>
+        </w:rPr>
+        <w:t xml:space="preserve">. </w:t>
+      </w:r>
+    </w:p>
+    <w:p>
+      <w:pPr>
+        <w:pStyle w:val="Prrafodelista"/>
+        <w:numPr>
+          <w:ilvl w:val="0"/>
+          <w:numId w:val="4"/>
+        </w:numPr>
+        <w:tabs>
+          <w:tab w:val="num" w:pos="720"/>
+        </w:tabs>
+        <w:jc w:val="both"/>
+        <w:rPr>
+          <w:rFonts w:ascii="Times New Roman" w:hAnsi="Times New Roman" w:cs="Times New Roman"/>
+          <w:kern w:val="0"/>
+          <w:sz w:val="24"/>
+          <w:szCs w:val="24"/>
+          <w:lang w:eastAsia="es-MX"/>
+        </w:rPr>
+      </w:pPr>
+      <w:r>
+        <w:rPr>
+          <w:rFonts w:ascii="Times New Roman" w:hAnsi="Times New Roman" w:cs="Times New Roman"/>
+          <w:kern w:val="0"/>
+          <w:sz w:val="24"/>
+          <w:szCs w:val="24"/>
+          <w:lang w:eastAsia="es-MX"/>
+        </w:rPr>
+        <w:t xml:space="preserve">SRS (Software </w:t>
+      </w:r>
+      <w:proofErr w:type="spellStart"/>
+      <w:r>
+        <w:rPr>
+          <w:rFonts w:ascii="Times New Roman" w:hAnsi="Times New Roman" w:cs="Times New Roman"/>
+          <w:kern w:val="0"/>
+          <w:sz w:val="24"/>
+          <w:szCs w:val="24"/>
+          <w:lang w:eastAsia="es-MX"/>
+        </w:rPr>
+        <w:t>Requirements</w:t>
+      </w:r>
+      <w:proofErr w:type="spellEnd"/>
+      <w:r>
+        <w:rPr>
+          <w:rFonts w:ascii="Times New Roman" w:hAnsi="Times New Roman" w:cs="Times New Roman"/>
+          <w:kern w:val="0"/>
+          <w:sz w:val="24"/>
+          <w:szCs w:val="24"/>
+          <w:lang w:eastAsia="es-MX"/>
+        </w:rPr>
+        <w:t xml:space="preserve"> </w:t>
+      </w:r>
+      <w:proofErr w:type="spellStart"/>
+      <w:r>
+        <w:rPr>
+          <w:rFonts w:ascii="Times New Roman" w:hAnsi="Times New Roman" w:cs="Times New Roman"/>
+          <w:kern w:val="0"/>
+          <w:sz w:val="24"/>
+          <w:szCs w:val="24"/>
+          <w:lang w:eastAsia="es-MX"/>
+        </w:rPr>
+        <w:t>Specification</w:t>
+      </w:r>
+      <w:proofErr w:type="spellEnd"/>
+      <w:r>
+        <w:rPr>
+          <w:rFonts w:ascii="Times New Roman" w:hAnsi="Times New Roman" w:cs="Times New Roman"/>
+          <w:kern w:val="0"/>
+          <w:sz w:val="24"/>
+          <w:szCs w:val="24"/>
+          <w:lang w:eastAsia="es-MX"/>
+        </w:rPr>
+        <w:t xml:space="preserve">): documento en el que se establecen los requisitos del sistema. </w:t>
+      </w:r>
+    </w:p>
+    <w:p>
+      <w:pPr>
+        <w:pStyle w:val="Ttulo1"/>
+        <w:jc w:val="both"/>
+      </w:pPr>
+      <w:r>
+        <w:t>2. Descripción general</w:t>
+      </w:r>
+    </w:p>
+    <w:p>
+      <w:pPr>
+        <w:pStyle w:val="Ttulo2"/>
+        <w:jc w:val="both"/>
+      </w:pPr>
+      <w:r>
+        <w:t>2.1 Problemática a resolver</w:t>
+      </w:r>
+    </w:p>
+    <w:p>
+      <w:pPr>
+        <w:jc w:val="both"/>
+        <w:rPr>
+          <w:rFonts w:ascii="Times New Roman" w:hAnsi="Times New Roman" w:cs="Times New Roman"/>
+          <w:kern w:val="0"/>
+          <w:sz w:val="24"/>
+          <w:szCs w:val="24"/>
+          <w:lang w:eastAsia="es-MX"/>
+        </w:rPr>
+      </w:pPr>
+      <w:r>
+        <w:rPr>
+          <w:rFonts w:ascii="Times New Roman" w:hAnsi="Times New Roman" w:cs="Times New Roman"/>
+          <w:kern w:val="0"/>
+          <w:sz w:val="24"/>
+          <w:szCs w:val="24"/>
+          <w:lang w:eastAsia="es-MX"/>
+        </w:rPr>
+        <w:t>Actualmente, muchos negocios locales tienen dificultades para aprovechar las herramientas digitales para promocionar sus productos y servicios. Esta situación limita su crecimiento y reduce las oportunidades de llegar a un mayor número de consumidores, especialmente durante temporadas con una gran afluencia de visitantes.</w:t>
+      </w:r>
+    </w:p>
+    <w:p>
+      <w:pPr>
+        <w:pStyle w:val="Prrafodelista"/>
+        <w:numPr>
+          <w:ilvl w:val="0"/>
+          <w:numId w:val="3"/>
+        </w:numPr>
+        <w:jc w:val="both"/>
+        <w:rPr>
+          <w:rFonts w:ascii="Times New Roman" w:hAnsi="Times New Roman" w:cs="Times New Roman"/>
+          <w:kern w:val="0"/>
+          <w:sz w:val="24"/>
+          <w:szCs w:val="24"/>
+          <w:lang w:eastAsia="es-MX"/>
+        </w:rPr>
+      </w:pPr>
+      <w:r>
+        <w:rPr>
+          <w:rFonts w:ascii="Times New Roman" w:hAnsi="Times New Roman" w:cs="Times New Roman"/>
+          <w:kern w:val="0"/>
+          <w:sz w:val="24"/>
+          <w:szCs w:val="24"/>
+          <w:lang w:eastAsia="es-MX"/>
+        </w:rPr>
+        <w:t>Entre los principales problemas identificados se encuentran los siguientes:</w:t>
+      </w:r>
+    </w:p>
+    <w:p>
+      <w:pPr>
+        <w:pStyle w:val="Prrafodelista"/>
+        <w:numPr>
+          <w:ilvl w:val="0"/>
+          <w:numId w:val="3"/>
+        </w:numPr>
+        <w:tabs>
+          <w:tab w:val="num" w:pos="720"/>
+        </w:tabs>
+        <w:jc w:val="both"/>
+        <w:rPr>
+          <w:rFonts w:ascii="Times New Roman" w:hAnsi="Times New Roman" w:cs="Times New Roman"/>
+          <w:kern w:val="0"/>
+          <w:sz w:val="24"/>
+          <w:szCs w:val="24"/>
+          <w:lang w:eastAsia="es-MX"/>
+        </w:rPr>
+      </w:pPr>
+      <w:r>
+        <w:rPr>
+          <w:rFonts w:ascii="Times New Roman" w:hAnsi="Times New Roman" w:cs="Times New Roman"/>
+          <w:kern w:val="0"/>
+          <w:sz w:val="24"/>
+          <w:szCs w:val="24"/>
+          <w:lang w:eastAsia="es-MX"/>
+        </w:rPr>
+        <w:t xml:space="preserve">La falta de una plataforma centralizada que permita a las </w:t>
+      </w:r>
+      <w:proofErr w:type="spellStart"/>
+      <w:r>
+        <w:rPr>
+          <w:rFonts w:ascii="Times New Roman" w:hAnsi="Times New Roman" w:cs="Times New Roman"/>
+          <w:kern w:val="0"/>
+          <w:sz w:val="24"/>
+          <w:szCs w:val="24"/>
+          <w:lang w:eastAsia="es-MX"/>
+        </w:rPr>
         <w:t>PyMEs</w:t>
       </w:r>
       <w:proofErr w:type="spellEnd"/>
@@ -1108,11 +1642,19 @@
           <w:szCs w:val="24"/>
           <w:lang w:eastAsia="es-MX"/>
         </w:rPr>
-        <w:t>) mediante el uso de herramientas tecnológicas que faciliten la identificación de establecimientos cercanos, el acceso a información relevante sobre los negocios y la interacción entre ambas partes.</w:t>
-      </w:r>
-    </w:p>
-    <w:p>
-      <w:pPr>
+        <w:t xml:space="preserve"> aumentar su visibilidad. </w:t>
+      </w:r>
+    </w:p>
+    <w:p>
+      <w:pPr>
+        <w:pStyle w:val="Prrafodelista"/>
+        <w:numPr>
+          <w:ilvl w:val="0"/>
+          <w:numId w:val="3"/>
+        </w:numPr>
+        <w:tabs>
+          <w:tab w:val="num" w:pos="720"/>
+        </w:tabs>
         <w:jc w:val="both"/>
         <w:rPr>
           <w:rFonts w:ascii="Times New Roman" w:hAnsi="Times New Roman" w:cs="Times New Roman"/>
@@ -1130,33 +1672,19 @@
           <w:szCs w:val="24"/>
           <w:lang w:eastAsia="es-MX"/>
         </w:rPr>
-        <w:t xml:space="preserve">La plataforma integra mecanismos de geolocalización, pagos digitales mediante códigos QR e integración con Coppel </w:t>
-      </w:r>
-      <w:proofErr w:type="spellStart"/>
-      <w:r>
-        <w:rPr>
-          <w:rFonts w:ascii="Times New Roman" w:hAnsi="Times New Roman" w:cs="Times New Roman"/>
-          <w:kern w:val="0"/>
-          <w:sz w:val="24"/>
-          <w:szCs w:val="24"/>
-          <w:lang w:eastAsia="es-MX"/>
-        </w:rPr>
-        <w:t>Pay</w:t>
-      </w:r>
-      <w:proofErr w:type="spellEnd"/>
-      <w:r>
-        <w:rPr>
-          <w:rFonts w:ascii="Times New Roman" w:hAnsi="Times New Roman" w:cs="Times New Roman"/>
-          <w:kern w:val="0"/>
-          <w:sz w:val="24"/>
-          <w:szCs w:val="24"/>
-          <w:lang w:eastAsia="es-MX"/>
-        </w:rPr>
-        <w:t>, permitiendo realizar transacciones de manera rápida y segura. De igual manera, incorpora un sistema de recompensas que incentiva el consumo en establecimientos locales mediante la acumulación de puntos.</w:t>
-      </w:r>
-    </w:p>
-    <w:p>
-      <w:pPr>
+        <w:t xml:space="preserve">La ausencia de métodos de pago modernos que faciliten las transacciones. </w:t>
+      </w:r>
+    </w:p>
+    <w:p>
+      <w:pPr>
+        <w:pStyle w:val="Prrafodelista"/>
+        <w:numPr>
+          <w:ilvl w:val="0"/>
+          <w:numId w:val="3"/>
+        </w:numPr>
+        <w:tabs>
+          <w:tab w:val="num" w:pos="720"/>
+        </w:tabs>
         <w:jc w:val="both"/>
         <w:rPr>
           <w:rFonts w:ascii="Times New Roman" w:hAnsi="Times New Roman" w:cs="Times New Roman"/>
@@ -1174,32 +1702,51 @@
           <w:szCs w:val="24"/>
           <w:lang w:eastAsia="es-MX"/>
         </w:rPr>
-        <w:t xml:space="preserve">Desde la perspectiva técnica, la solución se implementa bajo una arquitectura de </w:t>
-      </w:r>
-      <w:proofErr w:type="spellStart"/>
-      <w:r>
-        <w:rPr>
-          <w:rFonts w:ascii="Times New Roman" w:hAnsi="Times New Roman" w:cs="Times New Roman"/>
-          <w:kern w:val="0"/>
-          <w:sz w:val="24"/>
-          <w:szCs w:val="24"/>
-          <w:lang w:eastAsia="es-MX"/>
-        </w:rPr>
-        <w:t>microservicios</w:t>
-      </w:r>
-      <w:proofErr w:type="spellEnd"/>
-      <w:r>
-        <w:rPr>
-          <w:rFonts w:ascii="Times New Roman" w:hAnsi="Times New Roman" w:cs="Times New Roman"/>
-          <w:kern w:val="0"/>
-          <w:sz w:val="24"/>
-          <w:szCs w:val="24"/>
-          <w:lang w:eastAsia="es-MX"/>
-        </w:rPr>
-        <w:t>, en la que cada componente opera de forma independiente y se especializa en una función específica, como la gestión de usuarios, la administración de negocios, el procesamiento de pagos, el sistema de recompensas, el envío de notificaciones y la asistencia inteligente. Esta estructura permite mejorar la escalabilidad, el mantenimiento y la disponibilidad del sistema, además de facilitar la incorporación de nuevas funcionalidades sin afectar el funcionamiento general de la plataforma.</w:t>
-      </w:r>
-    </w:p>
-    <w:p/>
+        <w:t xml:space="preserve">La falta de estrategias que promuevan la fidelización de los clientes. </w:t>
+      </w:r>
+    </w:p>
+    <w:p>
+      <w:pPr>
+        <w:pStyle w:val="Prrafodelista"/>
+        <w:numPr>
+          <w:ilvl w:val="0"/>
+          <w:numId w:val="3"/>
+        </w:numPr>
+        <w:tabs>
+          <w:tab w:val="num" w:pos="720"/>
+        </w:tabs>
+        <w:jc w:val="both"/>
+        <w:rPr>
+          <w:rFonts w:ascii="Times New Roman" w:hAnsi="Times New Roman" w:cs="Times New Roman"/>
+          <w:kern w:val="0"/>
+          <w:sz w:val="24"/>
+          <w:szCs w:val="24"/>
+          <w:lang w:eastAsia="es-MX"/>
+        </w:rPr>
+      </w:pPr>
+      <w:r>
+        <w:rPr>
+          <w:rFonts w:ascii="Times New Roman" w:hAnsi="Times New Roman" w:cs="Times New Roman"/>
+          <w:kern w:val="0"/>
+          <w:sz w:val="24"/>
+          <w:szCs w:val="24"/>
+          <w:lang w:eastAsia="es-MX"/>
+        </w:rPr>
+        <w:t>La necesidad de integrar en un mismo sistema la localización de los establecimientos, los pagos y los programas de recompensas.</w:t>
+      </w:r>
+    </w:p>
+    <w:p>
+      <w:pPr>
+        <w:jc w:val="both"/>
+        <w:rPr>
+          <w:rFonts w:ascii="Times New Roman" w:hAnsi="Times New Roman" w:cs="Times New Roman"/>
+          <w:kern w:val="0"/>
+          <w:sz w:val="24"/>
+          <w:szCs w:val="24"/>
+          <w:lang w:eastAsia="es-MX"/>
+        </w:rPr>
+      </w:pPr>
+    </w:p>
     <w:sectPr>
       <w:pgSz w:w="12240" w:h="15840"/>
       <w:pgMar w:top="1440" w:right="1440" w:bottom="1440" w:left="1440" w:header="708" w:footer="708" w:gutter="0"/>
@@ -1208,6 +1755,547 @@
     </w:sectPr>
   </w:body>
 </w:document>
+</file>
+
+<file path=word/numbering.xml><?xml version="1.0" encoding="utf-8"?>
+<w:numbering xmlns:wpc="http://schemas.microsoft.com/office/word/2010/wordprocessingCanvas" xmlns:cx="http://schemas.microsoft.com/office/drawing/2014/chartex" xmlns:cx1="http://schemas.microsoft.com/office/drawing/2015/9/8/chartex" xmlns:mc="http://schemas.openxmlformats.org/markup-compatibility/2006" xmlns:o="urn:schemas-microsoft-com:office:office" xmlns:r="http://schemas.openxmlformats.org/officeDocument/2006/relationships" xmlns:m="http://schemas.openxmlformats.org/officeDocument/2006/math" xmlns:v="urn:schemas-microsoft-com:vml" xmlns:wp14="http://schemas.microsoft.com/office/word/2010/wordprocessingDrawing" xmlns:wp="http://schemas.openxmlformats.org/drawingml/2006/wordprocessingDrawing" xmlns:w10="urn:schemas-microsoft-com:office:word" xmlns:w="http://schemas.openxmlformats.org/wordprocessingml/2006/main" xmlns:w14="http://schemas.microsoft.com/office/word/2010/wordml" xmlns:w15="http://schemas.microsoft.com/office/word/2012/wordml" xmlns:w16se="http://schemas.microsoft.com/office/word/2015/wordml/symex" xmlns:wpg="http://schemas.microsoft.com/office/word/2010/wordprocessingGroup" xmlns:wpi="http://schemas.microsoft.com/office/word/2010/wordprocessingInk" xmlns:wne="http://schemas.microsoft.com/office/word/2006/wordml" xmlns:wps="http://schemas.microsoft.com/office/word/2010/wordprocessingShape" mc:Ignorable="w14 w15 w16se wp14">
+  <w:abstractNum w:abstractNumId="0" w15:restartNumberingAfterBreak="0">
+    <w:nsid w:val="438D4760"/>
+    <w:multiLevelType w:val="hybridMultilevel"/>
+    <w:tmpl w:val="C666B85A"/>
+    <w:lvl w:ilvl="0" w:tplc="080A0001">
+      <w:start w:val="1"/>
+      <w:numFmt w:val="bullet"/>
+      <w:lvlText w:val=""/>
+      <w:lvlJc w:val="left"/>
+      <w:pPr>
+        <w:ind w:left="720" w:hanging="360"/>
+      </w:pPr>
+      <w:rPr>
+        <w:rFonts w:ascii="Symbol" w:hAnsi="Symbol" w:hint="default"/>
+      </w:rPr>
+    </w:lvl>
+    <w:lvl w:ilvl="1" w:tplc="080A0003" w:tentative="1">
+      <w:start w:val="1"/>
+      <w:numFmt w:val="bullet"/>
+      <w:lvlText w:val="o"/>
+      <w:lvlJc w:val="left"/>
+      <w:pPr>
+        <w:ind w:left="1440" w:hanging="360"/>
+      </w:pPr>
+      <w:rPr>
+        <w:rFonts w:ascii="Courier New" w:hAnsi="Courier New" w:cs="Courier New" w:hint="default"/>
+      </w:rPr>
+    </w:lvl>
+    <w:lvl w:ilvl="2" w:tplc="080A0005" w:tentative="1">
+      <w:start w:val="1"/>
+      <w:numFmt w:val="bullet"/>
+      <w:lvlText w:val=""/>
+      <w:lvlJc w:val="left"/>
+      <w:pPr>
+        <w:ind w:left="2160" w:hanging="360"/>
+      </w:pPr>
+      <w:rPr>
+        <w:rFonts w:ascii="Wingdings" w:hAnsi="Wingdings" w:hint="default"/>
+      </w:rPr>
+    </w:lvl>
+    <w:lvl w:ilvl="3" w:tplc="080A0001" w:tentative="1">
+      <w:start w:val="1"/>
+      <w:numFmt w:val="bullet"/>
+      <w:lvlText w:val=""/>
+      <w:lvlJc w:val="left"/>
+      <w:pPr>
+        <w:ind w:left="2880" w:hanging="360"/>
+      </w:pPr>
+      <w:rPr>
+        <w:rFonts w:ascii="Symbol" w:hAnsi="Symbol" w:hint="default"/>
+      </w:rPr>
+    </w:lvl>
+    <w:lvl w:ilvl="4" w:tplc="080A0003" w:tentative="1">
+      <w:start w:val="1"/>
+      <w:numFmt w:val="bullet"/>
+      <w:lvlText w:val="o"/>
+      <w:lvlJc w:val="left"/>
+      <w:pPr>
+        <w:ind w:left="3600" w:hanging="360"/>
+      </w:pPr>
+      <w:rPr>
+        <w:rFonts w:ascii="Courier New" w:hAnsi="Courier New" w:cs="Courier New" w:hint="default"/>
+      </w:rPr>
+    </w:lvl>
+    <w:lvl w:ilvl="5" w:tplc="080A0005" w:tentative="1">
+      <w:start w:val="1"/>
+      <w:numFmt w:val="bullet"/>
+      <w:lvlText w:val=""/>
+      <w:lvlJc w:val="left"/>
+      <w:pPr>
+        <w:ind w:left="4320" w:hanging="360"/>
+      </w:pPr>
+      <w:rPr>
+        <w:rFonts w:ascii="Wingdings" w:hAnsi="Wingdings" w:hint="default"/>
+      </w:rPr>
+    </w:lvl>
+    <w:lvl w:ilvl="6" w:tplc="080A0001" w:tentative="1">
+      <w:start w:val="1"/>
+      <w:numFmt w:val="bullet"/>
+      <w:lvlText w:val=""/>
+      <w:lvlJc w:val="left"/>
+      <w:pPr>
+        <w:ind w:left="5040" w:hanging="360"/>
+      </w:pPr>
+      <w:rPr>
+        <w:rFonts w:ascii="Symbol" w:hAnsi="Symbol" w:hint="default"/>
+      </w:rPr>
+    </w:lvl>
+    <w:lvl w:ilvl="7" w:tplc="080A0003" w:tentative="1">
+      <w:start w:val="1"/>
+      <w:numFmt w:val="bullet"/>
+      <w:lvlText w:val="o"/>
+      <w:lvlJc w:val="left"/>
+      <w:pPr>
+        <w:ind w:left="5760" w:hanging="360"/>
+      </w:pPr>
+      <w:rPr>
+        <w:rFonts w:ascii="Courier New" w:hAnsi="Courier New" w:cs="Courier New" w:hint="default"/>
+      </w:rPr>
+    </w:lvl>
+    <w:lvl w:ilvl="8" w:tplc="080A0005" w:tentative="1">
+      <w:start w:val="1"/>
+      <w:numFmt w:val="bullet"/>
+      <w:lvlText w:val=""/>
+      <w:lvlJc w:val="left"/>
+      <w:pPr>
+        <w:ind w:left="6480" w:hanging="360"/>
+      </w:pPr>
+      <w:rPr>
+        <w:rFonts w:ascii="Wingdings" w:hAnsi="Wingdings" w:hint="default"/>
+      </w:rPr>
+    </w:lvl>
+  </w:abstractNum>
+  <w:abstractNum w:abstractNumId="1" w15:restartNumberingAfterBreak="0">
+    <w:nsid w:val="4C61728A"/>
+    <w:multiLevelType w:val="hybridMultilevel"/>
+    <w:tmpl w:val="EACE7172"/>
+    <w:lvl w:ilvl="0" w:tplc="080A0001">
+      <w:start w:val="1"/>
+      <w:numFmt w:val="bullet"/>
+      <w:lvlText w:val=""/>
+      <w:lvlJc w:val="left"/>
+      <w:pPr>
+        <w:ind w:left="720" w:hanging="360"/>
+      </w:pPr>
+      <w:rPr>
+        <w:rFonts w:ascii="Symbol" w:hAnsi="Symbol" w:hint="default"/>
+      </w:rPr>
+    </w:lvl>
+    <w:lvl w:ilvl="1" w:tplc="080A0003" w:tentative="1">
+      <w:start w:val="1"/>
+      <w:numFmt w:val="bullet"/>
+      <w:lvlText w:val="o"/>
+      <w:lvlJc w:val="left"/>
+      <w:pPr>
+        <w:ind w:left="1440" w:hanging="360"/>
+      </w:pPr>
+      <w:rPr>
+        <w:rFonts w:ascii="Courier New" w:hAnsi="Courier New" w:cs="Courier New" w:hint="default"/>
+      </w:rPr>
+    </w:lvl>
+    <w:lvl w:ilvl="2" w:tplc="080A0005" w:tentative="1">
+      <w:start w:val="1"/>
+      <w:numFmt w:val="bullet"/>
+      <w:lvlText w:val=""/>
+      <w:lvlJc w:val="left"/>
+      <w:pPr>
+        <w:ind w:left="2160" w:hanging="360"/>
+      </w:pPr>
+      <w:rPr>
+        <w:rFonts w:ascii="Wingdings" w:hAnsi="Wingdings" w:hint="default"/>
+      </w:rPr>
+    </w:lvl>
+    <w:lvl w:ilvl="3" w:tplc="080A0001" w:tentative="1">
+      <w:start w:val="1"/>
+      <w:numFmt w:val="bullet"/>
+      <w:lvlText w:val=""/>
+      <w:lvlJc w:val="left"/>
+      <w:pPr>
+        <w:ind w:left="2880" w:hanging="360"/>
+      </w:pPr>
+      <w:rPr>
+        <w:rFonts w:ascii="Symbol" w:hAnsi="Symbol" w:hint="default"/>
+      </w:rPr>
+    </w:lvl>
+    <w:lvl w:ilvl="4" w:tplc="080A0003" w:tentative="1">
+      <w:start w:val="1"/>
+      <w:numFmt w:val="bullet"/>
+      <w:lvlText w:val="o"/>
+      <w:lvlJc w:val="left"/>
+      <w:pPr>
+        <w:ind w:left="3600" w:hanging="360"/>
+      </w:pPr>
+      <w:rPr>
+        <w:rFonts w:ascii="Courier New" w:hAnsi="Courier New" w:cs="Courier New" w:hint="default"/>
+      </w:rPr>
+    </w:lvl>
+    <w:lvl w:ilvl="5" w:tplc="080A0005" w:tentative="1">
+      <w:start w:val="1"/>
+      <w:numFmt w:val="bullet"/>
+      <w:lvlText w:val=""/>
+      <w:lvlJc w:val="left"/>
+      <w:pPr>
+        <w:ind w:left="4320" w:hanging="360"/>
+      </w:pPr>
+      <w:rPr>
+        <w:rFonts w:ascii="Wingdings" w:hAnsi="Wingdings" w:hint="default"/>
+      </w:rPr>
+    </w:lvl>
+    <w:lvl w:ilvl="6" w:tplc="080A0001" w:tentative="1">
+      <w:start w:val="1"/>
+      <w:numFmt w:val="bullet"/>
+      <w:lvlText w:val=""/>
+      <w:lvlJc w:val="left"/>
+      <w:pPr>
+        <w:ind w:left="5040" w:hanging="360"/>
+      </w:pPr>
+      <w:rPr>
+        <w:rFonts w:ascii="Symbol" w:hAnsi="Symbol" w:hint="default"/>
+      </w:rPr>
+    </w:lvl>
+    <w:lvl w:ilvl="7" w:tplc="080A0003" w:tentative="1">
+      <w:start w:val="1"/>
+      <w:numFmt w:val="bullet"/>
+      <w:lvlText w:val="o"/>
+      <w:lvlJc w:val="left"/>
+      <w:pPr>
+        <w:ind w:left="5760" w:hanging="360"/>
+      </w:pPr>
+      <w:rPr>
+        <w:rFonts w:ascii="Courier New" w:hAnsi="Courier New" w:cs="Courier New" w:hint="default"/>
+      </w:rPr>
+    </w:lvl>
+    <w:lvl w:ilvl="8" w:tplc="080A0005" w:tentative="1">
+      <w:start w:val="1"/>
+      <w:numFmt w:val="bullet"/>
+      <w:lvlText w:val=""/>
+      <w:lvlJc w:val="left"/>
+      <w:pPr>
+        <w:ind w:left="6480" w:hanging="360"/>
+      </w:pPr>
+      <w:rPr>
+        <w:rFonts w:ascii="Wingdings" w:hAnsi="Wingdings" w:hint="default"/>
+      </w:rPr>
+    </w:lvl>
+  </w:abstractNum>
+  <w:abstractNum w:abstractNumId="2" w15:restartNumberingAfterBreak="0">
+    <w:nsid w:val="53C74621"/>
+    <w:multiLevelType w:val="multilevel"/>
+    <w:tmpl w:val="3BEC1E2C"/>
+    <w:lvl w:ilvl="0">
+      <w:start w:val="1"/>
+      <w:numFmt w:val="bullet"/>
+      <w:lvlText w:val=""/>
+      <w:lvlJc w:val="left"/>
+      <w:pPr>
+        <w:tabs>
+          <w:tab w:val="num" w:pos="720"/>
+        </w:tabs>
+        <w:ind w:left="720" w:hanging="360"/>
+      </w:pPr>
+      <w:rPr>
+        <w:rFonts w:ascii="Symbol" w:hAnsi="Symbol" w:hint="default"/>
+        <w:sz w:val="20"/>
+      </w:rPr>
+    </w:lvl>
+    <w:lvl w:ilvl="1" w:tentative="1">
+      <w:start w:val="1"/>
+      <w:numFmt w:val="bullet"/>
+      <w:lvlText w:val="o"/>
+      <w:lvlJc w:val="left"/>
+      <w:pPr>
+        <w:tabs>
+          <w:tab w:val="num" w:pos="1440"/>
+        </w:tabs>
+        <w:ind w:left="1440" w:hanging="360"/>
+      </w:pPr>
+      <w:rPr>
+        <w:rFonts w:ascii="Courier New" w:hAnsi="Courier New" w:hint="default"/>
+        <w:sz w:val="20"/>
+      </w:rPr>
+    </w:lvl>
+    <w:lvl w:ilvl="2" w:tentative="1">
+      <w:start w:val="1"/>
+      <w:numFmt w:val="bullet"/>
+      <w:lvlText w:val=""/>
+      <w:lvlJc w:val="left"/>
+      <w:pPr>
+        <w:tabs>
+          <w:tab w:val="num" w:pos="2160"/>
+        </w:tabs>
+        <w:ind w:left="2160" w:hanging="360"/>
+      </w:pPr>
+      <w:rPr>
+        <w:rFonts w:ascii="Wingdings" w:hAnsi="Wingdings" w:hint="default"/>
+        <w:sz w:val="20"/>
+      </w:rPr>
+    </w:lvl>
+    <w:lvl w:ilvl="3" w:tentative="1">
+      <w:start w:val="1"/>
+      <w:numFmt w:val="bullet"/>
+      <w:lvlText w:val=""/>
+      <w:lvlJc w:val="left"/>
+      <w:pPr>
+        <w:tabs>
+          <w:tab w:val="num" w:pos="2880"/>
+        </w:tabs>
+        <w:ind w:left="2880" w:hanging="360"/>
+      </w:pPr>
+      <w:rPr>
+        <w:rFonts w:ascii="Wingdings" w:hAnsi="Wingdings" w:hint="default"/>
+        <w:sz w:val="20"/>
+      </w:rPr>
+    </w:lvl>
+    <w:lvl w:ilvl="4" w:tentative="1">
+      <w:start w:val="1"/>
+      <w:numFmt w:val="bullet"/>
+      <w:lvlText w:val=""/>
+      <w:lvlJc w:val="left"/>
+      <w:pPr>
+        <w:tabs>
+          <w:tab w:val="num" w:pos="3600"/>
+        </w:tabs>
+        <w:ind w:left="3600" w:hanging="360"/>
+      </w:pPr>
+      <w:rPr>
+        <w:rFonts w:ascii="Wingdings" w:hAnsi="Wingdings" w:hint="default"/>
+        <w:sz w:val="20"/>
+      </w:rPr>
+    </w:lvl>
+    <w:lvl w:ilvl="5" w:tentative="1">
+      <w:start w:val="1"/>
+      <w:numFmt w:val="bullet"/>
+      <w:lvlText w:val=""/>
+      <w:lvlJc w:val="left"/>
+      <w:pPr>
+        <w:tabs>
+          <w:tab w:val="num" w:pos="4320"/>
+        </w:tabs>
+        <w:ind w:left="4320" w:hanging="360"/>
+      </w:pPr>
+      <w:rPr>
+        <w:rFonts w:ascii="Wingdings" w:hAnsi="Wingdings" w:hint="default"/>
+        <w:sz w:val="20"/>
+      </w:rPr>
+    </w:lvl>
+    <w:lvl w:ilvl="6" w:tentative="1">
+      <w:start w:val="1"/>
+      <w:numFmt w:val="bullet"/>
+      <w:lvlText w:val=""/>
+      <w:lvlJc w:val="left"/>
+      <w:pPr>
+        <w:tabs>
+          <w:tab w:val="num" w:pos="5040"/>
+        </w:tabs>
+        <w:ind w:left="5040" w:hanging="360"/>
+      </w:pPr>
+      <w:rPr>
+        <w:rFonts w:ascii="Wingdings" w:hAnsi="Wingdings" w:hint="default"/>
+        <w:sz w:val="20"/>
+      </w:rPr>
+    </w:lvl>
+    <w:lvl w:ilvl="7" w:tentative="1">
+      <w:start w:val="1"/>
+      <w:numFmt w:val="bullet"/>
+      <w:lvlText w:val=""/>
+      <w:lvlJc w:val="left"/>
+      <w:pPr>
+        <w:tabs>
+          <w:tab w:val="num" w:pos="5760"/>
+        </w:tabs>
+        <w:ind w:left="5760" w:hanging="360"/>
+      </w:pPr>
+      <w:rPr>
+        <w:rFonts w:ascii="Wingdings" w:hAnsi="Wingdings" w:hint="default"/>
+        <w:sz w:val="20"/>
+      </w:rPr>
+    </w:lvl>
+    <w:lvl w:ilvl="8" w:tentative="1">
+      <w:start w:val="1"/>
+      <w:numFmt w:val="bullet"/>
+      <w:lvlText w:val=""/>
+      <w:lvlJc w:val="left"/>
+      <w:pPr>
+        <w:tabs>
+          <w:tab w:val="num" w:pos="6480"/>
+        </w:tabs>
+        <w:ind w:left="6480" w:hanging="360"/>
+      </w:pPr>
+      <w:rPr>
+        <w:rFonts w:ascii="Wingdings" w:hAnsi="Wingdings" w:hint="default"/>
+        <w:sz w:val="20"/>
+      </w:rPr>
+    </w:lvl>
+  </w:abstractNum>
+  <w:abstractNum w:abstractNumId="3" w15:restartNumberingAfterBreak="0">
+    <w:nsid w:val="7E775DBD"/>
+    <w:multiLevelType w:val="multilevel"/>
+    <w:tmpl w:val="EE8C3AFE"/>
+    <w:lvl w:ilvl="0">
+      <w:start w:val="1"/>
+      <w:numFmt w:val="bullet"/>
+      <w:lvlText w:val=""/>
+      <w:lvlJc w:val="left"/>
+      <w:pPr>
+        <w:tabs>
+          <w:tab w:val="num" w:pos="720"/>
+        </w:tabs>
+        <w:ind w:left="720" w:hanging="360"/>
+      </w:pPr>
+      <w:rPr>
+        <w:rFonts w:ascii="Symbol" w:hAnsi="Symbol" w:hint="default"/>
+        <w:sz w:val="20"/>
+      </w:rPr>
+    </w:lvl>
+    <w:lvl w:ilvl="1" w:tentative="1">
+      <w:start w:val="1"/>
+      <w:numFmt w:val="bullet"/>
+      <w:lvlText w:val="o"/>
+      <w:lvlJc w:val="left"/>
+      <w:pPr>
+        <w:tabs>
+          <w:tab w:val="num" w:pos="1440"/>
+        </w:tabs>
+        <w:ind w:left="1440" w:hanging="360"/>
+      </w:pPr>
+      <w:rPr>
+        <w:rFonts w:ascii="Courier New" w:hAnsi="Courier New" w:hint="default"/>
+        <w:sz w:val="20"/>
+      </w:rPr>
+    </w:lvl>
+    <w:lvl w:ilvl="2" w:tentative="1">
+      <w:start w:val="1"/>
+      <w:numFmt w:val="bullet"/>
+      <w:lvlText w:val=""/>
+      <w:lvlJc w:val="left"/>
+      <w:pPr>
+        <w:tabs>
+          <w:tab w:val="num" w:pos="2160"/>
+        </w:tabs>
+        <w:ind w:left="2160" w:hanging="360"/>
+      </w:pPr>
+      <w:rPr>
+        <w:rFonts w:ascii="Wingdings" w:hAnsi="Wingdings" w:hint="default"/>
+        <w:sz w:val="20"/>
+      </w:rPr>
+    </w:lvl>
+    <w:lvl w:ilvl="3" w:tentative="1">
+      <w:start w:val="1"/>
+      <w:numFmt w:val="bullet"/>
+      <w:lvlText w:val=""/>
+      <w:lvlJc w:val="left"/>
+      <w:pPr>
+        <w:tabs>
+          <w:tab w:val="num" w:pos="2880"/>
+        </w:tabs>
+        <w:ind w:left="2880" w:hanging="360"/>
+      </w:pPr>
+      <w:rPr>
+        <w:rFonts w:ascii="Wingdings" w:hAnsi="Wingdings" w:hint="default"/>
+        <w:sz w:val="20"/>
+      </w:rPr>
+    </w:lvl>
+    <w:lvl w:ilvl="4" w:tentative="1">
+      <w:start w:val="1"/>
+      <w:numFmt w:val="bullet"/>
+      <w:lvlText w:val=""/>
+      <w:lvlJc w:val="left"/>
+      <w:pPr>
+        <w:tabs>
+          <w:tab w:val="num" w:pos="3600"/>
+        </w:tabs>
+        <w:ind w:left="3600" w:hanging="360"/>
+      </w:pPr>
+      <w:rPr>
+        <w:rFonts w:ascii="Wingdings" w:hAnsi="Wingdings" w:hint="default"/>
+        <w:sz w:val="20"/>
+      </w:rPr>
+    </w:lvl>
+    <w:lvl w:ilvl="5" w:tentative="1">
+      <w:start w:val="1"/>
+      <w:numFmt w:val="bullet"/>
+      <w:lvlText w:val=""/>
+      <w:lvlJc w:val="left"/>
+      <w:pPr>
+        <w:tabs>
+          <w:tab w:val="num" w:pos="4320"/>
+        </w:tabs>
+        <w:ind w:left="4320" w:hanging="360"/>
+      </w:pPr>
+      <w:rPr>
+        <w:rFonts w:ascii="Wingdings" w:hAnsi="Wingdings" w:hint="default"/>
+        <w:sz w:val="20"/>
+      </w:rPr>
+    </w:lvl>
+    <w:lvl w:ilvl="6" w:tentative="1">
+      <w:start w:val="1"/>
+      <w:numFmt w:val="bullet"/>
+      <w:lvlText w:val=""/>
+      <w:lvlJc w:val="left"/>
+      <w:pPr>
+        <w:tabs>
+          <w:tab w:val="num" w:pos="5040"/>
+        </w:tabs>
+        <w:ind w:left="5040" w:hanging="360"/>
+      </w:pPr>
+      <w:rPr>
+        <w:rFonts w:ascii="Wingdings" w:hAnsi="Wingdings" w:hint="default"/>
+        <w:sz w:val="20"/>
+      </w:rPr>
+    </w:lvl>
+    <w:lvl w:ilvl="7" w:tentative="1">
+      <w:start w:val="1"/>
+      <w:numFmt w:val="bullet"/>
+      <w:lvlText w:val=""/>
+      <w:lvlJc w:val="left"/>
+      <w:pPr>
+        <w:tabs>
+          <w:tab w:val="num" w:pos="5760"/>
+        </w:tabs>
+        <w:ind w:left="5760" w:hanging="360"/>
+      </w:pPr>
+      <w:rPr>
+        <w:rFonts w:ascii="Wingdings" w:hAnsi="Wingdings" w:hint="default"/>
+        <w:sz w:val="20"/>
+      </w:rPr>
+    </w:lvl>
+    <w:lvl w:ilvl="8" w:tentative="1">
+      <w:start w:val="1"/>
+      <w:numFmt w:val="bullet"/>
+      <w:lvlText w:val=""/>
+      <w:lvlJc w:val="left"/>
+      <w:pPr>
+        <w:tabs>
+          <w:tab w:val="num" w:pos="6480"/>
+        </w:tabs>
+        <w:ind w:left="6480" w:hanging="360"/>
+      </w:pPr>
+      <w:rPr>
+        <w:rFonts w:ascii="Wingdings" w:hAnsi="Wingdings" w:hint="default"/>
+        <w:sz w:val="20"/>
+      </w:rPr>
+    </w:lvl>
+  </w:abstractNum>
+  <w:num w:numId="1">
+    <w:abstractNumId w:val="3"/>
+  </w:num>
+  <w:num w:numId="2">
+    <w:abstractNumId w:val="2"/>
+  </w:num>
+  <w:num w:numId="3">
+    <w:abstractNumId w:val="1"/>
+  </w:num>
+  <w:num w:numId="4">
+    <w:abstractNumId w:val="0"/>
+  </w:num>
+</w:numbering>
 </file>
 
 <file path=word/styles.xml><?xml version="1.0" encoding="utf-8"?>
@@ -1651,10 +2739,32 @@
       <w14:ligatures w14:val="none"/>
     </w:rPr>
   </w:style>
+  <w:style w:type="paragraph" w:styleId="Ttulo3">
+    <w:name w:val="heading 3"/>
+    <w:basedOn w:val="Normal"/>
+    <w:next w:val="Normal"/>
+    <w:link w:val="Ttulo3Car"/>
+    <w:uiPriority w:val="9"/>
+    <w:semiHidden/>
+    <w:unhideWhenUsed/>
+    <w:qFormat/>
+    <w:rsid w:val="004109D8"/>
+    <w:pPr>
+      <w:keepNext/>
+      <w:keepLines/>
+      <w:spacing w:before="40" w:after="0"/>
+      <w:outlineLvl w:val="2"/>
+    </w:pPr>
+    <w:rPr>
+      <w:rFonts w:asciiTheme="majorHAnsi" w:eastAsiaTheme="majorEastAsia" w:hAnsiTheme="majorHAnsi" w:cstheme="majorBidi"/>
+      <w:color w:val="1F3763" w:themeColor="accent1" w:themeShade="7F"/>
+      <w:sz w:val="24"/>
+      <w:szCs w:val="24"/>
+    </w:rPr>
+  </w:style>
   <w:style w:type="character" w:default="1" w:styleId="Fuentedeprrafopredeter">
     <w:name w:val="Default Paragraph Font"/>
     <w:uiPriority w:val="1"/>
-    <w:semiHidden/>
     <w:unhideWhenUsed/>
   </w:style>
   <w:style w:type="table" w:default="1" w:styleId="Tablanormal">
@@ -1730,6 +2840,31 @@
       <w:lang w:eastAsia="es-MX"/>
       <w14:ligatures w14:val="none"/>
     </w:rPr>
+  </w:style>
+  <w:style w:type="character" w:customStyle="1" w:styleId="Ttulo3Car">
+    <w:name w:val="Título 3 Car"/>
+    <w:basedOn w:val="Fuentedeprrafopredeter"/>
+    <w:link w:val="Ttulo3"/>
+    <w:uiPriority w:val="9"/>
+    <w:semiHidden/>
+    <w:rsid w:val="004109D8"/>
+    <w:rPr>
+      <w:rFonts w:asciiTheme="majorHAnsi" w:eastAsiaTheme="majorEastAsia" w:hAnsiTheme="majorHAnsi" w:cstheme="majorBidi"/>
+      <w:color w:val="1F3763" w:themeColor="accent1" w:themeShade="7F"/>
+      <w:sz w:val="24"/>
+      <w:szCs w:val="24"/>
+    </w:rPr>
+  </w:style>
+  <w:style w:type="paragraph" w:styleId="Prrafodelista">
+    <w:name w:val="List Paragraph"/>
+    <w:basedOn w:val="Normal"/>
+    <w:uiPriority w:val="34"/>
+    <w:qFormat/>
+    <w:rsid w:val="004109D8"/>
+    <w:pPr>
+      <w:ind w:left="720"/>
+      <w:contextualSpacing/>
+    </w:pPr>
   </w:style>
 </w:styles>
 </file>

</xml_diff>

<commit_message>
Adición de requerimientos funcionales y no funcionales
</commit_message>
<xml_diff>
--- a/documentacion/SRS LOCALIA.docx
+++ b/documentacion/SRS LOCALIA.docx
@@ -1,6 +1,6 @@
 
 <file path=word/document.xml><?xml version="1.0" encoding="utf-8"?>
-<w:document xmlns:wpc="http://schemas.microsoft.com/office/word/2010/wordprocessingCanvas" xmlns:cx="http://schemas.microsoft.com/office/drawing/2014/chartex" xmlns:cx1="http://schemas.microsoft.com/office/drawing/2015/9/8/chartex" xmlns:mc="http://schemas.openxmlformats.org/markup-compatibility/2006" xmlns:o="urn:schemas-microsoft-com:office:office" xmlns:r="http://schemas.openxmlformats.org/officeDocument/2006/relationships" xmlns:m="http://schemas.openxmlformats.org/officeDocument/2006/math" xmlns:v="urn:schemas-microsoft-com:vml" xmlns:wp14="http://schemas.microsoft.com/office/word/2010/wordprocessingDrawing" xmlns:wp="http://schemas.openxmlformats.org/drawingml/2006/wordprocessingDrawing" xmlns:w10="urn:schemas-microsoft-com:office:word" xmlns:w="http://schemas.openxmlformats.org/wordprocessingml/2006/main" xmlns:w14="http://schemas.microsoft.com/office/word/2010/wordml" xmlns:w15="http://schemas.microsoft.com/office/word/2012/wordml" xmlns:w16se="http://schemas.microsoft.com/office/word/2015/wordml/symex" xmlns:wpg="http://schemas.microsoft.com/office/word/2010/wordprocessingGroup" xmlns:wpi="http://schemas.microsoft.com/office/word/2010/wordprocessingInk" xmlns:wne="http://schemas.microsoft.com/office/word/2006/wordml" xmlns:wps="http://schemas.microsoft.com/office/word/2010/wordprocessingShape" mc:Ignorable="w14 w15 w16se wp14">
+<w:document xmlns:wpc="http://schemas.microsoft.com/office/word/2010/wordprocessingCanvas" xmlns:cx="http://schemas.microsoft.com/office/drawing/2014/chartex" xmlns:cx1="http://schemas.microsoft.com/office/drawing/2015/9/8/chartex" xmlns:cx2="http://schemas.microsoft.com/office/drawing/2015/10/21/chartex" xmlns:cx3="http://schemas.microsoft.com/office/drawing/2016/5/9/chartex" xmlns:cx4="http://schemas.microsoft.com/office/drawing/2016/5/10/chartex" xmlns:cx5="http://schemas.microsoft.com/office/drawing/2016/5/11/chartex" xmlns:cx6="http://schemas.microsoft.com/office/drawing/2016/5/12/chartex" xmlns:cx7="http://schemas.microsoft.com/office/drawing/2016/5/13/chartex" xmlns:cx8="http://schemas.microsoft.com/office/drawing/2016/5/14/chartex" xmlns:mc="http://schemas.openxmlformats.org/markup-compatibility/2006" xmlns:aink="http://schemas.microsoft.com/office/drawing/2016/ink" xmlns:am3d="http://schemas.microsoft.com/office/drawing/2017/model3d" xmlns:o="urn:schemas-microsoft-com:office:office" xmlns:r="http://schemas.openxmlformats.org/officeDocument/2006/relationships" xmlns:m="http://schemas.openxmlformats.org/officeDocument/2006/math" xmlns:v="urn:schemas-microsoft-com:vml" xmlns:wp14="http://schemas.microsoft.com/office/word/2010/wordprocessingDrawing" xmlns:wp="http://schemas.openxmlformats.org/drawingml/2006/wordprocessingDrawing" xmlns:w10="urn:schemas-microsoft-com:office:word" xmlns:w="http://schemas.openxmlformats.org/wordprocessingml/2006/main" xmlns:w14="http://schemas.microsoft.com/office/word/2010/wordml" xmlns:w15="http://schemas.microsoft.com/office/word/2012/wordml" xmlns:w16cex="http://schemas.microsoft.com/office/word/2018/wordml/cex" xmlns:w16cid="http://schemas.microsoft.com/office/word/2016/wordml/cid" xmlns:w16="http://schemas.microsoft.com/office/word/2018/wordml" xmlns:w16sdtdh="http://schemas.microsoft.com/office/word/2020/wordml/sdtdatahash" xmlns:w16se="http://schemas.microsoft.com/office/word/2015/wordml/symex" xmlns:wpg="http://schemas.microsoft.com/office/word/2010/wordprocessingGroup" xmlns:wpi="http://schemas.microsoft.com/office/word/2010/wordprocessingInk" xmlns:wne="http://schemas.microsoft.com/office/word/2006/wordml" xmlns:wps="http://schemas.microsoft.com/office/word/2010/wordprocessingShape" mc:Ignorable="w14 w15 w16se w16cid w16 w16cex w16sdtdh wp14">
   <w:body>
     <w:p>
       <w:pPr>
@@ -62,7 +62,7 @@
           <w:lang w:eastAsia="es-MX"/>
         </w:rPr>
         <w:drawing>
-          <wp:anchor distT="0" distB="0" distL="114300" distR="114300" simplePos="0" relativeHeight="251660288" behindDoc="0" locked="0" layoutInCell="1" allowOverlap="1" wp14:anchorId="26397CBD" wp14:editId="06732579">
+          <wp:anchor distT="0" distB="0" distL="114300" distR="114300" simplePos="0" relativeHeight="251660288" behindDoc="0" locked="0" layoutInCell="1" allowOverlap="1" wp14:anchorId="56B7F926" wp14:editId="6ADE1360">
             <wp:simplePos x="0" y="0"/>
             <wp:positionH relativeFrom="margin">
               <wp:posOffset>4791710</wp:posOffset>
@@ -128,7 +128,7 @@
           <w:lang w:eastAsia="es-MX"/>
         </w:rPr>
         <w:drawing>
-          <wp:anchor distT="0" distB="0" distL="114300" distR="114300" simplePos="0" relativeHeight="251659264" behindDoc="0" locked="0" layoutInCell="1" allowOverlap="1" wp14:anchorId="0A713906" wp14:editId="34A55925">
+          <wp:anchor distT="0" distB="0" distL="114300" distR="114300" simplePos="0" relativeHeight="251659264" behindDoc="0" locked="0" layoutInCell="1" allowOverlap="1" wp14:anchorId="649A2B48" wp14:editId="097B4818">
             <wp:simplePos x="0" y="0"/>
             <wp:positionH relativeFrom="margin">
               <wp:posOffset>-274320</wp:posOffset>
@@ -593,55 +593,7 @@
           <w:szCs w:val="24"/>
           <w:lang w:val="es-ES"/>
         </w:rPr>
-        <w:t xml:space="preserve">Adriana </w:t>
-      </w:r>
-      <w:proofErr w:type="spellStart"/>
-      <w:r>
-        <w:rPr>
-          <w:rFonts w:ascii="Arial" w:eastAsia="Calibri" w:hAnsi="Arial" w:cs="Arial"/>
-          <w:b/>
-          <w:bCs/>
-          <w:sz w:val="24"/>
-          <w:szCs w:val="24"/>
-          <w:lang w:val="es-ES"/>
-        </w:rPr>
-        <w:t>Alinne</w:t>
-      </w:r>
-      <w:proofErr w:type="spellEnd"/>
-      <w:r>
-        <w:rPr>
-          <w:rFonts w:ascii="Arial" w:eastAsia="Calibri" w:hAnsi="Arial" w:cs="Arial"/>
-          <w:b/>
-          <w:bCs/>
-          <w:sz w:val="24"/>
-          <w:szCs w:val="24"/>
-          <w:lang w:val="es-ES"/>
-        </w:rPr>
-        <w:t xml:space="preserve"> </w:t>
-      </w:r>
-      <w:proofErr w:type="spellStart"/>
-      <w:r>
-        <w:rPr>
-          <w:rFonts w:ascii="Arial" w:eastAsia="Calibri" w:hAnsi="Arial" w:cs="Arial"/>
-          <w:b/>
-          <w:bCs/>
-          <w:sz w:val="24"/>
-          <w:szCs w:val="24"/>
-          <w:lang w:val="es-ES"/>
-        </w:rPr>
-        <w:t>Abby</w:t>
-      </w:r>
-      <w:proofErr w:type="spellEnd"/>
-      <w:r>
-        <w:rPr>
-          <w:rFonts w:ascii="Arial" w:eastAsia="Calibri" w:hAnsi="Arial" w:cs="Arial"/>
-          <w:b/>
-          <w:bCs/>
-          <w:sz w:val="24"/>
-          <w:szCs w:val="24"/>
-          <w:lang w:val="es-ES"/>
-        </w:rPr>
-        <w:t xml:space="preserve"> González Frías</w:t>
+        <w:t>Adriana Alinne Abby González Frías</w:t>
       </w:r>
     </w:p>
     <w:p>
@@ -657,53 +609,16 @@
           <w:lang w:val="es-ES"/>
         </w:rPr>
       </w:pPr>
-      <w:proofErr w:type="spellStart"/>
-      <w:r>
-        <w:rPr>
-          <w:rFonts w:ascii="Arial" w:eastAsia="Calibri" w:hAnsi="Arial" w:cs="Arial"/>
-          <w:b/>
-          <w:bCs/>
-          <w:sz w:val="24"/>
-          <w:szCs w:val="24"/>
-          <w:lang w:val="es-ES"/>
-        </w:rPr>
-        <w:t>Angel</w:t>
-      </w:r>
-      <w:proofErr w:type="spellEnd"/>
-      <w:r>
-        <w:rPr>
-          <w:rFonts w:ascii="Arial" w:eastAsia="Calibri" w:hAnsi="Arial" w:cs="Arial"/>
-          <w:b/>
-          <w:bCs/>
-          <w:sz w:val="24"/>
-          <w:szCs w:val="24"/>
-          <w:lang w:val="es-ES"/>
-        </w:rPr>
-        <w:t xml:space="preserve"> </w:t>
-      </w:r>
-      <w:proofErr w:type="spellStart"/>
-      <w:r>
-        <w:rPr>
-          <w:rFonts w:ascii="Arial" w:eastAsia="Calibri" w:hAnsi="Arial" w:cs="Arial"/>
-          <w:b/>
-          <w:bCs/>
-          <w:sz w:val="24"/>
-          <w:szCs w:val="24"/>
-          <w:lang w:val="es-ES"/>
-        </w:rPr>
-        <w:t>Haniel</w:t>
-      </w:r>
-      <w:proofErr w:type="spellEnd"/>
-      <w:r>
-        <w:rPr>
-          <w:rFonts w:ascii="Arial" w:eastAsia="Calibri" w:hAnsi="Arial" w:cs="Arial"/>
-          <w:b/>
-          <w:bCs/>
-          <w:sz w:val="24"/>
-          <w:szCs w:val="24"/>
-          <w:lang w:val="es-ES"/>
-        </w:rPr>
-        <w:t xml:space="preserve"> Sánchez Guevara </w:t>
+      <w:r>
+        <w:rPr>
+          <w:rFonts w:ascii="Arial" w:eastAsia="Calibri" w:hAnsi="Arial" w:cs="Arial"/>
+          <w:b/>
+          <w:bCs/>
+          <w:sz w:val="24"/>
+          <w:szCs w:val="24"/>
+          <w:lang w:val="es-ES"/>
+        </w:rPr>
+        <w:t xml:space="preserve">Angel Haniel Sánchez Guevara </w:t>
       </w:r>
     </w:p>
     <w:p>
@@ -1032,10 +947,21 @@
           <w:szCs w:val="24"/>
           <w:lang w:eastAsia="es-MX"/>
         </w:rPr>
-        <w:t xml:space="preserve">Asimismo, el documento describe la arquitectura basada en </w:t>
-      </w:r>
-      <w:proofErr w:type="spellStart"/>
-      <w:r>
+        <w:t>Asimismo, el documento describe la arquitectura basada en microservicios adoptada para el proyecto, los componentes que integran la solución y las restricciones identificadas durante el análisis. Su finalidad es proporcionar una referencia técnica que permita mantener una visión común entre el equipo de desarrollo y las partes interesadas, garantizando la correcta interpretación de los requisitos del sistema.</w:t>
+      </w:r>
+    </w:p>
+    <w:p>
+      <w:pPr>
+        <w:pStyle w:val="Ttulo2"/>
+        <w:jc w:val="both"/>
+      </w:pPr>
+      <w:r>
+        <w:t>1.2 Alcance del sistema</w:t>
+      </w:r>
+    </w:p>
+    <w:p>
+      <w:pPr>
+        <w:jc w:val="both"/>
         <w:rPr>
           <w:rFonts w:ascii="Times New Roman" w:hAnsi="Times New Roman" w:cs="Times New Roman"/>
           <w:kern w:val="0"/>
@@ -1043,9 +969,7 @@
           <w:szCs w:val="24"/>
           <w:lang w:eastAsia="es-MX"/>
         </w:rPr>
-        <w:t>microservicios</w:t>
-      </w:r>
-      <w:proofErr w:type="spellEnd"/>
+      </w:pPr>
       <w:r>
         <w:rPr>
           <w:rFonts w:ascii="Times New Roman" w:hAnsi="Times New Roman" w:cs="Times New Roman"/>
@@ -1054,16 +978,7 @@
           <w:szCs w:val="24"/>
           <w:lang w:eastAsia="es-MX"/>
         </w:rPr>
-        <w:t xml:space="preserve"> adoptada para el proyecto, los componentes que integran la solución y las restricciones identificadas durante el análisis. Su finalidad es proporcionar una referencia técnica que permita mantener una visión común entre el equipo de desarrollo y las partes interesadas, garantizando la correcta interpretación de los requisitos del sistema.</w:t>
-      </w:r>
-    </w:p>
-    <w:p>
-      <w:pPr>
-        <w:pStyle w:val="Ttulo2"/>
-        <w:jc w:val="both"/>
-      </w:pPr>
-      <w:r>
-        <w:t>1.2 Alcance del sistema</w:t>
+        <w:t>LOCALIA es una plataforma móvil orientada al fortalecimiento del turismo sostenible y al impulso del comercio local. El sistema tiene como objetivo establecer un vínculo entre los turistas y las pequeñas y medianas empresas (PyMEs) mediante el uso de herramientas tecnológicas que faciliten la identificación de establecimientos cercanos, el acceso a información relevante sobre los negocios y la interacción entre ambas partes.</w:t>
       </w:r>
     </w:p>
     <w:p>
@@ -1085,10 +1000,12 @@
           <w:szCs w:val="24"/>
           <w:lang w:eastAsia="es-MX"/>
         </w:rPr>
-        <w:t>LOCALIA es una plataforma móvil orientada al fortalecimiento del turismo sostenible y al impulso del comercio local. El sistema tiene como objetivo establecer un vínculo entre los turistas y las pequeñas y medianas empresas (</w:t>
-      </w:r>
-      <w:proofErr w:type="spellStart"/>
-      <w:r>
+        <w:t>La plataforma integra mecanismos de geolocalización, pagos digitales mediante códigos QR e integración con Coppel Pay, permitiendo realizar transacciones de manera rápida y segura. De igual manera, incorpora un sistema de recompensas que incentiva el consumo en establecimientos locales mediante la acumulación de puntos.</w:t>
+      </w:r>
+    </w:p>
+    <w:p>
+      <w:pPr>
+        <w:jc w:val="both"/>
         <w:rPr>
           <w:rFonts w:ascii="Times New Roman" w:hAnsi="Times New Roman" w:cs="Times New Roman"/>
           <w:kern w:val="0"/>
@@ -1096,9 +1013,7 @@
           <w:szCs w:val="24"/>
           <w:lang w:eastAsia="es-MX"/>
         </w:rPr>
-        <w:t>PyMEs</w:t>
-      </w:r>
-      <w:proofErr w:type="spellEnd"/>
+      </w:pPr>
       <w:r>
         <w:rPr>
           <w:rFonts w:ascii="Times New Roman" w:hAnsi="Times New Roman" w:cs="Times New Roman"/>
@@ -1107,95 +1022,7 @@
           <w:szCs w:val="24"/>
           <w:lang w:eastAsia="es-MX"/>
         </w:rPr>
-        <w:t>) mediante el uso de herramientas tecnológicas que faciliten la identificación de establecimientos cercanos, el acceso a información relevante sobre los negocios y la interacción entre ambas partes.</w:t>
-      </w:r>
-    </w:p>
-    <w:p>
-      <w:pPr>
-        <w:jc w:val="both"/>
-        <w:rPr>
-          <w:rFonts w:ascii="Times New Roman" w:hAnsi="Times New Roman" w:cs="Times New Roman"/>
-          <w:kern w:val="0"/>
-          <w:sz w:val="24"/>
-          <w:szCs w:val="24"/>
-          <w:lang w:eastAsia="es-MX"/>
-        </w:rPr>
-      </w:pPr>
-      <w:r>
-        <w:rPr>
-          <w:rFonts w:ascii="Times New Roman" w:hAnsi="Times New Roman" w:cs="Times New Roman"/>
-          <w:kern w:val="0"/>
-          <w:sz w:val="24"/>
-          <w:szCs w:val="24"/>
-          <w:lang w:eastAsia="es-MX"/>
-        </w:rPr>
-        <w:t xml:space="preserve">La plataforma integra mecanismos de geolocalización, pagos digitales mediante códigos QR e integración con Coppel </w:t>
-      </w:r>
-      <w:proofErr w:type="spellStart"/>
-      <w:r>
-        <w:rPr>
-          <w:rFonts w:ascii="Times New Roman" w:hAnsi="Times New Roman" w:cs="Times New Roman"/>
-          <w:kern w:val="0"/>
-          <w:sz w:val="24"/>
-          <w:szCs w:val="24"/>
-          <w:lang w:eastAsia="es-MX"/>
-        </w:rPr>
-        <w:t>Pay</w:t>
-      </w:r>
-      <w:proofErr w:type="spellEnd"/>
-      <w:r>
-        <w:rPr>
-          <w:rFonts w:ascii="Times New Roman" w:hAnsi="Times New Roman" w:cs="Times New Roman"/>
-          <w:kern w:val="0"/>
-          <w:sz w:val="24"/>
-          <w:szCs w:val="24"/>
-          <w:lang w:eastAsia="es-MX"/>
-        </w:rPr>
-        <w:t>, permitiendo realizar transacciones de manera rápida y segura. De igual manera, incorpora un sistema de recompensas que incentiva el consumo en establecimientos locales mediante la acumulación de puntos.</w:t>
-      </w:r>
-    </w:p>
-    <w:p>
-      <w:pPr>
-        <w:jc w:val="both"/>
-        <w:rPr>
-          <w:rFonts w:ascii="Times New Roman" w:hAnsi="Times New Roman" w:cs="Times New Roman"/>
-          <w:kern w:val="0"/>
-          <w:sz w:val="24"/>
-          <w:szCs w:val="24"/>
-          <w:lang w:eastAsia="es-MX"/>
-        </w:rPr>
-      </w:pPr>
-      <w:r>
-        <w:rPr>
-          <w:rFonts w:ascii="Times New Roman" w:hAnsi="Times New Roman" w:cs="Times New Roman"/>
-          <w:kern w:val="0"/>
-          <w:sz w:val="24"/>
-          <w:szCs w:val="24"/>
-          <w:lang w:eastAsia="es-MX"/>
-        </w:rPr>
-        <w:t xml:space="preserve">Desde la perspectiva técnica, la solución se implementa bajo una arquitectura de </w:t>
-      </w:r>
-      <w:proofErr w:type="spellStart"/>
-      <w:r>
-        <w:rPr>
-          <w:rFonts w:ascii="Times New Roman" w:hAnsi="Times New Roman" w:cs="Times New Roman"/>
-          <w:kern w:val="0"/>
-          <w:sz w:val="24"/>
-          <w:szCs w:val="24"/>
-          <w:lang w:eastAsia="es-MX"/>
-        </w:rPr>
-        <w:t>microservicios</w:t>
-      </w:r>
-      <w:proofErr w:type="spellEnd"/>
-      <w:r>
-        <w:rPr>
-          <w:rFonts w:ascii="Times New Roman" w:hAnsi="Times New Roman" w:cs="Times New Roman"/>
-          <w:kern w:val="0"/>
-          <w:sz w:val="24"/>
-          <w:szCs w:val="24"/>
-          <w:lang w:eastAsia="es-MX"/>
-        </w:rPr>
-        <w:t>, en la que cada componente opera de forma independiente y se especializa en una función específica, como la gestión de usuarios, la administración de negocios, el procesamiento de pagos, el sistema de recompensas, el envío de notificaciones y la asistencia inteligente. Esta estructura permite mejorar la escalabilidad, el mantenimiento y la disponibilidad del sistema, además de facilitar la incorporación de nuevas funcionalidades sin afectar el funcionamiento general de la plataforma.</w:t>
+        <w:t>Desde la perspectiva técnica, la solución se implementa bajo una arquitectura de microservicios, en la que cada componente opera de forma independiente y se especializa en una función específica, como la gestión de usuarios, la administración de negocios, el procesamiento de pagos, el sistema de recompensas, el envío de notificaciones y la asistencia inteligente. Esta estructura permite mejorar la escalabilidad, el mantenimiento y la disponibilidad del sistema, además de facilitar la incorporación de nuevas funcionalidades sin afectar el funcionamiento general de la plataforma.</w:t>
       </w:r>
     </w:p>
     <w:p>
@@ -1248,7 +1075,6 @@
           <w:lang w:eastAsia="es-MX"/>
         </w:rPr>
       </w:pPr>
-      <w:proofErr w:type="spellStart"/>
       <w:r>
         <w:rPr>
           <w:rFonts w:ascii="Times New Roman" w:hAnsi="Times New Roman" w:cs="Times New Roman"/>
@@ -1257,18 +1083,7 @@
           <w:szCs w:val="24"/>
           <w:lang w:eastAsia="es-MX"/>
         </w:rPr>
-        <w:t>PyME</w:t>
-      </w:r>
-      <w:proofErr w:type="spellEnd"/>
-      <w:r>
-        <w:rPr>
-          <w:rFonts w:ascii="Times New Roman" w:hAnsi="Times New Roman" w:cs="Times New Roman"/>
-          <w:kern w:val="0"/>
-          <w:sz w:val="24"/>
-          <w:szCs w:val="24"/>
-          <w:lang w:eastAsia="es-MX"/>
-        </w:rPr>
-        <w:t xml:space="preserve">: pequeña y mediana empresa. </w:t>
+        <w:t xml:space="preserve">PyME: pequeña y mediana empresa. </w:t>
       </w:r>
     </w:p>
     <w:p>
@@ -1298,29 +1113,7 @@
           <w:szCs w:val="24"/>
           <w:lang w:eastAsia="es-MX"/>
         </w:rPr>
-        <w:t xml:space="preserve">JWT (JSON Web </w:t>
-      </w:r>
-      <w:proofErr w:type="spellStart"/>
-      <w:r>
-        <w:rPr>
-          <w:rFonts w:ascii="Times New Roman" w:hAnsi="Times New Roman" w:cs="Times New Roman"/>
-          <w:kern w:val="0"/>
-          <w:sz w:val="24"/>
-          <w:szCs w:val="24"/>
-          <w:lang w:eastAsia="es-MX"/>
-        </w:rPr>
-        <w:t>Token</w:t>
-      </w:r>
-      <w:proofErr w:type="spellEnd"/>
-      <w:r>
-        <w:rPr>
-          <w:rFonts w:ascii="Times New Roman" w:hAnsi="Times New Roman" w:cs="Times New Roman"/>
-          <w:kern w:val="0"/>
-          <w:sz w:val="24"/>
-          <w:szCs w:val="24"/>
-          <w:lang w:eastAsia="es-MX"/>
-        </w:rPr>
-        <w:t xml:space="preserve">): mecanismo utilizado para la autenticación y autorización de usuarios. </w:t>
+        <w:t xml:space="preserve">JWT (JSON Web Token): mecanismo utilizado para la autenticación y autorización de usuarios. </w:t>
       </w:r>
     </w:p>
     <w:p>
@@ -1350,41 +1143,7 @@
           <w:szCs w:val="24"/>
           <w:lang w:eastAsia="es-MX"/>
         </w:rPr>
-        <w:t xml:space="preserve">QR (Quick Response </w:t>
-      </w:r>
-      <w:proofErr w:type="spellStart"/>
-      <w:r>
-        <w:rPr>
-          <w:rFonts w:ascii="Times New Roman" w:hAnsi="Times New Roman" w:cs="Times New Roman"/>
-          <w:kern w:val="0"/>
-          <w:sz w:val="24"/>
-          <w:szCs w:val="24"/>
-          <w:lang w:eastAsia="es-MX"/>
-        </w:rPr>
-        <w:t>Cod</w:t>
-      </w:r>
-      <w:bookmarkStart w:id="0" w:name="_GoBack"/>
-      <w:bookmarkEnd w:id="0"/>
-      <w:r>
-        <w:rPr>
-          <w:rFonts w:ascii="Times New Roman" w:hAnsi="Times New Roman" w:cs="Times New Roman"/>
-          <w:kern w:val="0"/>
-          <w:sz w:val="24"/>
-          <w:szCs w:val="24"/>
-          <w:lang w:eastAsia="es-MX"/>
-        </w:rPr>
-        <w:t>e</w:t>
-      </w:r>
-      <w:proofErr w:type="spellEnd"/>
-      <w:r>
-        <w:rPr>
-          <w:rFonts w:ascii="Times New Roman" w:hAnsi="Times New Roman" w:cs="Times New Roman"/>
-          <w:kern w:val="0"/>
-          <w:sz w:val="24"/>
-          <w:szCs w:val="24"/>
-          <w:lang w:eastAsia="es-MX"/>
-        </w:rPr>
-        <w:t xml:space="preserve">): código que permite realizar pagos de forma rápida. </w:t>
+        <w:t xml:space="preserve">QR (Quick Response Code): código que permite realizar pagos de forma rápida. </w:t>
       </w:r>
     </w:p>
     <w:p>
@@ -1406,7 +1165,6 @@
           <w:lang w:eastAsia="es-MX"/>
         </w:rPr>
       </w:pPr>
-      <w:proofErr w:type="spellStart"/>
       <w:r>
         <w:rPr>
           <w:rFonts w:ascii="Times New Roman" w:hAnsi="Times New Roman" w:cs="Times New Roman"/>
@@ -1416,40 +1174,7 @@
           <w:lang w:eastAsia="es-MX"/>
         </w:rPr>
         <w:lastRenderedPageBreak/>
-        <w:t>RabbitMQ</w:t>
-      </w:r>
-      <w:proofErr w:type="spellEnd"/>
-      <w:r>
-        <w:rPr>
-          <w:rFonts w:ascii="Times New Roman" w:hAnsi="Times New Roman" w:cs="Times New Roman"/>
-          <w:kern w:val="0"/>
-          <w:sz w:val="24"/>
-          <w:szCs w:val="24"/>
-          <w:lang w:eastAsia="es-MX"/>
-        </w:rPr>
-        <w:t xml:space="preserve">: herramienta utilizada para la comunicación entre los </w:t>
-      </w:r>
-      <w:proofErr w:type="spellStart"/>
-      <w:r>
-        <w:rPr>
-          <w:rFonts w:ascii="Times New Roman" w:hAnsi="Times New Roman" w:cs="Times New Roman"/>
-          <w:kern w:val="0"/>
-          <w:sz w:val="24"/>
-          <w:szCs w:val="24"/>
-          <w:lang w:eastAsia="es-MX"/>
-        </w:rPr>
-        <w:t>microservicios</w:t>
-      </w:r>
-      <w:proofErr w:type="spellEnd"/>
-      <w:r>
-        <w:rPr>
-          <w:rFonts w:ascii="Times New Roman" w:hAnsi="Times New Roman" w:cs="Times New Roman"/>
-          <w:kern w:val="0"/>
-          <w:sz w:val="24"/>
-          <w:szCs w:val="24"/>
-          <w:lang w:eastAsia="es-MX"/>
-        </w:rPr>
-        <w:t xml:space="preserve">. </w:t>
+        <w:t xml:space="preserve">RabbitMQ: herramienta utilizada para la comunicación entre los microservicios. </w:t>
       </w:r>
     </w:p>
     <w:p>
@@ -1479,51 +1204,7 @@
           <w:szCs w:val="24"/>
           <w:lang w:eastAsia="es-MX"/>
         </w:rPr>
-        <w:t xml:space="preserve">SRS (Software </w:t>
-      </w:r>
-      <w:proofErr w:type="spellStart"/>
-      <w:r>
-        <w:rPr>
-          <w:rFonts w:ascii="Times New Roman" w:hAnsi="Times New Roman" w:cs="Times New Roman"/>
-          <w:kern w:val="0"/>
-          <w:sz w:val="24"/>
-          <w:szCs w:val="24"/>
-          <w:lang w:eastAsia="es-MX"/>
-        </w:rPr>
-        <w:t>Requirements</w:t>
-      </w:r>
-      <w:proofErr w:type="spellEnd"/>
-      <w:r>
-        <w:rPr>
-          <w:rFonts w:ascii="Times New Roman" w:hAnsi="Times New Roman" w:cs="Times New Roman"/>
-          <w:kern w:val="0"/>
-          <w:sz w:val="24"/>
-          <w:szCs w:val="24"/>
-          <w:lang w:eastAsia="es-MX"/>
-        </w:rPr>
-        <w:t xml:space="preserve"> </w:t>
-      </w:r>
-      <w:proofErr w:type="spellStart"/>
-      <w:r>
-        <w:rPr>
-          <w:rFonts w:ascii="Times New Roman" w:hAnsi="Times New Roman" w:cs="Times New Roman"/>
-          <w:kern w:val="0"/>
-          <w:sz w:val="24"/>
-          <w:szCs w:val="24"/>
-          <w:lang w:eastAsia="es-MX"/>
-        </w:rPr>
-        <w:t>Specification</w:t>
-      </w:r>
-      <w:proofErr w:type="spellEnd"/>
-      <w:r>
-        <w:rPr>
-          <w:rFonts w:ascii="Times New Roman" w:hAnsi="Times New Roman" w:cs="Times New Roman"/>
-          <w:kern w:val="0"/>
-          <w:sz w:val="24"/>
-          <w:szCs w:val="24"/>
-          <w:lang w:eastAsia="es-MX"/>
-        </w:rPr>
-        <w:t xml:space="preserve">): documento en el que se establecen los requisitos del sistema. </w:t>
+        <w:t xml:space="preserve">SRS (Software Requirements Specification): documento en el que se establecen los requisitos del sistema. </w:t>
       </w:r>
     </w:p>
     <w:p>
@@ -1620,29 +1301,7 @@
           <w:szCs w:val="24"/>
           <w:lang w:eastAsia="es-MX"/>
         </w:rPr>
-        <w:t xml:space="preserve">La falta de una plataforma centralizada que permita a las </w:t>
-      </w:r>
-      <w:proofErr w:type="spellStart"/>
-      <w:r>
-        <w:rPr>
-          <w:rFonts w:ascii="Times New Roman" w:hAnsi="Times New Roman" w:cs="Times New Roman"/>
-          <w:kern w:val="0"/>
-          <w:sz w:val="24"/>
-          <w:szCs w:val="24"/>
-          <w:lang w:eastAsia="es-MX"/>
-        </w:rPr>
-        <w:t>PyMEs</w:t>
-      </w:r>
-      <w:proofErr w:type="spellEnd"/>
-      <w:r>
-        <w:rPr>
-          <w:rFonts w:ascii="Times New Roman" w:hAnsi="Times New Roman" w:cs="Times New Roman"/>
-          <w:kern w:val="0"/>
-          <w:sz w:val="24"/>
-          <w:szCs w:val="24"/>
-          <w:lang w:eastAsia="es-MX"/>
-        </w:rPr>
-        <w:t xml:space="preserve"> aumentar su visibilidad. </w:t>
+        <w:t xml:space="preserve">La falta de una plataforma centralizada que permita a las PyMEs aumentar su visibilidad. </w:t>
       </w:r>
     </w:p>
     <w:p>
@@ -1734,6 +1393,1023 @@
         </w:rPr>
         <w:t>La necesidad de integrar en un mismo sistema la localización de los establecimientos, los pagos y los programas de recompensas.</w:t>
       </w:r>
+    </w:p>
+    <w:p>
+      <w:pPr>
+        <w:pStyle w:val="Ttulo1"/>
+      </w:pPr>
+      <w:r>
+        <w:t>3. Requerimientos funcionales</w:t>
+      </w:r>
+    </w:p>
+    <w:p>
+      <w:pPr>
+        <w:pStyle w:val="NormalWeb"/>
+        <w:numPr>
+          <w:ilvl w:val="0"/>
+          <w:numId w:val="5"/>
+        </w:numPr>
+      </w:pPr>
+      <w:r>
+        <w:rPr>
+          <w:b/>
+          <w:bCs/>
+        </w:rPr>
+        <w:t>RF-01: Gestión de Usuarios y Autenticación</w:t>
+      </w:r>
+    </w:p>
+    <w:p>
+      <w:pPr>
+        <w:pStyle w:val="NormalWeb"/>
+        <w:numPr>
+          <w:ilvl w:val="1"/>
+          <w:numId w:val="5"/>
+        </w:numPr>
+      </w:pPr>
+      <w:r>
+        <w:t xml:space="preserve">Permitir el registro, inicio de sesión y gestión de sesiones mediante tokens JWT. </w:t>
+      </w:r>
+    </w:p>
+    <w:p>
+      <w:pPr>
+        <w:pStyle w:val="NormalWeb"/>
+        <w:numPr>
+          <w:ilvl w:val="1"/>
+          <w:numId w:val="5"/>
+        </w:numPr>
+      </w:pPr>
+      <w:r>
+        <w:t xml:space="preserve">Administrar tres tipos de roles diferenciados: Turista, Dueño de negocio y Administrador. </w:t>
+      </w:r>
+    </w:p>
+    <w:p>
+      <w:pPr>
+        <w:pStyle w:val="NormalWeb"/>
+        <w:numPr>
+          <w:ilvl w:val="0"/>
+          <w:numId w:val="5"/>
+        </w:numPr>
+      </w:pPr>
+      <w:r>
+        <w:rPr>
+          <w:b/>
+          <w:bCs/>
+        </w:rPr>
+        <w:t>RF-02: Directorio de Negocios y Geolocalización</w:t>
+      </w:r>
+    </w:p>
+    <w:p>
+      <w:pPr>
+        <w:pStyle w:val="NormalWeb"/>
+        <w:numPr>
+          <w:ilvl w:val="1"/>
+          <w:numId w:val="5"/>
+        </w:numPr>
+      </w:pPr>
+      <w:r>
+        <w:t xml:space="preserve">Almacenar y consultar la información de PyMEs mediante coordenadas geográficas nativas. </w:t>
+      </w:r>
+    </w:p>
+    <w:p>
+      <w:pPr>
+        <w:pStyle w:val="NormalWeb"/>
+        <w:numPr>
+          <w:ilvl w:val="1"/>
+          <w:numId w:val="5"/>
+        </w:numPr>
+      </w:pPr>
+      <w:r>
+        <w:t xml:space="preserve">Mostrar al turista un mapa interactivo de exploración con los negocios más cercanos a su ubicación. </w:t>
+      </w:r>
+    </w:p>
+    <w:p>
+      <w:pPr>
+        <w:pStyle w:val="NormalWeb"/>
+        <w:numPr>
+          <w:ilvl w:val="0"/>
+          <w:numId w:val="5"/>
+        </w:numPr>
+      </w:pPr>
+      <w:r>
+        <w:rPr>
+          <w:b/>
+          <w:bCs/>
+        </w:rPr>
+        <w:t>RF-03: Procesamiento de Pagos Digitales</w:t>
+      </w:r>
+    </w:p>
+    <w:p>
+      <w:pPr>
+        <w:pStyle w:val="NormalWeb"/>
+        <w:numPr>
+          <w:ilvl w:val="1"/>
+          <w:numId w:val="5"/>
+        </w:numPr>
+      </w:pPr>
+      <w:r>
+        <w:t xml:space="preserve">Ejecutar pagos digitales mediante lectura de códigos QR. </w:t>
+      </w:r>
+    </w:p>
+    <w:p>
+      <w:pPr>
+        <w:pStyle w:val="NormalWeb"/>
+        <w:numPr>
+          <w:ilvl w:val="1"/>
+          <w:numId w:val="5"/>
+        </w:numPr>
+      </w:pPr>
+      <w:r>
+        <w:t xml:space="preserve">Permitir transacciones financieras integradas con Coppel Pay. </w:t>
+      </w:r>
+    </w:p>
+    <w:p>
+      <w:pPr>
+        <w:pStyle w:val="NormalWeb"/>
+        <w:numPr>
+          <w:ilvl w:val="0"/>
+          <w:numId w:val="5"/>
+        </w:numPr>
+      </w:pPr>
+      <w:r>
+        <w:rPr>
+          <w:b/>
+          <w:bCs/>
+        </w:rPr>
+        <w:t>RF-04: Programa de Recompensas y Lealtad</w:t>
+      </w:r>
+    </w:p>
+    <w:p>
+      <w:pPr>
+        <w:pStyle w:val="NormalWeb"/>
+        <w:numPr>
+          <w:ilvl w:val="1"/>
+          <w:numId w:val="5"/>
+        </w:numPr>
+      </w:pPr>
+      <w:r>
+        <w:t xml:space="preserve">Asignar y acumular puntos de recompensa en función de un porcentaje del monto pagado. </w:t>
+      </w:r>
+    </w:p>
+    <w:p>
+      <w:pPr>
+        <w:pStyle w:val="NormalWeb"/>
+        <w:numPr>
+          <w:ilvl w:val="1"/>
+          <w:numId w:val="5"/>
+        </w:numPr>
+      </w:pPr>
+      <w:r>
+        <w:t xml:space="preserve">Actualizar el saldo de puntos de forma automática sin interrumpir el flujo de cobro. </w:t>
+      </w:r>
+    </w:p>
+    <w:p>
+      <w:pPr>
+        <w:pStyle w:val="NormalWeb"/>
+        <w:numPr>
+          <w:ilvl w:val="0"/>
+          <w:numId w:val="5"/>
+        </w:numPr>
+      </w:pPr>
+      <w:r>
+        <w:rPr>
+          <w:b/>
+          <w:bCs/>
+        </w:rPr>
+        <w:t>RF-05: Sistema de Notificaciones</w:t>
+      </w:r>
+    </w:p>
+    <w:p>
+      <w:pPr>
+        <w:pStyle w:val="NormalWeb"/>
+        <w:numPr>
+          <w:ilvl w:val="1"/>
+          <w:numId w:val="5"/>
+        </w:numPr>
+      </w:pPr>
+      <w:r>
+        <w:t xml:space="preserve">Enviar ofertas promocionales a los turistas según su ubicación geográfica y búsquedas. </w:t>
+      </w:r>
+    </w:p>
+    <w:p>
+      <w:pPr>
+        <w:pStyle w:val="NormalWeb"/>
+        <w:numPr>
+          <w:ilvl w:val="1"/>
+          <w:numId w:val="5"/>
+        </w:numPr>
+      </w:pPr>
+      <w:r>
+        <w:t xml:space="preserve">Notificar a las PyMEs sobre compras completadas y mensajes entrantes. </w:t>
+      </w:r>
+    </w:p>
+    <w:p>
+      <w:pPr>
+        <w:pStyle w:val="NormalWeb"/>
+        <w:numPr>
+          <w:ilvl w:val="0"/>
+          <w:numId w:val="5"/>
+        </w:numPr>
+      </w:pPr>
+      <w:r>
+        <w:rPr>
+          <w:b/>
+          <w:bCs/>
+        </w:rPr>
+        <w:t>RF-06: Asistente Virtual Inteligente (Chatbot LIA)</w:t>
+      </w:r>
+    </w:p>
+    <w:p>
+      <w:pPr>
+        <w:pStyle w:val="NormalWeb"/>
+        <w:numPr>
+          <w:ilvl w:val="1"/>
+          <w:numId w:val="5"/>
+        </w:numPr>
+      </w:pPr>
+      <w:r>
+        <w:lastRenderedPageBreak/>
+        <w:t xml:space="preserve">Recomendar comercios y explicar platillos locales indicando ingredientes o alérgenos. </w:t>
+      </w:r>
+    </w:p>
+    <w:p>
+      <w:pPr>
+        <w:pStyle w:val="NormalWeb"/>
+        <w:numPr>
+          <w:ilvl w:val="1"/>
+          <w:numId w:val="5"/>
+        </w:numPr>
+      </w:pPr>
+      <w:r>
+        <w:t xml:space="preserve">Orientar al usuario sobre cómo ganar o usar puntos dentro del ecosistema local. </w:t>
+      </w:r>
+    </w:p>
+    <w:p>
+      <w:pPr>
+        <w:pStyle w:val="NormalWeb"/>
+        <w:numPr>
+          <w:ilvl w:val="0"/>
+          <w:numId w:val="5"/>
+        </w:numPr>
+      </w:pPr>
+      <w:r>
+        <w:rPr>
+          <w:b/>
+          <w:bCs/>
+        </w:rPr>
+        <w:t>RF-07: Comunicación Directa</w:t>
+      </w:r>
+    </w:p>
+    <w:p>
+      <w:pPr>
+        <w:pStyle w:val="NormalWeb"/>
+        <w:numPr>
+          <w:ilvl w:val="1"/>
+          <w:numId w:val="5"/>
+        </w:numPr>
+      </w:pPr>
+      <w:r>
+        <w:t xml:space="preserve">Soportar un chat privado para el intercambio de mensajes entre el turista y la PyME. </w:t>
+      </w:r>
+    </w:p>
+    <w:p>
+      <w:pPr>
+        <w:pStyle w:val="NormalWeb"/>
+        <w:ind w:left="1440"/>
+      </w:pPr>
+    </w:p>
+    <w:p>
+      <w:pPr>
+        <w:pStyle w:val="Ttulo1"/>
+      </w:pPr>
+      <w:r>
+        <w:t>4. Requerimientos no funcionales</w:t>
+      </w:r>
+    </w:p>
+    <w:tbl>
+      <w:tblPr>
+        <w:tblStyle w:val="Tablaconcuadrcula4-nfasis5"/>
+        <w:tblW w:w="0" w:type="auto"/>
+        <w:tblLook w:val="04A0" w:firstRow="1" w:lastRow="0" w:firstColumn="1" w:lastColumn="0" w:noHBand="0" w:noVBand="1"/>
+      </w:tblPr>
+      <w:tblGrid>
+        <w:gridCol w:w="1830"/>
+        <w:gridCol w:w="2420"/>
+        <w:gridCol w:w="5100"/>
+      </w:tblGrid>
+      <w:tr>
+        <w:trPr>
+          <w:cnfStyle w:val="100000000000" w:firstRow="1" w:lastRow="0" w:firstColumn="0" w:lastColumn="0" w:oddVBand="0" w:evenVBand="0" w:oddHBand="0" w:evenHBand="0" w:firstRowFirstColumn="0" w:firstRowLastColumn="0" w:lastRowFirstColumn="0" w:lastRowLastColumn="0"/>
+        </w:trPr>
+        <w:tc>
+          <w:tcPr>
+            <w:cnfStyle w:val="001000000000" w:firstRow="0" w:lastRow="0" w:firstColumn="1" w:lastColumn="0" w:oddVBand="0" w:evenVBand="0" w:oddHBand="0" w:evenHBand="0" w:firstRowFirstColumn="0" w:firstRowLastColumn="0" w:lastRowFirstColumn="0" w:lastRowLastColumn="0"/>
+            <w:tcW w:w="0" w:type="auto"/>
+            <w:hideMark/>
+          </w:tcPr>
+          <w:p>
+            <w:pPr>
+              <w:spacing w:after="480"/>
+              <w:rPr>
+                <w:rFonts w:ascii="Times New Roman" w:eastAsia="Times New Roman" w:hAnsi="Times New Roman" w:cs="Times New Roman"/>
+                <w:kern w:val="0"/>
+                <w:sz w:val="24"/>
+                <w:szCs w:val="24"/>
+                <w:lang w:eastAsia="es-MX"/>
+                <w14:ligatures w14:val="none"/>
+              </w:rPr>
+            </w:pPr>
+            <w:r>
+              <w:rPr>
+                <w:rFonts w:ascii="Times New Roman" w:eastAsia="Times New Roman" w:hAnsi="Times New Roman" w:cs="Times New Roman"/>
+                <w:kern w:val="0"/>
+                <w:sz w:val="24"/>
+                <w:szCs w:val="24"/>
+                <w:lang w:eastAsia="es-MX"/>
+                <w14:ligatures w14:val="none"/>
+              </w:rPr>
+              <w:t>Categoría</w:t>
+            </w:r>
+          </w:p>
+        </w:tc>
+        <w:tc>
+          <w:tcPr>
+            <w:tcW w:w="0" w:type="auto"/>
+            <w:hideMark/>
+          </w:tcPr>
+          <w:p>
+            <w:pPr>
+              <w:spacing w:after="480"/>
+              <w:cnfStyle w:val="100000000000" w:firstRow="1" w:lastRow="0" w:firstColumn="0" w:lastColumn="0" w:oddVBand="0" w:evenVBand="0" w:oddHBand="0" w:evenHBand="0" w:firstRowFirstColumn="0" w:firstRowLastColumn="0" w:lastRowFirstColumn="0" w:lastRowLastColumn="0"/>
+              <w:rPr>
+                <w:rFonts w:ascii="Times New Roman" w:eastAsia="Times New Roman" w:hAnsi="Times New Roman" w:cs="Times New Roman"/>
+                <w:kern w:val="0"/>
+                <w:sz w:val="24"/>
+                <w:szCs w:val="24"/>
+                <w:lang w:eastAsia="es-MX"/>
+                <w14:ligatures w14:val="none"/>
+              </w:rPr>
+            </w:pPr>
+            <w:r>
+              <w:rPr>
+                <w:rFonts w:ascii="Times New Roman" w:eastAsia="Times New Roman" w:hAnsi="Times New Roman" w:cs="Times New Roman"/>
+                <w:kern w:val="0"/>
+                <w:sz w:val="24"/>
+                <w:szCs w:val="24"/>
+                <w:lang w:eastAsia="es-MX"/>
+                <w14:ligatures w14:val="none"/>
+              </w:rPr>
+              <w:t>Requerimiento No Funcional</w:t>
+            </w:r>
+          </w:p>
+        </w:tc>
+        <w:tc>
+          <w:tcPr>
+            <w:tcW w:w="0" w:type="auto"/>
+            <w:hideMark/>
+          </w:tcPr>
+          <w:p>
+            <w:pPr>
+              <w:spacing w:after="480"/>
+              <w:cnfStyle w:val="100000000000" w:firstRow="1" w:lastRow="0" w:firstColumn="0" w:lastColumn="0" w:oddVBand="0" w:evenVBand="0" w:oddHBand="0" w:evenHBand="0" w:firstRowFirstColumn="0" w:firstRowLastColumn="0" w:lastRowFirstColumn="0" w:lastRowLastColumn="0"/>
+              <w:rPr>
+                <w:rFonts w:ascii="Times New Roman" w:eastAsia="Times New Roman" w:hAnsi="Times New Roman" w:cs="Times New Roman"/>
+                <w:kern w:val="0"/>
+                <w:sz w:val="24"/>
+                <w:szCs w:val="24"/>
+                <w:lang w:eastAsia="es-MX"/>
+                <w14:ligatures w14:val="none"/>
+              </w:rPr>
+            </w:pPr>
+            <w:r>
+              <w:rPr>
+                <w:rFonts w:ascii="Times New Roman" w:eastAsia="Times New Roman" w:hAnsi="Times New Roman" w:cs="Times New Roman"/>
+                <w:kern w:val="0"/>
+                <w:sz w:val="24"/>
+                <w:szCs w:val="24"/>
+                <w:lang w:eastAsia="es-MX"/>
+                <w14:ligatures w14:val="none"/>
+              </w:rPr>
+              <w:t>Descripción / Especificación</w:t>
+            </w:r>
+          </w:p>
+        </w:tc>
+      </w:tr>
+      <w:tr>
+        <w:trPr>
+          <w:cnfStyle w:val="000000100000" w:firstRow="0" w:lastRow="0" w:firstColumn="0" w:lastColumn="0" w:oddVBand="0" w:evenVBand="0" w:oddHBand="1" w:evenHBand="0" w:firstRowFirstColumn="0" w:firstRowLastColumn="0" w:lastRowFirstColumn="0" w:lastRowLastColumn="0"/>
+        </w:trPr>
+        <w:tc>
+          <w:tcPr>
+            <w:cnfStyle w:val="001000000000" w:firstRow="0" w:lastRow="0" w:firstColumn="1" w:lastColumn="0" w:oddVBand="0" w:evenVBand="0" w:oddHBand="0" w:evenHBand="0" w:firstRowFirstColumn="0" w:firstRowLastColumn="0" w:lastRowFirstColumn="0" w:lastRowLastColumn="0"/>
+            <w:tcW w:w="0" w:type="auto"/>
+            <w:hideMark/>
+          </w:tcPr>
+          <w:p>
+            <w:pPr>
+              <w:spacing w:after="480"/>
+              <w:rPr>
+                <w:rFonts w:ascii="Times New Roman" w:eastAsia="Times New Roman" w:hAnsi="Times New Roman" w:cs="Times New Roman"/>
+                <w:kern w:val="0"/>
+                <w:sz w:val="24"/>
+                <w:szCs w:val="24"/>
+                <w:lang w:eastAsia="es-MX"/>
+                <w14:ligatures w14:val="none"/>
+              </w:rPr>
+            </w:pPr>
+            <w:r>
+              <w:rPr>
+                <w:rFonts w:ascii="Times New Roman" w:eastAsia="Times New Roman" w:hAnsi="Times New Roman" w:cs="Times New Roman"/>
+                <w:kern w:val="0"/>
+                <w:sz w:val="24"/>
+                <w:szCs w:val="24"/>
+                <w:lang w:eastAsia="es-MX"/>
+                <w14:ligatures w14:val="none"/>
+              </w:rPr>
+              <w:t>Arquitectura</w:t>
+            </w:r>
+          </w:p>
+        </w:tc>
+        <w:tc>
+          <w:tcPr>
+            <w:tcW w:w="0" w:type="auto"/>
+            <w:hideMark/>
+          </w:tcPr>
+          <w:p>
+            <w:pPr>
+              <w:spacing w:after="480"/>
+              <w:cnfStyle w:val="000000100000" w:firstRow="0" w:lastRow="0" w:firstColumn="0" w:lastColumn="0" w:oddVBand="0" w:evenVBand="0" w:oddHBand="1" w:evenHBand="0" w:firstRowFirstColumn="0" w:firstRowLastColumn="0" w:lastRowFirstColumn="0" w:lastRowLastColumn="0"/>
+              <w:rPr>
+                <w:rFonts w:ascii="Times New Roman" w:eastAsia="Times New Roman" w:hAnsi="Times New Roman" w:cs="Times New Roman"/>
+                <w:kern w:val="0"/>
+                <w:sz w:val="24"/>
+                <w:szCs w:val="24"/>
+                <w:lang w:eastAsia="es-MX"/>
+                <w14:ligatures w14:val="none"/>
+              </w:rPr>
+            </w:pPr>
+            <w:r>
+              <w:rPr>
+                <w:rFonts w:ascii="Times New Roman" w:eastAsia="Times New Roman" w:hAnsi="Times New Roman" w:cs="Times New Roman"/>
+                <w:b/>
+                <w:bCs/>
+                <w:kern w:val="0"/>
+                <w:sz w:val="24"/>
+                <w:szCs w:val="24"/>
+                <w:lang w:eastAsia="es-MX"/>
+                <w14:ligatures w14:val="none"/>
+              </w:rPr>
+              <w:t>RNF-01: Microservicios</w:t>
+            </w:r>
+          </w:p>
+        </w:tc>
+        <w:tc>
+          <w:tcPr>
+            <w:tcW w:w="0" w:type="auto"/>
+            <w:hideMark/>
+          </w:tcPr>
+          <w:p>
+            <w:pPr>
+              <w:spacing w:before="100" w:beforeAutospacing="1" w:after="100" w:afterAutospacing="1"/>
+              <w:cnfStyle w:val="000000100000" w:firstRow="0" w:lastRow="0" w:firstColumn="0" w:lastColumn="0" w:oddVBand="0" w:evenVBand="0" w:oddHBand="1" w:evenHBand="0" w:firstRowFirstColumn="0" w:firstRowLastColumn="0" w:lastRowFirstColumn="0" w:lastRowLastColumn="0"/>
+              <w:rPr>
+                <w:rFonts w:ascii="Times New Roman" w:eastAsia="Times New Roman" w:hAnsi="Times New Roman" w:cs="Times New Roman"/>
+                <w:kern w:val="0"/>
+                <w:sz w:val="24"/>
+                <w:szCs w:val="24"/>
+                <w:lang w:eastAsia="es-MX"/>
+                <w14:ligatures w14:val="none"/>
+              </w:rPr>
+            </w:pPr>
+            <w:r>
+              <w:rPr>
+                <w:rFonts w:ascii="Times New Roman" w:eastAsia="Times New Roman" w:hAnsi="Times New Roman" w:cs="Times New Roman"/>
+                <w:kern w:val="0"/>
+                <w:sz w:val="24"/>
+                <w:szCs w:val="24"/>
+                <w:lang w:eastAsia="es-MX"/>
+                <w14:ligatures w14:val="none"/>
+              </w:rPr>
+              <w:t xml:space="preserve">Estructura basada en servicios independientes desacoplados para mejorar la disponibilidad y el mantenimiento. </w:t>
+            </w:r>
+          </w:p>
+        </w:tc>
+      </w:tr>
+      <w:tr>
+        <w:tc>
+          <w:tcPr>
+            <w:cnfStyle w:val="001000000000" w:firstRow="0" w:lastRow="0" w:firstColumn="1" w:lastColumn="0" w:oddVBand="0" w:evenVBand="0" w:oddHBand="0" w:evenHBand="0" w:firstRowFirstColumn="0" w:firstRowLastColumn="0" w:lastRowFirstColumn="0" w:lastRowLastColumn="0"/>
+            <w:tcW w:w="0" w:type="auto"/>
+            <w:hideMark/>
+          </w:tcPr>
+          <w:p>
+            <w:pPr>
+              <w:rPr>
+                <w:rFonts w:ascii="Times New Roman" w:eastAsia="Times New Roman" w:hAnsi="Times New Roman" w:cs="Times New Roman"/>
+                <w:kern w:val="0"/>
+                <w:sz w:val="24"/>
+                <w:szCs w:val="24"/>
+                <w:lang w:eastAsia="es-MX"/>
+                <w14:ligatures w14:val="none"/>
+              </w:rPr>
+            </w:pPr>
+            <w:r>
+              <w:rPr>
+                <w:rFonts w:ascii="Times New Roman" w:eastAsia="Times New Roman" w:hAnsi="Times New Roman" w:cs="Times New Roman"/>
+                <w:kern w:val="0"/>
+                <w:sz w:val="24"/>
+                <w:szCs w:val="24"/>
+                <w:lang w:eastAsia="es-MX"/>
+                <w14:ligatures w14:val="none"/>
+              </w:rPr>
+              <w:t>Persistencia</w:t>
+            </w:r>
+          </w:p>
+        </w:tc>
+        <w:tc>
+          <w:tcPr>
+            <w:tcW w:w="0" w:type="auto"/>
+            <w:hideMark/>
+          </w:tcPr>
+          <w:p>
+            <w:pPr>
+              <w:cnfStyle w:val="000000000000" w:firstRow="0" w:lastRow="0" w:firstColumn="0" w:lastColumn="0" w:oddVBand="0" w:evenVBand="0" w:oddHBand="0" w:evenHBand="0" w:firstRowFirstColumn="0" w:firstRowLastColumn="0" w:lastRowFirstColumn="0" w:lastRowLastColumn="0"/>
+              <w:rPr>
+                <w:rFonts w:ascii="Times New Roman" w:eastAsia="Times New Roman" w:hAnsi="Times New Roman" w:cs="Times New Roman"/>
+                <w:kern w:val="0"/>
+                <w:sz w:val="24"/>
+                <w:szCs w:val="24"/>
+                <w:lang w:eastAsia="es-MX"/>
+                <w14:ligatures w14:val="none"/>
+              </w:rPr>
+            </w:pPr>
+            <w:r>
+              <w:rPr>
+                <w:rFonts w:ascii="Times New Roman" w:eastAsia="Times New Roman" w:hAnsi="Times New Roman" w:cs="Times New Roman"/>
+                <w:b/>
+                <w:bCs/>
+                <w:kern w:val="0"/>
+                <w:sz w:val="24"/>
+                <w:szCs w:val="24"/>
+                <w:lang w:eastAsia="es-MX"/>
+                <w14:ligatures w14:val="none"/>
+              </w:rPr>
+              <w:t>RNF-02: Base de Datos Políglota</w:t>
+            </w:r>
+          </w:p>
+        </w:tc>
+        <w:tc>
+          <w:tcPr>
+            <w:tcW w:w="0" w:type="auto"/>
+            <w:hideMark/>
+          </w:tcPr>
+          <w:p>
+            <w:pPr>
+              <w:spacing w:before="100" w:beforeAutospacing="1" w:after="100" w:afterAutospacing="1"/>
+              <w:cnfStyle w:val="000000000000" w:firstRow="0" w:lastRow="0" w:firstColumn="0" w:lastColumn="0" w:oddVBand="0" w:evenVBand="0" w:oddHBand="0" w:evenHBand="0" w:firstRowFirstColumn="0" w:firstRowLastColumn="0" w:lastRowFirstColumn="0" w:lastRowLastColumn="0"/>
+              <w:rPr>
+                <w:rFonts w:ascii="Times New Roman" w:eastAsia="Times New Roman" w:hAnsi="Times New Roman" w:cs="Times New Roman"/>
+                <w:kern w:val="0"/>
+                <w:sz w:val="24"/>
+                <w:szCs w:val="24"/>
+                <w:lang w:eastAsia="es-MX"/>
+                <w14:ligatures w14:val="none"/>
+              </w:rPr>
+            </w:pPr>
+            <w:r>
+              <w:rPr>
+                <w:rFonts w:ascii="Times New Roman" w:eastAsia="Times New Roman" w:hAnsi="Times New Roman" w:cs="Times New Roman"/>
+                <w:kern w:val="0"/>
+                <w:sz w:val="24"/>
+                <w:szCs w:val="24"/>
+                <w:lang w:eastAsia="es-MX"/>
+                <w14:ligatures w14:val="none"/>
+              </w:rPr>
+              <w:t xml:space="preserve">Uso de PostgreSQL para la gestión relacional de usuarios y MongoDB para búsquedas geoespaciales. </w:t>
+            </w:r>
+          </w:p>
+        </w:tc>
+      </w:tr>
+      <w:tr>
+        <w:trPr>
+          <w:cnfStyle w:val="000000100000" w:firstRow="0" w:lastRow="0" w:firstColumn="0" w:lastColumn="0" w:oddVBand="0" w:evenVBand="0" w:oddHBand="1" w:evenHBand="0" w:firstRowFirstColumn="0" w:firstRowLastColumn="0" w:lastRowFirstColumn="0" w:lastRowLastColumn="0"/>
+        </w:trPr>
+        <w:tc>
+          <w:tcPr>
+            <w:cnfStyle w:val="001000000000" w:firstRow="0" w:lastRow="0" w:firstColumn="1" w:lastColumn="0" w:oddVBand="0" w:evenVBand="0" w:oddHBand="0" w:evenHBand="0" w:firstRowFirstColumn="0" w:firstRowLastColumn="0" w:lastRowFirstColumn="0" w:lastRowLastColumn="0"/>
+            <w:tcW w:w="0" w:type="auto"/>
+            <w:hideMark/>
+          </w:tcPr>
+          <w:p>
+            <w:pPr>
+              <w:rPr>
+                <w:rFonts w:ascii="Times New Roman" w:eastAsia="Times New Roman" w:hAnsi="Times New Roman" w:cs="Times New Roman"/>
+                <w:kern w:val="0"/>
+                <w:sz w:val="24"/>
+                <w:szCs w:val="24"/>
+                <w:lang w:eastAsia="es-MX"/>
+                <w14:ligatures w14:val="none"/>
+              </w:rPr>
+            </w:pPr>
+            <w:r>
+              <w:rPr>
+                <w:rFonts w:ascii="Times New Roman" w:eastAsia="Times New Roman" w:hAnsi="Times New Roman" w:cs="Times New Roman"/>
+                <w:kern w:val="0"/>
+                <w:sz w:val="24"/>
+                <w:szCs w:val="24"/>
+                <w:lang w:eastAsia="es-MX"/>
+                <w14:ligatures w14:val="none"/>
+              </w:rPr>
+              <w:t>Integración</w:t>
+            </w:r>
+          </w:p>
+        </w:tc>
+        <w:tc>
+          <w:tcPr>
+            <w:tcW w:w="0" w:type="auto"/>
+            <w:hideMark/>
+          </w:tcPr>
+          <w:p>
+            <w:pPr>
+              <w:cnfStyle w:val="000000100000" w:firstRow="0" w:lastRow="0" w:firstColumn="0" w:lastColumn="0" w:oddVBand="0" w:evenVBand="0" w:oddHBand="1" w:evenHBand="0" w:firstRowFirstColumn="0" w:firstRowLastColumn="0" w:lastRowFirstColumn="0" w:lastRowLastColumn="0"/>
+              <w:rPr>
+                <w:rFonts w:ascii="Times New Roman" w:eastAsia="Times New Roman" w:hAnsi="Times New Roman" w:cs="Times New Roman"/>
+                <w:kern w:val="0"/>
+                <w:sz w:val="24"/>
+                <w:szCs w:val="24"/>
+                <w:lang w:eastAsia="es-MX"/>
+                <w14:ligatures w14:val="none"/>
+              </w:rPr>
+            </w:pPr>
+            <w:r>
+              <w:rPr>
+                <w:rFonts w:ascii="Times New Roman" w:eastAsia="Times New Roman" w:hAnsi="Times New Roman" w:cs="Times New Roman"/>
+                <w:b/>
+                <w:bCs/>
+                <w:kern w:val="0"/>
+                <w:sz w:val="24"/>
+                <w:szCs w:val="24"/>
+                <w:lang w:eastAsia="es-MX"/>
+                <w14:ligatures w14:val="none"/>
+              </w:rPr>
+              <w:t>RNF-03: Mensajería Asíncrona</w:t>
+            </w:r>
+          </w:p>
+        </w:tc>
+        <w:tc>
+          <w:tcPr>
+            <w:tcW w:w="0" w:type="auto"/>
+            <w:hideMark/>
+          </w:tcPr>
+          <w:p>
+            <w:pPr>
+              <w:spacing w:before="100" w:beforeAutospacing="1" w:after="100" w:afterAutospacing="1"/>
+              <w:cnfStyle w:val="000000100000" w:firstRow="0" w:lastRow="0" w:firstColumn="0" w:lastColumn="0" w:oddVBand="0" w:evenVBand="0" w:oddHBand="1" w:evenHBand="0" w:firstRowFirstColumn="0" w:firstRowLastColumn="0" w:lastRowFirstColumn="0" w:lastRowLastColumn="0"/>
+              <w:rPr>
+                <w:rFonts w:ascii="Times New Roman" w:eastAsia="Times New Roman" w:hAnsi="Times New Roman" w:cs="Times New Roman"/>
+                <w:kern w:val="0"/>
+                <w:sz w:val="24"/>
+                <w:szCs w:val="24"/>
+                <w:lang w:eastAsia="es-MX"/>
+                <w14:ligatures w14:val="none"/>
+              </w:rPr>
+            </w:pPr>
+            <w:r>
+              <w:rPr>
+                <w:rFonts w:ascii="Times New Roman" w:eastAsia="Times New Roman" w:hAnsi="Times New Roman" w:cs="Times New Roman"/>
+                <w:kern w:val="0"/>
+                <w:sz w:val="24"/>
+                <w:szCs w:val="24"/>
+                <w:lang w:eastAsia="es-MX"/>
+                <w14:ligatures w14:val="none"/>
+              </w:rPr>
+              <w:t xml:space="preserve">Procesamiento de eventos transaccionales mediante bus de mensajería en RabbitMQ. </w:t>
+            </w:r>
+          </w:p>
+        </w:tc>
+      </w:tr>
+      <w:tr>
+        <w:tc>
+          <w:tcPr>
+            <w:cnfStyle w:val="001000000000" w:firstRow="0" w:lastRow="0" w:firstColumn="1" w:lastColumn="0" w:oddVBand="0" w:evenVBand="0" w:oddHBand="0" w:evenHBand="0" w:firstRowFirstColumn="0" w:firstRowLastColumn="0" w:lastRowFirstColumn="0" w:lastRowLastColumn="0"/>
+            <w:tcW w:w="0" w:type="auto"/>
+            <w:hideMark/>
+          </w:tcPr>
+          <w:p>
+            <w:pPr>
+              <w:rPr>
+                <w:rFonts w:ascii="Times New Roman" w:eastAsia="Times New Roman" w:hAnsi="Times New Roman" w:cs="Times New Roman"/>
+                <w:kern w:val="0"/>
+                <w:sz w:val="24"/>
+                <w:szCs w:val="24"/>
+                <w:lang w:eastAsia="es-MX"/>
+                <w14:ligatures w14:val="none"/>
+              </w:rPr>
+            </w:pPr>
+            <w:r>
+              <w:rPr>
+                <w:rFonts w:ascii="Times New Roman" w:eastAsia="Times New Roman" w:hAnsi="Times New Roman" w:cs="Times New Roman"/>
+                <w:kern w:val="0"/>
+                <w:sz w:val="24"/>
+                <w:szCs w:val="24"/>
+                <w:lang w:eastAsia="es-MX"/>
+                <w14:ligatures w14:val="none"/>
+              </w:rPr>
+              <w:t>Seguridad</w:t>
+            </w:r>
+          </w:p>
+        </w:tc>
+        <w:tc>
+          <w:tcPr>
+            <w:tcW w:w="0" w:type="auto"/>
+            <w:hideMark/>
+          </w:tcPr>
+          <w:p>
+            <w:pPr>
+              <w:cnfStyle w:val="000000000000" w:firstRow="0" w:lastRow="0" w:firstColumn="0" w:lastColumn="0" w:oddVBand="0" w:evenVBand="0" w:oddHBand="0" w:evenHBand="0" w:firstRowFirstColumn="0" w:firstRowLastColumn="0" w:lastRowFirstColumn="0" w:lastRowLastColumn="0"/>
+              <w:rPr>
+                <w:rFonts w:ascii="Times New Roman" w:eastAsia="Times New Roman" w:hAnsi="Times New Roman" w:cs="Times New Roman"/>
+                <w:kern w:val="0"/>
+                <w:sz w:val="24"/>
+                <w:szCs w:val="24"/>
+                <w:lang w:eastAsia="es-MX"/>
+                <w14:ligatures w14:val="none"/>
+              </w:rPr>
+            </w:pPr>
+            <w:r>
+              <w:rPr>
+                <w:rFonts w:ascii="Times New Roman" w:eastAsia="Times New Roman" w:hAnsi="Times New Roman" w:cs="Times New Roman"/>
+                <w:b/>
+                <w:bCs/>
+                <w:kern w:val="0"/>
+                <w:sz w:val="24"/>
+                <w:szCs w:val="24"/>
+                <w:lang w:eastAsia="es-MX"/>
+                <w14:ligatures w14:val="none"/>
+              </w:rPr>
+              <w:t>RNF-04: Autenticación y Cobro</w:t>
+            </w:r>
+          </w:p>
+        </w:tc>
+        <w:tc>
+          <w:tcPr>
+            <w:tcW w:w="0" w:type="auto"/>
+            <w:hideMark/>
+          </w:tcPr>
+          <w:p>
+            <w:pPr>
+              <w:spacing w:before="100" w:beforeAutospacing="1" w:after="100" w:afterAutospacing="1"/>
+              <w:cnfStyle w:val="000000000000" w:firstRow="0" w:lastRow="0" w:firstColumn="0" w:lastColumn="0" w:oddVBand="0" w:evenVBand="0" w:oddHBand="0" w:evenHBand="0" w:firstRowFirstColumn="0" w:firstRowLastColumn="0" w:lastRowFirstColumn="0" w:lastRowLastColumn="0"/>
+              <w:rPr>
+                <w:rFonts w:ascii="Times New Roman" w:eastAsia="Times New Roman" w:hAnsi="Times New Roman" w:cs="Times New Roman"/>
+                <w:kern w:val="0"/>
+                <w:sz w:val="24"/>
+                <w:szCs w:val="24"/>
+                <w:lang w:eastAsia="es-MX"/>
+                <w14:ligatures w14:val="none"/>
+              </w:rPr>
+            </w:pPr>
+            <w:r>
+              <w:rPr>
+                <w:rFonts w:ascii="Times New Roman" w:eastAsia="Times New Roman" w:hAnsi="Times New Roman" w:cs="Times New Roman"/>
+                <w:kern w:val="0"/>
+                <w:sz w:val="24"/>
+                <w:szCs w:val="24"/>
+                <w:lang w:eastAsia="es-MX"/>
+                <w14:ligatures w14:val="none"/>
+              </w:rPr>
+              <w:t xml:space="preserve">Validación obligatoria por JWT y transacciones financieras seguras. </w:t>
+            </w:r>
+          </w:p>
+        </w:tc>
+      </w:tr>
+      <w:tr>
+        <w:trPr>
+          <w:cnfStyle w:val="000000100000" w:firstRow="0" w:lastRow="0" w:firstColumn="0" w:lastColumn="0" w:oddVBand="0" w:evenVBand="0" w:oddHBand="1" w:evenHBand="0" w:firstRowFirstColumn="0" w:firstRowLastColumn="0" w:lastRowFirstColumn="0" w:lastRowLastColumn="0"/>
+        </w:trPr>
+        <w:tc>
+          <w:tcPr>
+            <w:cnfStyle w:val="001000000000" w:firstRow="0" w:lastRow="0" w:firstColumn="1" w:lastColumn="0" w:oddVBand="0" w:evenVBand="0" w:oddHBand="0" w:evenHBand="0" w:firstRowFirstColumn="0" w:firstRowLastColumn="0" w:lastRowFirstColumn="0" w:lastRowLastColumn="0"/>
+            <w:tcW w:w="0" w:type="auto"/>
+            <w:hideMark/>
+          </w:tcPr>
+          <w:p>
+            <w:pPr>
+              <w:rPr>
+                <w:rFonts w:ascii="Times New Roman" w:eastAsia="Times New Roman" w:hAnsi="Times New Roman" w:cs="Times New Roman"/>
+                <w:kern w:val="0"/>
+                <w:sz w:val="24"/>
+                <w:szCs w:val="24"/>
+                <w:lang w:eastAsia="es-MX"/>
+                <w14:ligatures w14:val="none"/>
+              </w:rPr>
+            </w:pPr>
+            <w:r>
+              <w:rPr>
+                <w:rFonts w:ascii="Times New Roman" w:eastAsia="Times New Roman" w:hAnsi="Times New Roman" w:cs="Times New Roman"/>
+                <w:kern w:val="0"/>
+                <w:sz w:val="24"/>
+                <w:szCs w:val="24"/>
+                <w:lang w:eastAsia="es-MX"/>
+                <w14:ligatures w14:val="none"/>
+              </w:rPr>
+              <w:t>Desempeño</w:t>
+            </w:r>
+          </w:p>
+        </w:tc>
+        <w:tc>
+          <w:tcPr>
+            <w:tcW w:w="0" w:type="auto"/>
+            <w:hideMark/>
+          </w:tcPr>
+          <w:p>
+            <w:pPr>
+              <w:cnfStyle w:val="000000100000" w:firstRow="0" w:lastRow="0" w:firstColumn="0" w:lastColumn="0" w:oddVBand="0" w:evenVBand="0" w:oddHBand="1" w:evenHBand="0" w:firstRowFirstColumn="0" w:firstRowLastColumn="0" w:lastRowFirstColumn="0" w:lastRowLastColumn="0"/>
+              <w:rPr>
+                <w:rFonts w:ascii="Times New Roman" w:eastAsia="Times New Roman" w:hAnsi="Times New Roman" w:cs="Times New Roman"/>
+                <w:kern w:val="0"/>
+                <w:sz w:val="24"/>
+                <w:szCs w:val="24"/>
+                <w:lang w:eastAsia="es-MX"/>
+                <w14:ligatures w14:val="none"/>
+              </w:rPr>
+            </w:pPr>
+            <w:r>
+              <w:rPr>
+                <w:rFonts w:ascii="Times New Roman" w:eastAsia="Times New Roman" w:hAnsi="Times New Roman" w:cs="Times New Roman"/>
+                <w:b/>
+                <w:bCs/>
+                <w:kern w:val="0"/>
+                <w:sz w:val="24"/>
+                <w:szCs w:val="24"/>
+                <w:lang w:eastAsia="es-MX"/>
+                <w14:ligatures w14:val="none"/>
+              </w:rPr>
+              <w:t>RNF-05: Escalabilidad</w:t>
+            </w:r>
+          </w:p>
+        </w:tc>
+        <w:tc>
+          <w:tcPr>
+            <w:tcW w:w="0" w:type="auto"/>
+            <w:hideMark/>
+          </w:tcPr>
+          <w:p>
+            <w:pPr>
+              <w:spacing w:before="100" w:beforeAutospacing="1" w:after="100" w:afterAutospacing="1"/>
+              <w:cnfStyle w:val="000000100000" w:firstRow="0" w:lastRow="0" w:firstColumn="0" w:lastColumn="0" w:oddVBand="0" w:evenVBand="0" w:oddHBand="1" w:evenHBand="0" w:firstRowFirstColumn="0" w:firstRowLastColumn="0" w:lastRowFirstColumn="0" w:lastRowLastColumn="0"/>
+              <w:rPr>
+                <w:rFonts w:ascii="Times New Roman" w:eastAsia="Times New Roman" w:hAnsi="Times New Roman" w:cs="Times New Roman"/>
+                <w:kern w:val="0"/>
+                <w:sz w:val="24"/>
+                <w:szCs w:val="24"/>
+                <w:lang w:eastAsia="es-MX"/>
+                <w14:ligatures w14:val="none"/>
+              </w:rPr>
+            </w:pPr>
+            <w:r>
+              <w:rPr>
+                <w:rFonts w:ascii="Times New Roman" w:eastAsia="Times New Roman" w:hAnsi="Times New Roman" w:cs="Times New Roman"/>
+                <w:kern w:val="0"/>
+                <w:sz w:val="24"/>
+                <w:szCs w:val="24"/>
+                <w:lang w:eastAsia="es-MX"/>
+                <w14:ligatures w14:val="none"/>
+              </w:rPr>
+              <w:t xml:space="preserve">Capacidad de escalar módulos de búsqueda sin impactar el procesamiento de pagos. </w:t>
+            </w:r>
+          </w:p>
+        </w:tc>
+      </w:tr>
+      <w:tr>
+        <w:tc>
+          <w:tcPr>
+            <w:cnfStyle w:val="001000000000" w:firstRow="0" w:lastRow="0" w:firstColumn="1" w:lastColumn="0" w:oddVBand="0" w:evenVBand="0" w:oddHBand="0" w:evenHBand="0" w:firstRowFirstColumn="0" w:firstRowLastColumn="0" w:lastRowFirstColumn="0" w:lastRowLastColumn="0"/>
+            <w:tcW w:w="0" w:type="auto"/>
+            <w:hideMark/>
+          </w:tcPr>
+          <w:p>
+            <w:pPr>
+              <w:rPr>
+                <w:rFonts w:ascii="Times New Roman" w:eastAsia="Times New Roman" w:hAnsi="Times New Roman" w:cs="Times New Roman"/>
+                <w:kern w:val="0"/>
+                <w:sz w:val="24"/>
+                <w:szCs w:val="24"/>
+                <w:lang w:eastAsia="es-MX"/>
+                <w14:ligatures w14:val="none"/>
+              </w:rPr>
+            </w:pPr>
+            <w:r>
+              <w:rPr>
+                <w:rFonts w:ascii="Times New Roman" w:eastAsia="Times New Roman" w:hAnsi="Times New Roman" w:cs="Times New Roman"/>
+                <w:kern w:val="0"/>
+                <w:sz w:val="24"/>
+                <w:szCs w:val="24"/>
+                <w:lang w:eastAsia="es-MX"/>
+                <w14:ligatures w14:val="none"/>
+              </w:rPr>
+              <w:t>Compatibilidad</w:t>
+            </w:r>
+          </w:p>
+        </w:tc>
+        <w:tc>
+          <w:tcPr>
+            <w:tcW w:w="0" w:type="auto"/>
+            <w:hideMark/>
+          </w:tcPr>
+          <w:p>
+            <w:pPr>
+              <w:cnfStyle w:val="000000000000" w:firstRow="0" w:lastRow="0" w:firstColumn="0" w:lastColumn="0" w:oddVBand="0" w:evenVBand="0" w:oddHBand="0" w:evenHBand="0" w:firstRowFirstColumn="0" w:firstRowLastColumn="0" w:lastRowFirstColumn="0" w:lastRowLastColumn="0"/>
+              <w:rPr>
+                <w:rFonts w:ascii="Times New Roman" w:eastAsia="Times New Roman" w:hAnsi="Times New Roman" w:cs="Times New Roman"/>
+                <w:kern w:val="0"/>
+                <w:sz w:val="24"/>
+                <w:szCs w:val="24"/>
+                <w:lang w:eastAsia="es-MX"/>
+                <w14:ligatures w14:val="none"/>
+              </w:rPr>
+            </w:pPr>
+            <w:r>
+              <w:rPr>
+                <w:rFonts w:ascii="Times New Roman" w:eastAsia="Times New Roman" w:hAnsi="Times New Roman" w:cs="Times New Roman"/>
+                <w:b/>
+                <w:bCs/>
+                <w:kern w:val="0"/>
+                <w:sz w:val="24"/>
+                <w:szCs w:val="24"/>
+                <w:lang w:eastAsia="es-MX"/>
+                <w14:ligatures w14:val="none"/>
+              </w:rPr>
+              <w:t>RNF-06: Entorno Móvil</w:t>
+            </w:r>
+          </w:p>
+        </w:tc>
+        <w:tc>
+          <w:tcPr>
+            <w:tcW w:w="0" w:type="auto"/>
+            <w:hideMark/>
+          </w:tcPr>
+          <w:p>
+            <w:pPr>
+              <w:spacing w:before="100" w:beforeAutospacing="1" w:after="100" w:afterAutospacing="1"/>
+              <w:cnfStyle w:val="000000000000" w:firstRow="0" w:lastRow="0" w:firstColumn="0" w:lastColumn="0" w:oddVBand="0" w:evenVBand="0" w:oddHBand="0" w:evenHBand="0" w:firstRowFirstColumn="0" w:firstRowLastColumn="0" w:lastRowFirstColumn="0" w:lastRowLastColumn="0"/>
+              <w:rPr>
+                <w:rFonts w:ascii="Times New Roman" w:eastAsia="Times New Roman" w:hAnsi="Times New Roman" w:cs="Times New Roman"/>
+                <w:kern w:val="0"/>
+                <w:sz w:val="24"/>
+                <w:szCs w:val="24"/>
+                <w:lang w:eastAsia="es-MX"/>
+                <w14:ligatures w14:val="none"/>
+              </w:rPr>
+            </w:pPr>
+            <w:r>
+              <w:rPr>
+                <w:rFonts w:ascii="Times New Roman" w:eastAsia="Times New Roman" w:hAnsi="Times New Roman" w:cs="Times New Roman"/>
+                <w:kern w:val="0"/>
+                <w:sz w:val="24"/>
+                <w:szCs w:val="24"/>
+                <w:lang w:eastAsia="es-MX"/>
+                <w14:ligatures w14:val="none"/>
+              </w:rPr>
+              <w:t xml:space="preserve">Solución optimizada para su ejecución en dispositivos móviles. </w:t>
+            </w:r>
+          </w:p>
+        </w:tc>
+      </w:tr>
+    </w:tbl>
+    <w:p>
+      <w:pPr>
+        <w:pStyle w:val="NormalWeb"/>
+      </w:pPr>
+    </w:p>
+    <w:p>
+      <w:pPr>
+        <w:tabs>
+          <w:tab w:val="num" w:pos="720"/>
+        </w:tabs>
+        <w:jc w:val="both"/>
+        <w:rPr>
+          <w:rFonts w:ascii="Times New Roman" w:hAnsi="Times New Roman" w:cs="Times New Roman"/>
+          <w:kern w:val="0"/>
+          <w:sz w:val="24"/>
+          <w:szCs w:val="24"/>
+          <w:lang w:eastAsia="es-MX"/>
+        </w:rPr>
+      </w:pPr>
+    </w:p>
+    <w:p>
+      <w:pPr>
+        <w:tabs>
+          <w:tab w:val="num" w:pos="720"/>
+        </w:tabs>
+        <w:jc w:val="both"/>
+        <w:rPr>
+          <w:rFonts w:ascii="Times New Roman" w:hAnsi="Times New Roman" w:cs="Times New Roman"/>
+          <w:kern w:val="0"/>
+          <w:sz w:val="24"/>
+          <w:szCs w:val="24"/>
+          <w:lang w:eastAsia="es-MX"/>
+        </w:rPr>
+      </w:pPr>
     </w:p>
     <w:p>
       <w:pPr>
@@ -1758,8 +2434,157 @@
 </file>
 
 <file path=word/numbering.xml><?xml version="1.0" encoding="utf-8"?>
-<w:numbering xmlns:wpc="http://schemas.microsoft.com/office/word/2010/wordprocessingCanvas" xmlns:cx="http://schemas.microsoft.com/office/drawing/2014/chartex" xmlns:cx1="http://schemas.microsoft.com/office/drawing/2015/9/8/chartex" xmlns:mc="http://schemas.openxmlformats.org/markup-compatibility/2006" xmlns:o="urn:schemas-microsoft-com:office:office" xmlns:r="http://schemas.openxmlformats.org/officeDocument/2006/relationships" xmlns:m="http://schemas.openxmlformats.org/officeDocument/2006/math" xmlns:v="urn:schemas-microsoft-com:vml" xmlns:wp14="http://schemas.microsoft.com/office/word/2010/wordprocessingDrawing" xmlns:wp="http://schemas.openxmlformats.org/drawingml/2006/wordprocessingDrawing" xmlns:w10="urn:schemas-microsoft-com:office:word" xmlns:w="http://schemas.openxmlformats.org/wordprocessingml/2006/main" xmlns:w14="http://schemas.microsoft.com/office/word/2010/wordml" xmlns:w15="http://schemas.microsoft.com/office/word/2012/wordml" xmlns:w16se="http://schemas.microsoft.com/office/word/2015/wordml/symex" xmlns:wpg="http://schemas.microsoft.com/office/word/2010/wordprocessingGroup" xmlns:wpi="http://schemas.microsoft.com/office/word/2010/wordprocessingInk" xmlns:wne="http://schemas.microsoft.com/office/word/2006/wordml" xmlns:wps="http://schemas.microsoft.com/office/word/2010/wordprocessingShape" mc:Ignorable="w14 w15 w16se wp14">
+<w:numbering xmlns:wpc="http://schemas.microsoft.com/office/word/2010/wordprocessingCanvas" xmlns:cx="http://schemas.microsoft.com/office/drawing/2014/chartex" xmlns:cx1="http://schemas.microsoft.com/office/drawing/2015/9/8/chartex" xmlns:cx2="http://schemas.microsoft.com/office/drawing/2015/10/21/chartex" xmlns:cx3="http://schemas.microsoft.com/office/drawing/2016/5/9/chartex" xmlns:cx4="http://schemas.microsoft.com/office/drawing/2016/5/10/chartex" xmlns:cx5="http://schemas.microsoft.com/office/drawing/2016/5/11/chartex" xmlns:cx6="http://schemas.microsoft.com/office/drawing/2016/5/12/chartex" xmlns:cx7="http://schemas.microsoft.com/office/drawing/2016/5/13/chartex" xmlns:cx8="http://schemas.microsoft.com/office/drawing/2016/5/14/chartex" xmlns:mc="http://schemas.openxmlformats.org/markup-compatibility/2006" xmlns:aink="http://schemas.microsoft.com/office/drawing/2016/ink" xmlns:am3d="http://schemas.microsoft.com/office/drawing/2017/model3d" xmlns:o="urn:schemas-microsoft-com:office:office" xmlns:r="http://schemas.openxmlformats.org/officeDocument/2006/relationships" xmlns:m="http://schemas.openxmlformats.org/officeDocument/2006/math" xmlns:v="urn:schemas-microsoft-com:vml" xmlns:wp14="http://schemas.microsoft.com/office/word/2010/wordprocessingDrawing" xmlns:wp="http://schemas.openxmlformats.org/drawingml/2006/wordprocessingDrawing" xmlns:w10="urn:schemas-microsoft-com:office:word" xmlns:w="http://schemas.openxmlformats.org/wordprocessingml/2006/main" xmlns:w14="http://schemas.microsoft.com/office/word/2010/wordml" xmlns:w15="http://schemas.microsoft.com/office/word/2012/wordml" xmlns:w16cex="http://schemas.microsoft.com/office/word/2018/wordml/cex" xmlns:w16cid="http://schemas.microsoft.com/office/word/2016/wordml/cid" xmlns:w16="http://schemas.microsoft.com/office/word/2018/wordml" xmlns:w16sdtdh="http://schemas.microsoft.com/office/word/2020/wordml/sdtdatahash" xmlns:w16se="http://schemas.microsoft.com/office/word/2015/wordml/symex" xmlns:wpg="http://schemas.microsoft.com/office/word/2010/wordprocessingGroup" xmlns:wpi="http://schemas.microsoft.com/office/word/2010/wordprocessingInk" xmlns:wne="http://schemas.microsoft.com/office/word/2006/wordml" xmlns:wps="http://schemas.microsoft.com/office/word/2010/wordprocessingShape" mc:Ignorable="w14 w15 w16se w16cid w16 w16cex w16sdtdh wp14">
   <w:abstractNum w:abstractNumId="0" w15:restartNumberingAfterBreak="0">
+    <w:nsid w:val="0F642C9D"/>
+    <w:multiLevelType w:val="multilevel"/>
+    <w:tmpl w:val="63C883A4"/>
+    <w:lvl w:ilvl="0">
+      <w:start w:val="1"/>
+      <w:numFmt w:val="bullet"/>
+      <w:lvlText w:val=""/>
+      <w:lvlJc w:val="left"/>
+      <w:pPr>
+        <w:tabs>
+          <w:tab w:val="num" w:pos="720"/>
+        </w:tabs>
+        <w:ind w:left="720" w:hanging="360"/>
+      </w:pPr>
+      <w:rPr>
+        <w:rFonts w:ascii="Symbol" w:hAnsi="Symbol" w:hint="default"/>
+        <w:sz w:val="20"/>
+      </w:rPr>
+    </w:lvl>
+    <w:lvl w:ilvl="1">
+      <w:start w:val="1"/>
+      <w:numFmt w:val="bullet"/>
+      <w:lvlText w:val="o"/>
+      <w:lvlJc w:val="left"/>
+      <w:pPr>
+        <w:tabs>
+          <w:tab w:val="num" w:pos="1440"/>
+        </w:tabs>
+        <w:ind w:left="1440" w:hanging="360"/>
+      </w:pPr>
+      <w:rPr>
+        <w:rFonts w:ascii="Courier New" w:hAnsi="Courier New" w:hint="default"/>
+        <w:sz w:val="20"/>
+      </w:rPr>
+    </w:lvl>
+    <w:lvl w:ilvl="2" w:tentative="1">
+      <w:start w:val="1"/>
+      <w:numFmt w:val="bullet"/>
+      <w:lvlText w:val=""/>
+      <w:lvlJc w:val="left"/>
+      <w:pPr>
+        <w:tabs>
+          <w:tab w:val="num" w:pos="2160"/>
+        </w:tabs>
+        <w:ind w:left="2160" w:hanging="360"/>
+      </w:pPr>
+      <w:rPr>
+        <w:rFonts w:ascii="Wingdings" w:hAnsi="Wingdings" w:hint="default"/>
+        <w:sz w:val="20"/>
+      </w:rPr>
+    </w:lvl>
+    <w:lvl w:ilvl="3" w:tentative="1">
+      <w:start w:val="1"/>
+      <w:numFmt w:val="bullet"/>
+      <w:lvlText w:val=""/>
+      <w:lvlJc w:val="left"/>
+      <w:pPr>
+        <w:tabs>
+          <w:tab w:val="num" w:pos="2880"/>
+        </w:tabs>
+        <w:ind w:left="2880" w:hanging="360"/>
+      </w:pPr>
+      <w:rPr>
+        <w:rFonts w:ascii="Wingdings" w:hAnsi="Wingdings" w:hint="default"/>
+        <w:sz w:val="20"/>
+      </w:rPr>
+    </w:lvl>
+    <w:lvl w:ilvl="4" w:tentative="1">
+      <w:start w:val="1"/>
+      <w:numFmt w:val="bullet"/>
+      <w:lvlText w:val=""/>
+      <w:lvlJc w:val="left"/>
+      <w:pPr>
+        <w:tabs>
+          <w:tab w:val="num" w:pos="3600"/>
+        </w:tabs>
+        <w:ind w:left="3600" w:hanging="360"/>
+      </w:pPr>
+      <w:rPr>
+        <w:rFonts w:ascii="Wingdings" w:hAnsi="Wingdings" w:hint="default"/>
+        <w:sz w:val="20"/>
+      </w:rPr>
+    </w:lvl>
+    <w:lvl w:ilvl="5" w:tentative="1">
+      <w:start w:val="1"/>
+      <w:numFmt w:val="bullet"/>
+      <w:lvlText w:val=""/>
+      <w:lvlJc w:val="left"/>
+      <w:pPr>
+        <w:tabs>
+          <w:tab w:val="num" w:pos="4320"/>
+        </w:tabs>
+        <w:ind w:left="4320" w:hanging="360"/>
+      </w:pPr>
+      <w:rPr>
+        <w:rFonts w:ascii="Wingdings" w:hAnsi="Wingdings" w:hint="default"/>
+        <w:sz w:val="20"/>
+      </w:rPr>
+    </w:lvl>
+    <w:lvl w:ilvl="6" w:tentative="1">
+      <w:start w:val="1"/>
+      <w:numFmt w:val="bullet"/>
+      <w:lvlText w:val=""/>
+      <w:lvlJc w:val="left"/>
+      <w:pPr>
+        <w:tabs>
+          <w:tab w:val="num" w:pos="5040"/>
+        </w:tabs>
+        <w:ind w:left="5040" w:hanging="360"/>
+      </w:pPr>
+      <w:rPr>
+        <w:rFonts w:ascii="Wingdings" w:hAnsi="Wingdings" w:hint="default"/>
+        <w:sz w:val="20"/>
+      </w:rPr>
+    </w:lvl>
+    <w:lvl w:ilvl="7" w:tentative="1">
+      <w:start w:val="1"/>
+      <w:numFmt w:val="bullet"/>
+      <w:lvlText w:val=""/>
+      <w:lvlJc w:val="left"/>
+      <w:pPr>
+        <w:tabs>
+          <w:tab w:val="num" w:pos="5760"/>
+        </w:tabs>
+        <w:ind w:left="5760" w:hanging="360"/>
+      </w:pPr>
+      <w:rPr>
+        <w:rFonts w:ascii="Wingdings" w:hAnsi="Wingdings" w:hint="default"/>
+        <w:sz w:val="20"/>
+      </w:rPr>
+    </w:lvl>
+    <w:lvl w:ilvl="8" w:tentative="1">
+      <w:start w:val="1"/>
+      <w:numFmt w:val="bullet"/>
+      <w:lvlText w:val=""/>
+      <w:lvlJc w:val="left"/>
+      <w:pPr>
+        <w:tabs>
+          <w:tab w:val="num" w:pos="6480"/>
+        </w:tabs>
+        <w:ind w:left="6480" w:hanging="360"/>
+      </w:pPr>
+      <w:rPr>
+        <w:rFonts w:ascii="Wingdings" w:hAnsi="Wingdings" w:hint="default"/>
+        <w:sz w:val="20"/>
+      </w:rPr>
+    </w:lvl>
+  </w:abstractNum>
+  <w:abstractNum w:abstractNumId="1" w15:restartNumberingAfterBreak="0">
     <w:nsid w:val="438D4760"/>
     <w:multiLevelType w:val="hybridMultilevel"/>
     <w:tmpl w:val="C666B85A"/>
@@ -1872,7 +2697,7 @@
       </w:rPr>
     </w:lvl>
   </w:abstractNum>
-  <w:abstractNum w:abstractNumId="1" w15:restartNumberingAfterBreak="0">
+  <w:abstractNum w:abstractNumId="2" w15:restartNumberingAfterBreak="0">
     <w:nsid w:val="4C61728A"/>
     <w:multiLevelType w:val="hybridMultilevel"/>
     <w:tmpl w:val="EACE7172"/>
@@ -1985,7 +2810,7 @@
       </w:rPr>
     </w:lvl>
   </w:abstractNum>
-  <w:abstractNum w:abstractNumId="2" w15:restartNumberingAfterBreak="0">
+  <w:abstractNum w:abstractNumId="3" w15:restartNumberingAfterBreak="0">
     <w:nsid w:val="53C74621"/>
     <w:multiLevelType w:val="multilevel"/>
     <w:tmpl w:val="3BEC1E2C"/>
@@ -2134,7 +2959,7 @@
       </w:rPr>
     </w:lvl>
   </w:abstractNum>
-  <w:abstractNum w:abstractNumId="3" w15:restartNumberingAfterBreak="0">
+  <w:abstractNum w:abstractNumId="4" w15:restartNumberingAfterBreak="0">
     <w:nsid w:val="7E775DBD"/>
     <w:multiLevelType w:val="multilevel"/>
     <w:tmpl w:val="EE8C3AFE"/>
@@ -2284,22 +3109,25 @@
     </w:lvl>
   </w:abstractNum>
   <w:num w:numId="1">
+    <w:abstractNumId w:val="4"/>
+  </w:num>
+  <w:num w:numId="2">
     <w:abstractNumId w:val="3"/>
   </w:num>
-  <w:num w:numId="2">
+  <w:num w:numId="3">
     <w:abstractNumId w:val="2"/>
   </w:num>
-  <w:num w:numId="3">
+  <w:num w:numId="4">
     <w:abstractNumId w:val="1"/>
   </w:num>
-  <w:num w:numId="4">
+  <w:num w:numId="5">
     <w:abstractNumId w:val="0"/>
   </w:num>
 </w:numbering>
 </file>
 
 <file path=word/styles.xml><?xml version="1.0" encoding="utf-8"?>
-<w:styles xmlns:mc="http://schemas.openxmlformats.org/markup-compatibility/2006" xmlns:r="http://schemas.openxmlformats.org/officeDocument/2006/relationships" xmlns:w="http://schemas.openxmlformats.org/wordprocessingml/2006/main" xmlns:w14="http://schemas.microsoft.com/office/word/2010/wordml" xmlns:w15="http://schemas.microsoft.com/office/word/2012/wordml" xmlns:w16se="http://schemas.microsoft.com/office/word/2015/wordml/symex" mc:Ignorable="w14 w15 w16se">
+<w:styles xmlns:mc="http://schemas.openxmlformats.org/markup-compatibility/2006" xmlns:r="http://schemas.openxmlformats.org/officeDocument/2006/relationships" xmlns:w="http://schemas.openxmlformats.org/wordprocessingml/2006/main" xmlns:w14="http://schemas.microsoft.com/office/word/2010/wordml" xmlns:w15="http://schemas.microsoft.com/office/word/2012/wordml" xmlns:w16cex="http://schemas.microsoft.com/office/word/2018/wordml/cex" xmlns:w16cid="http://schemas.microsoft.com/office/word/2016/wordml/cid" xmlns:w16="http://schemas.microsoft.com/office/word/2018/wordml" xmlns:w16sdtdh="http://schemas.microsoft.com/office/word/2020/wordml/sdtdatahash" xmlns:w16se="http://schemas.microsoft.com/office/word/2015/wordml/symex" mc:Ignorable="w14 w15 w16se w16cid w16 w16cex w16sdtdh">
   <w:docDefaults>
     <w:rPrDefault>
       <w:rPr>
@@ -2317,7 +3145,7 @@
       </w:pPr>
     </w:pPrDefault>
   </w:docDefaults>
-  <w:latentStyles w:defLockedState="0" w:defUIPriority="99" w:defSemiHidden="0" w:defUnhideWhenUsed="0" w:defQFormat="0" w:count="371">
+  <w:latentStyles w:defLockedState="0" w:defUIPriority="99" w:defSemiHidden="0" w:defUnhideWhenUsed="0" w:defQFormat="0" w:count="376">
     <w:lsdException w:name="Normal" w:uiPriority="0" w:qFormat="1"/>
     <w:lsdException w:name="heading 1" w:uiPriority="9" w:qFormat="1"/>
     <w:lsdException w:name="heading 2" w:semiHidden="1" w:uiPriority="9" w:unhideWhenUsed="1" w:qFormat="1"/>
@@ -2423,7 +3251,6 @@
     <w:lsdException w:name="HTML Sample" w:semiHidden="1" w:unhideWhenUsed="1"/>
     <w:lsdException w:name="HTML Typewriter" w:semiHidden="1" w:unhideWhenUsed="1"/>
     <w:lsdException w:name="HTML Variable" w:semiHidden="1" w:unhideWhenUsed="1"/>
-    <w:lsdException w:name="Normal Table" w:semiHidden="1" w:unhideWhenUsed="1"/>
     <w:lsdException w:name="annotation subject" w:semiHidden="1" w:unhideWhenUsed="1"/>
     <w:lsdException w:name="No List" w:semiHidden="1" w:unhideWhenUsed="1"/>
     <w:lsdException w:name="Outline List 1" w:semiHidden="1" w:unhideWhenUsed="1"/>
@@ -2466,11 +3293,8 @@
     <w:lsdException w:name="Table Contemporary" w:semiHidden="1" w:unhideWhenUsed="1"/>
     <w:lsdException w:name="Table Elegant" w:semiHidden="1" w:unhideWhenUsed="1"/>
     <w:lsdException w:name="Table Professional" w:semiHidden="1" w:unhideWhenUsed="1"/>
-    <w:lsdException w:name="Table Subtle 1" w:semiHidden="1" w:unhideWhenUsed="1"/>
     <w:lsdException w:name="Table Subtle 2" w:semiHidden="1" w:unhideWhenUsed="1"/>
     <w:lsdException w:name="Table Web 1" w:semiHidden="1" w:unhideWhenUsed="1"/>
-    <w:lsdException w:name="Table Web 2" w:semiHidden="1" w:unhideWhenUsed="1"/>
-    <w:lsdException w:name="Table Web 3" w:semiHidden="1" w:unhideWhenUsed="1"/>
     <w:lsdException w:name="Balloon Text" w:semiHidden="1" w:unhideWhenUsed="1"/>
     <w:lsdException w:name="Table Grid" w:uiPriority="39"/>
     <w:lsdException w:name="Table Theme" w:semiHidden="1" w:unhideWhenUsed="1"/>
@@ -2689,6 +3513,11 @@
     <w:lsdException w:name="List Table 5 Dark Accent 6" w:uiPriority="50"/>
     <w:lsdException w:name="List Table 6 Colorful Accent 6" w:uiPriority="51"/>
     <w:lsdException w:name="List Table 7 Colorful Accent 6" w:uiPriority="52"/>
+    <w:lsdException w:name="Mention" w:semiHidden="1" w:unhideWhenUsed="1"/>
+    <w:lsdException w:name="Smart Hyperlink" w:semiHidden="1" w:unhideWhenUsed="1"/>
+    <w:lsdException w:name="Hashtag" w:semiHidden="1" w:unhideWhenUsed="1"/>
+    <w:lsdException w:name="Unresolved Mention" w:semiHidden="1" w:unhideWhenUsed="1"/>
+    <w:lsdException w:name="Smart Link" w:semiHidden="1" w:unhideWhenUsed="1"/>
   </w:latentStyles>
   <w:style w:type="paragraph" w:default="1" w:styleId="Normal">
     <w:name w:val="Normal"/>
@@ -2765,6 +3594,7 @@
   <w:style w:type="character" w:default="1" w:styleId="Fuentedeprrafopredeter">
     <w:name w:val="Default Paragraph Font"/>
     <w:uiPriority w:val="1"/>
+    <w:semiHidden/>
     <w:unhideWhenUsed/>
   </w:style>
   <w:style w:type="table" w:default="1" w:styleId="Tablanormal">
@@ -2865,6 +3695,82 @@
       <w:ind w:left="720"/>
       <w:contextualSpacing/>
     </w:pPr>
+  </w:style>
+  <w:style w:type="table" w:styleId="Tablaconcuadrcula4-nfasis5">
+    <w:name w:val="Grid Table 4 Accent 5"/>
+    <w:basedOn w:val="Tablanormal"/>
+    <w:uiPriority w:val="49"/>
+    <w:rsid w:val="001D7833"/>
+    <w:pPr>
+      <w:spacing w:after="0" w:line="240" w:lineRule="auto"/>
+    </w:pPr>
+    <w:tblPr>
+      <w:tblStyleRowBandSize w:val="1"/>
+      <w:tblStyleColBandSize w:val="1"/>
+      <w:tblBorders>
+        <w:top w:val="single" w:sz="4" w:space="0" w:color="9CC2E5" w:themeColor="accent5" w:themeTint="99"/>
+        <w:left w:val="single" w:sz="4" w:space="0" w:color="9CC2E5" w:themeColor="accent5" w:themeTint="99"/>
+        <w:bottom w:val="single" w:sz="4" w:space="0" w:color="9CC2E5" w:themeColor="accent5" w:themeTint="99"/>
+        <w:right w:val="single" w:sz="4" w:space="0" w:color="9CC2E5" w:themeColor="accent5" w:themeTint="99"/>
+        <w:insideH w:val="single" w:sz="4" w:space="0" w:color="9CC2E5" w:themeColor="accent5" w:themeTint="99"/>
+        <w:insideV w:val="single" w:sz="4" w:space="0" w:color="9CC2E5" w:themeColor="accent5" w:themeTint="99"/>
+      </w:tblBorders>
+    </w:tblPr>
+    <w:tblStylePr w:type="firstRow">
+      <w:rPr>
+        <w:b/>
+        <w:bCs/>
+        <w:color w:val="FFFFFF" w:themeColor="background1"/>
+      </w:rPr>
+      <w:tblPr/>
+      <w:tcPr>
+        <w:tcBorders>
+          <w:top w:val="single" w:sz="4" w:space="0" w:color="5B9BD5" w:themeColor="accent5"/>
+          <w:left w:val="single" w:sz="4" w:space="0" w:color="5B9BD5" w:themeColor="accent5"/>
+          <w:bottom w:val="single" w:sz="4" w:space="0" w:color="5B9BD5" w:themeColor="accent5"/>
+          <w:right w:val="single" w:sz="4" w:space="0" w:color="5B9BD5" w:themeColor="accent5"/>
+          <w:insideH w:val="nil"/>
+          <w:insideV w:val="nil"/>
+        </w:tcBorders>
+        <w:shd w:val="clear" w:color="auto" w:fill="5B9BD5" w:themeFill="accent5"/>
+      </w:tcPr>
+    </w:tblStylePr>
+    <w:tblStylePr w:type="lastRow">
+      <w:rPr>
+        <w:b/>
+        <w:bCs/>
+      </w:rPr>
+      <w:tblPr/>
+      <w:tcPr>
+        <w:tcBorders>
+          <w:top w:val="double" w:sz="4" w:space="0" w:color="5B9BD5" w:themeColor="accent5"/>
+        </w:tcBorders>
+      </w:tcPr>
+    </w:tblStylePr>
+    <w:tblStylePr w:type="firstCol">
+      <w:rPr>
+        <w:b/>
+        <w:bCs/>
+      </w:rPr>
+    </w:tblStylePr>
+    <w:tblStylePr w:type="lastCol">
+      <w:rPr>
+        <w:b/>
+        <w:bCs/>
+      </w:rPr>
+    </w:tblStylePr>
+    <w:tblStylePr w:type="band1Vert">
+      <w:tblPr/>
+      <w:tcPr>
+        <w:shd w:val="clear" w:color="auto" w:fill="DEEAF6" w:themeFill="accent5" w:themeFillTint="33"/>
+      </w:tcPr>
+    </w:tblStylePr>
+    <w:tblStylePr w:type="band1Horz">
+      <w:tblPr/>
+      <w:tcPr>
+        <w:shd w:val="clear" w:color="auto" w:fill="DEEAF6" w:themeFill="accent5" w:themeFillTint="33"/>
+      </w:tcPr>
+    </w:tblStylePr>
   </w:style>
 </w:styles>
 </file>

</xml_diff>

<commit_message>
Se incluyo la justificación de Localia
</commit_message>
<xml_diff>
--- a/documentacion/SRS LOCALIA.docx
+++ b/documentacion/SRS LOCALIA.docx
@@ -1,6 +1,6 @@
 
 <file path=word/document.xml><?xml version="1.0" encoding="utf-8"?>
-<w:document xmlns:wpc="http://schemas.microsoft.com/office/word/2010/wordprocessingCanvas" xmlns:cx="http://schemas.microsoft.com/office/drawing/2014/chartex" xmlns:cx1="http://schemas.microsoft.com/office/drawing/2015/9/8/chartex" xmlns:cx2="http://schemas.microsoft.com/office/drawing/2015/10/21/chartex" xmlns:cx3="http://schemas.microsoft.com/office/drawing/2016/5/9/chartex" xmlns:cx4="http://schemas.microsoft.com/office/drawing/2016/5/10/chartex" xmlns:cx5="http://schemas.microsoft.com/office/drawing/2016/5/11/chartex" xmlns:cx6="http://schemas.microsoft.com/office/drawing/2016/5/12/chartex" xmlns:cx7="http://schemas.microsoft.com/office/drawing/2016/5/13/chartex" xmlns:cx8="http://schemas.microsoft.com/office/drawing/2016/5/14/chartex" xmlns:mc="http://schemas.openxmlformats.org/markup-compatibility/2006" xmlns:aink="http://schemas.microsoft.com/office/drawing/2016/ink" xmlns:am3d="http://schemas.microsoft.com/office/drawing/2017/model3d" xmlns:o="urn:schemas-microsoft-com:office:office" xmlns:r="http://schemas.openxmlformats.org/officeDocument/2006/relationships" xmlns:m="http://schemas.openxmlformats.org/officeDocument/2006/math" xmlns:v="urn:schemas-microsoft-com:vml" xmlns:wp14="http://schemas.microsoft.com/office/word/2010/wordprocessingDrawing" xmlns:wp="http://schemas.openxmlformats.org/drawingml/2006/wordprocessingDrawing" xmlns:w10="urn:schemas-microsoft-com:office:word" xmlns:w="http://schemas.openxmlformats.org/wordprocessingml/2006/main" xmlns:w14="http://schemas.microsoft.com/office/word/2010/wordml" xmlns:w15="http://schemas.microsoft.com/office/word/2012/wordml" xmlns:w16cex="http://schemas.microsoft.com/office/word/2018/wordml/cex" xmlns:w16cid="http://schemas.microsoft.com/office/word/2016/wordml/cid" xmlns:w16="http://schemas.microsoft.com/office/word/2018/wordml" xmlns:w16sdtdh="http://schemas.microsoft.com/office/word/2020/wordml/sdtdatahash" xmlns:w16se="http://schemas.microsoft.com/office/word/2015/wordml/symex" xmlns:wpg="http://schemas.microsoft.com/office/word/2010/wordprocessingGroup" xmlns:wpi="http://schemas.microsoft.com/office/word/2010/wordprocessingInk" xmlns:wne="http://schemas.microsoft.com/office/word/2006/wordml" xmlns:wps="http://schemas.microsoft.com/office/word/2010/wordprocessingShape" mc:Ignorable="w14 w15 w16se w16cid w16 w16cex w16sdtdh wp14">
+<w:document xmlns:wpc="http://schemas.microsoft.com/office/word/2010/wordprocessingCanvas" xmlns:cx="http://schemas.microsoft.com/office/drawing/2014/chartex" xmlns:cx1="http://schemas.microsoft.com/office/drawing/2015/9/8/chartex" xmlns:mc="http://schemas.openxmlformats.org/markup-compatibility/2006" xmlns:o="urn:schemas-microsoft-com:office:office" xmlns:r="http://schemas.openxmlformats.org/officeDocument/2006/relationships" xmlns:m="http://schemas.openxmlformats.org/officeDocument/2006/math" xmlns:v="urn:schemas-microsoft-com:vml" xmlns:wp14="http://schemas.microsoft.com/office/word/2010/wordprocessingDrawing" xmlns:wp="http://schemas.openxmlformats.org/drawingml/2006/wordprocessingDrawing" xmlns:w10="urn:schemas-microsoft-com:office:word" xmlns:w="http://schemas.openxmlformats.org/wordprocessingml/2006/main" xmlns:w14="http://schemas.microsoft.com/office/word/2010/wordml" xmlns:w15="http://schemas.microsoft.com/office/word/2012/wordml" xmlns:w16se="http://schemas.microsoft.com/office/word/2015/wordml/symex" xmlns:wpg="http://schemas.microsoft.com/office/word/2010/wordprocessingGroup" xmlns:wpi="http://schemas.microsoft.com/office/word/2010/wordprocessingInk" xmlns:wne="http://schemas.microsoft.com/office/word/2006/wordml" xmlns:wps="http://schemas.microsoft.com/office/word/2010/wordprocessingShape" mc:Ignorable="w14 w15 w16se wp14">
   <w:body>
     <w:p>
       <w:pPr>
@@ -593,7 +593,55 @@
           <w:szCs w:val="24"/>
           <w:lang w:val="es-ES"/>
         </w:rPr>
-        <w:t>Adriana Alinne Abby González Frías</w:t>
+        <w:t xml:space="preserve">Adriana </w:t>
+      </w:r>
+      <w:proofErr w:type="spellStart"/>
+      <w:r>
+        <w:rPr>
+          <w:rFonts w:ascii="Arial" w:eastAsia="Calibri" w:hAnsi="Arial" w:cs="Arial"/>
+          <w:b/>
+          <w:bCs/>
+          <w:sz w:val="24"/>
+          <w:szCs w:val="24"/>
+          <w:lang w:val="es-ES"/>
+        </w:rPr>
+        <w:t>Alinne</w:t>
+      </w:r>
+      <w:proofErr w:type="spellEnd"/>
+      <w:r>
+        <w:rPr>
+          <w:rFonts w:ascii="Arial" w:eastAsia="Calibri" w:hAnsi="Arial" w:cs="Arial"/>
+          <w:b/>
+          <w:bCs/>
+          <w:sz w:val="24"/>
+          <w:szCs w:val="24"/>
+          <w:lang w:val="es-ES"/>
+        </w:rPr>
+        <w:t xml:space="preserve"> </w:t>
+      </w:r>
+      <w:proofErr w:type="spellStart"/>
+      <w:r>
+        <w:rPr>
+          <w:rFonts w:ascii="Arial" w:eastAsia="Calibri" w:hAnsi="Arial" w:cs="Arial"/>
+          <w:b/>
+          <w:bCs/>
+          <w:sz w:val="24"/>
+          <w:szCs w:val="24"/>
+          <w:lang w:val="es-ES"/>
+        </w:rPr>
+        <w:t>Abby</w:t>
+      </w:r>
+      <w:proofErr w:type="spellEnd"/>
+      <w:r>
+        <w:rPr>
+          <w:rFonts w:ascii="Arial" w:eastAsia="Calibri" w:hAnsi="Arial" w:cs="Arial"/>
+          <w:b/>
+          <w:bCs/>
+          <w:sz w:val="24"/>
+          <w:szCs w:val="24"/>
+          <w:lang w:val="es-ES"/>
+        </w:rPr>
+        <w:t xml:space="preserve"> González Frías</w:t>
       </w:r>
     </w:p>
     <w:p>
@@ -609,16 +657,53 @@
           <w:lang w:val="es-ES"/>
         </w:rPr>
       </w:pPr>
-      <w:r>
-        <w:rPr>
-          <w:rFonts w:ascii="Arial" w:eastAsia="Calibri" w:hAnsi="Arial" w:cs="Arial"/>
-          <w:b/>
-          <w:bCs/>
-          <w:sz w:val="24"/>
-          <w:szCs w:val="24"/>
-          <w:lang w:val="es-ES"/>
-        </w:rPr>
-        <w:t xml:space="preserve">Angel Haniel Sánchez Guevara </w:t>
+      <w:proofErr w:type="spellStart"/>
+      <w:r>
+        <w:rPr>
+          <w:rFonts w:ascii="Arial" w:eastAsia="Calibri" w:hAnsi="Arial" w:cs="Arial"/>
+          <w:b/>
+          <w:bCs/>
+          <w:sz w:val="24"/>
+          <w:szCs w:val="24"/>
+          <w:lang w:val="es-ES"/>
+        </w:rPr>
+        <w:t>Angel</w:t>
+      </w:r>
+      <w:proofErr w:type="spellEnd"/>
+      <w:r>
+        <w:rPr>
+          <w:rFonts w:ascii="Arial" w:eastAsia="Calibri" w:hAnsi="Arial" w:cs="Arial"/>
+          <w:b/>
+          <w:bCs/>
+          <w:sz w:val="24"/>
+          <w:szCs w:val="24"/>
+          <w:lang w:val="es-ES"/>
+        </w:rPr>
+        <w:t xml:space="preserve"> </w:t>
+      </w:r>
+      <w:proofErr w:type="spellStart"/>
+      <w:r>
+        <w:rPr>
+          <w:rFonts w:ascii="Arial" w:eastAsia="Calibri" w:hAnsi="Arial" w:cs="Arial"/>
+          <w:b/>
+          <w:bCs/>
+          <w:sz w:val="24"/>
+          <w:szCs w:val="24"/>
+          <w:lang w:val="es-ES"/>
+        </w:rPr>
+        <w:t>Haniel</w:t>
+      </w:r>
+      <w:proofErr w:type="spellEnd"/>
+      <w:r>
+        <w:rPr>
+          <w:rFonts w:ascii="Arial" w:eastAsia="Calibri" w:hAnsi="Arial" w:cs="Arial"/>
+          <w:b/>
+          <w:bCs/>
+          <w:sz w:val="24"/>
+          <w:szCs w:val="24"/>
+          <w:lang w:val="es-ES"/>
+        </w:rPr>
+        <w:t xml:space="preserve"> Sánchez Guevara </w:t>
       </w:r>
     </w:p>
     <w:p>
@@ -947,7 +1032,29 @@
           <w:szCs w:val="24"/>
           <w:lang w:eastAsia="es-MX"/>
         </w:rPr>
-        <w:t>Asimismo, el documento describe la arquitectura basada en microservicios adoptada para el proyecto, los componentes que integran la solución y las restricciones identificadas durante el análisis. Su finalidad es proporcionar una referencia técnica que permita mantener una visión común entre el equipo de desarrollo y las partes interesadas, garantizando la correcta interpretación de los requisitos del sistema.</w:t>
+        <w:t xml:space="preserve">Asimismo, el documento describe la arquitectura basada en </w:t>
+      </w:r>
+      <w:proofErr w:type="spellStart"/>
+      <w:r>
+        <w:rPr>
+          <w:rFonts w:ascii="Times New Roman" w:hAnsi="Times New Roman" w:cs="Times New Roman"/>
+          <w:kern w:val="0"/>
+          <w:sz w:val="24"/>
+          <w:szCs w:val="24"/>
+          <w:lang w:eastAsia="es-MX"/>
+        </w:rPr>
+        <w:t>microservicios</w:t>
+      </w:r>
+      <w:proofErr w:type="spellEnd"/>
+      <w:r>
+        <w:rPr>
+          <w:rFonts w:ascii="Times New Roman" w:hAnsi="Times New Roman" w:cs="Times New Roman"/>
+          <w:kern w:val="0"/>
+          <w:sz w:val="24"/>
+          <w:szCs w:val="24"/>
+          <w:lang w:eastAsia="es-MX"/>
+        </w:rPr>
+        <w:t xml:space="preserve"> adoptada para el proyecto, los componentes que integran la solución y las restricciones identificadas durante el análisis. Su finalidad es proporcionar una referencia técnica que permita mantener una visión común entre el equipo de desarrollo y las partes interesadas, garantizando la correcta interpretación de los requisitos del sistema.</w:t>
       </w:r>
     </w:p>
     <w:p>
@@ -978,7 +1085,29 @@
           <w:szCs w:val="24"/>
           <w:lang w:eastAsia="es-MX"/>
         </w:rPr>
-        <w:t>LOCALIA es una plataforma móvil orientada al fortalecimiento del turismo sostenible y al impulso del comercio local. El sistema tiene como objetivo establecer un vínculo entre los turistas y las pequeñas y medianas empresas (PyMEs) mediante el uso de herramientas tecnológicas que faciliten la identificación de establecimientos cercanos, el acceso a información relevante sobre los negocios y la interacción entre ambas partes.</w:t>
+        <w:t>LOCALIA es una plataforma móvil orientada al fortalecimiento del turismo sostenible y al impulso del comercio local. El sistema tiene como objetivo establecer un vínculo entre los turistas y las pequeñas y medianas empresas (</w:t>
+      </w:r>
+      <w:proofErr w:type="spellStart"/>
+      <w:r>
+        <w:rPr>
+          <w:rFonts w:ascii="Times New Roman" w:hAnsi="Times New Roman" w:cs="Times New Roman"/>
+          <w:kern w:val="0"/>
+          <w:sz w:val="24"/>
+          <w:szCs w:val="24"/>
+          <w:lang w:eastAsia="es-MX"/>
+        </w:rPr>
+        <w:t>PyMEs</w:t>
+      </w:r>
+      <w:proofErr w:type="spellEnd"/>
+      <w:r>
+        <w:rPr>
+          <w:rFonts w:ascii="Times New Roman" w:hAnsi="Times New Roman" w:cs="Times New Roman"/>
+          <w:kern w:val="0"/>
+          <w:sz w:val="24"/>
+          <w:szCs w:val="24"/>
+          <w:lang w:eastAsia="es-MX"/>
+        </w:rPr>
+        <w:t>) mediante el uso de herramientas tecnológicas que faciliten la identificación de establecimientos cercanos, el acceso a información relevante sobre los negocios y la interacción entre ambas partes.</w:t>
       </w:r>
     </w:p>
     <w:p>
@@ -1000,7 +1129,29 @@
           <w:szCs w:val="24"/>
           <w:lang w:eastAsia="es-MX"/>
         </w:rPr>
-        <w:t>La plataforma integra mecanismos de geolocalización, pagos digitales mediante códigos QR e integración con Coppel Pay, permitiendo realizar transacciones de manera rápida y segura. De igual manera, incorpora un sistema de recompensas que incentiva el consumo en establecimientos locales mediante la acumulación de puntos.</w:t>
+        <w:t xml:space="preserve">La plataforma integra mecanismos de geolocalización, pagos digitales mediante códigos QR e integración con Coppel </w:t>
+      </w:r>
+      <w:proofErr w:type="spellStart"/>
+      <w:r>
+        <w:rPr>
+          <w:rFonts w:ascii="Times New Roman" w:hAnsi="Times New Roman" w:cs="Times New Roman"/>
+          <w:kern w:val="0"/>
+          <w:sz w:val="24"/>
+          <w:szCs w:val="24"/>
+          <w:lang w:eastAsia="es-MX"/>
+        </w:rPr>
+        <w:t>Pay</w:t>
+      </w:r>
+      <w:proofErr w:type="spellEnd"/>
+      <w:r>
+        <w:rPr>
+          <w:rFonts w:ascii="Times New Roman" w:hAnsi="Times New Roman" w:cs="Times New Roman"/>
+          <w:kern w:val="0"/>
+          <w:sz w:val="24"/>
+          <w:szCs w:val="24"/>
+          <w:lang w:eastAsia="es-MX"/>
+        </w:rPr>
+        <w:t>, permitiendo realizar transacciones de manera rápida y segura. De igual manera, incorpora un sistema de recompensas que incentiva el consumo en establecimientos locales mediante la acumulación de puntos.</w:t>
       </w:r>
     </w:p>
     <w:p>
@@ -1022,7 +1173,29 @@
           <w:szCs w:val="24"/>
           <w:lang w:eastAsia="es-MX"/>
         </w:rPr>
-        <w:t>Desde la perspectiva técnica, la solución se implementa bajo una arquitectura de microservicios, en la que cada componente opera de forma independiente y se especializa en una función específica, como la gestión de usuarios, la administración de negocios, el procesamiento de pagos, el sistema de recompensas, el envío de notificaciones y la asistencia inteligente. Esta estructura permite mejorar la escalabilidad, el mantenimiento y la disponibilidad del sistema, además de facilitar la incorporación de nuevas funcionalidades sin afectar el funcionamiento general de la plataforma.</w:t>
+        <w:t xml:space="preserve">Desde la perspectiva técnica, la solución se implementa bajo una arquitectura de </w:t>
+      </w:r>
+      <w:proofErr w:type="spellStart"/>
+      <w:r>
+        <w:rPr>
+          <w:rFonts w:ascii="Times New Roman" w:hAnsi="Times New Roman" w:cs="Times New Roman"/>
+          <w:kern w:val="0"/>
+          <w:sz w:val="24"/>
+          <w:szCs w:val="24"/>
+          <w:lang w:eastAsia="es-MX"/>
+        </w:rPr>
+        <w:t>microservicios</w:t>
+      </w:r>
+      <w:proofErr w:type="spellEnd"/>
+      <w:r>
+        <w:rPr>
+          <w:rFonts w:ascii="Times New Roman" w:hAnsi="Times New Roman" w:cs="Times New Roman"/>
+          <w:kern w:val="0"/>
+          <w:sz w:val="24"/>
+          <w:szCs w:val="24"/>
+          <w:lang w:eastAsia="es-MX"/>
+        </w:rPr>
+        <w:t>, en la que cada componente opera de forma independiente y se especializa en una función específica, como la gestión de usuarios, la administración de negocios, el procesamiento de pagos, el sistema de recompensas, el envío de notificaciones y la asistencia inteligente. Esta estructura permite mejorar la escalabilidad, el mantenimiento y la disponibilidad del sistema, además de facilitar la incorporación de nuevas funcionalidades sin afectar el funcionamiento general de la plataforma.</w:t>
       </w:r>
     </w:p>
     <w:p>
@@ -1075,15 +1248,27 @@
           <w:lang w:eastAsia="es-MX"/>
         </w:rPr>
       </w:pPr>
-      <w:r>
-        <w:rPr>
-          <w:rFonts w:ascii="Times New Roman" w:hAnsi="Times New Roman" w:cs="Times New Roman"/>
-          <w:kern w:val="0"/>
-          <w:sz w:val="24"/>
-          <w:szCs w:val="24"/>
-          <w:lang w:eastAsia="es-MX"/>
-        </w:rPr>
-        <w:t xml:space="preserve">PyME: pequeña y mediana empresa. </w:t>
+      <w:proofErr w:type="spellStart"/>
+      <w:r>
+        <w:rPr>
+          <w:rFonts w:ascii="Times New Roman" w:hAnsi="Times New Roman" w:cs="Times New Roman"/>
+          <w:kern w:val="0"/>
+          <w:sz w:val="24"/>
+          <w:szCs w:val="24"/>
+          <w:lang w:eastAsia="es-MX"/>
+        </w:rPr>
+        <w:t>PyME</w:t>
+      </w:r>
+      <w:proofErr w:type="spellEnd"/>
+      <w:r>
+        <w:rPr>
+          <w:rFonts w:ascii="Times New Roman" w:hAnsi="Times New Roman" w:cs="Times New Roman"/>
+          <w:kern w:val="0"/>
+          <w:sz w:val="24"/>
+          <w:szCs w:val="24"/>
+          <w:lang w:eastAsia="es-MX"/>
+        </w:rPr>
+        <w:t xml:space="preserve">: pequeña y mediana empresa. </w:t>
       </w:r>
     </w:p>
     <w:p>
@@ -1113,7 +1298,29 @@
           <w:szCs w:val="24"/>
           <w:lang w:eastAsia="es-MX"/>
         </w:rPr>
-        <w:t xml:space="preserve">JWT (JSON Web Token): mecanismo utilizado para la autenticación y autorización de usuarios. </w:t>
+        <w:t xml:space="preserve">JWT (JSON Web </w:t>
+      </w:r>
+      <w:proofErr w:type="spellStart"/>
+      <w:r>
+        <w:rPr>
+          <w:rFonts w:ascii="Times New Roman" w:hAnsi="Times New Roman" w:cs="Times New Roman"/>
+          <w:kern w:val="0"/>
+          <w:sz w:val="24"/>
+          <w:szCs w:val="24"/>
+          <w:lang w:eastAsia="es-MX"/>
+        </w:rPr>
+        <w:t>Token</w:t>
+      </w:r>
+      <w:proofErr w:type="spellEnd"/>
+      <w:r>
+        <w:rPr>
+          <w:rFonts w:ascii="Times New Roman" w:hAnsi="Times New Roman" w:cs="Times New Roman"/>
+          <w:kern w:val="0"/>
+          <w:sz w:val="24"/>
+          <w:szCs w:val="24"/>
+          <w:lang w:eastAsia="es-MX"/>
+        </w:rPr>
+        <w:t xml:space="preserve">): mecanismo utilizado para la autenticación y autorización de usuarios. </w:t>
       </w:r>
     </w:p>
     <w:p>
@@ -1143,7 +1350,29 @@
           <w:szCs w:val="24"/>
           <w:lang w:eastAsia="es-MX"/>
         </w:rPr>
-        <w:t xml:space="preserve">QR (Quick Response Code): código que permite realizar pagos de forma rápida. </w:t>
+        <w:t xml:space="preserve">QR (Quick Response </w:t>
+      </w:r>
+      <w:proofErr w:type="spellStart"/>
+      <w:r>
+        <w:rPr>
+          <w:rFonts w:ascii="Times New Roman" w:hAnsi="Times New Roman" w:cs="Times New Roman"/>
+          <w:kern w:val="0"/>
+          <w:sz w:val="24"/>
+          <w:szCs w:val="24"/>
+          <w:lang w:eastAsia="es-MX"/>
+        </w:rPr>
+        <w:t>Code</w:t>
+      </w:r>
+      <w:proofErr w:type="spellEnd"/>
+      <w:r>
+        <w:rPr>
+          <w:rFonts w:ascii="Times New Roman" w:hAnsi="Times New Roman" w:cs="Times New Roman"/>
+          <w:kern w:val="0"/>
+          <w:sz w:val="24"/>
+          <w:szCs w:val="24"/>
+          <w:lang w:eastAsia="es-MX"/>
+        </w:rPr>
+        <w:t xml:space="preserve">): código que permite realizar pagos de forma rápida. </w:t>
       </w:r>
     </w:p>
     <w:p>
@@ -1165,6 +1394,7 @@
           <w:lang w:eastAsia="es-MX"/>
         </w:rPr>
       </w:pPr>
+      <w:proofErr w:type="spellStart"/>
       <w:r>
         <w:rPr>
           <w:rFonts w:ascii="Times New Roman" w:hAnsi="Times New Roman" w:cs="Times New Roman"/>
@@ -1174,7 +1404,40 @@
           <w:lang w:eastAsia="es-MX"/>
         </w:rPr>
         <w:lastRenderedPageBreak/>
-        <w:t xml:space="preserve">RabbitMQ: herramienta utilizada para la comunicación entre los microservicios. </w:t>
+        <w:t>RabbitMQ</w:t>
+      </w:r>
+      <w:proofErr w:type="spellEnd"/>
+      <w:r>
+        <w:rPr>
+          <w:rFonts w:ascii="Times New Roman" w:hAnsi="Times New Roman" w:cs="Times New Roman"/>
+          <w:kern w:val="0"/>
+          <w:sz w:val="24"/>
+          <w:szCs w:val="24"/>
+          <w:lang w:eastAsia="es-MX"/>
+        </w:rPr>
+        <w:t xml:space="preserve">: herramienta utilizada para la comunicación entre los </w:t>
+      </w:r>
+      <w:proofErr w:type="spellStart"/>
+      <w:r>
+        <w:rPr>
+          <w:rFonts w:ascii="Times New Roman" w:hAnsi="Times New Roman" w:cs="Times New Roman"/>
+          <w:kern w:val="0"/>
+          <w:sz w:val="24"/>
+          <w:szCs w:val="24"/>
+          <w:lang w:eastAsia="es-MX"/>
+        </w:rPr>
+        <w:t>microservicios</w:t>
+      </w:r>
+      <w:proofErr w:type="spellEnd"/>
+      <w:r>
+        <w:rPr>
+          <w:rFonts w:ascii="Times New Roman" w:hAnsi="Times New Roman" w:cs="Times New Roman"/>
+          <w:kern w:val="0"/>
+          <w:sz w:val="24"/>
+          <w:szCs w:val="24"/>
+          <w:lang w:eastAsia="es-MX"/>
+        </w:rPr>
+        <w:t xml:space="preserve">. </w:t>
       </w:r>
     </w:p>
     <w:p>
@@ -1204,7 +1467,51 @@
           <w:szCs w:val="24"/>
           <w:lang w:eastAsia="es-MX"/>
         </w:rPr>
-        <w:t xml:space="preserve">SRS (Software Requirements Specification): documento en el que se establecen los requisitos del sistema. </w:t>
+        <w:t xml:space="preserve">SRS (Software </w:t>
+      </w:r>
+      <w:proofErr w:type="spellStart"/>
+      <w:r>
+        <w:rPr>
+          <w:rFonts w:ascii="Times New Roman" w:hAnsi="Times New Roman" w:cs="Times New Roman"/>
+          <w:kern w:val="0"/>
+          <w:sz w:val="24"/>
+          <w:szCs w:val="24"/>
+          <w:lang w:eastAsia="es-MX"/>
+        </w:rPr>
+        <w:t>Requirements</w:t>
+      </w:r>
+      <w:proofErr w:type="spellEnd"/>
+      <w:r>
+        <w:rPr>
+          <w:rFonts w:ascii="Times New Roman" w:hAnsi="Times New Roman" w:cs="Times New Roman"/>
+          <w:kern w:val="0"/>
+          <w:sz w:val="24"/>
+          <w:szCs w:val="24"/>
+          <w:lang w:eastAsia="es-MX"/>
+        </w:rPr>
+        <w:t xml:space="preserve"> </w:t>
+      </w:r>
+      <w:proofErr w:type="spellStart"/>
+      <w:r>
+        <w:rPr>
+          <w:rFonts w:ascii="Times New Roman" w:hAnsi="Times New Roman" w:cs="Times New Roman"/>
+          <w:kern w:val="0"/>
+          <w:sz w:val="24"/>
+          <w:szCs w:val="24"/>
+          <w:lang w:eastAsia="es-MX"/>
+        </w:rPr>
+        <w:t>Specification</w:t>
+      </w:r>
+      <w:proofErr w:type="spellEnd"/>
+      <w:r>
+        <w:rPr>
+          <w:rFonts w:ascii="Times New Roman" w:hAnsi="Times New Roman" w:cs="Times New Roman"/>
+          <w:kern w:val="0"/>
+          <w:sz w:val="24"/>
+          <w:szCs w:val="24"/>
+          <w:lang w:eastAsia="es-MX"/>
+        </w:rPr>
+        <w:t xml:space="preserve">): documento en el que se establecen los requisitos del sistema. </w:t>
       </w:r>
     </w:p>
     <w:p>
@@ -1301,7 +1608,29 @@
           <w:szCs w:val="24"/>
           <w:lang w:eastAsia="es-MX"/>
         </w:rPr>
-        <w:t xml:space="preserve">La falta de una plataforma centralizada que permita a las PyMEs aumentar su visibilidad. </w:t>
+        <w:t xml:space="preserve">La falta de una plataforma centralizada que permita a las </w:t>
+      </w:r>
+      <w:proofErr w:type="spellStart"/>
+      <w:r>
+        <w:rPr>
+          <w:rFonts w:ascii="Times New Roman" w:hAnsi="Times New Roman" w:cs="Times New Roman"/>
+          <w:kern w:val="0"/>
+          <w:sz w:val="24"/>
+          <w:szCs w:val="24"/>
+          <w:lang w:eastAsia="es-MX"/>
+        </w:rPr>
+        <w:t>PyMEs</w:t>
+      </w:r>
+      <w:proofErr w:type="spellEnd"/>
+      <w:r>
+        <w:rPr>
+          <w:rFonts w:ascii="Times New Roman" w:hAnsi="Times New Roman" w:cs="Times New Roman"/>
+          <w:kern w:val="0"/>
+          <w:sz w:val="24"/>
+          <w:szCs w:val="24"/>
+          <w:lang w:eastAsia="es-MX"/>
+        </w:rPr>
+        <w:t xml:space="preserve"> aumentar su visibilidad. </w:t>
       </w:r>
     </w:p>
     <w:p>
@@ -1396,6 +1725,191 @@
     </w:p>
     <w:p>
       <w:pPr>
+        <w:pStyle w:val="Ttulo2"/>
+        <w:jc w:val="both"/>
+      </w:pPr>
+      <w:r>
+        <w:t>2.2 Justificación</w:t>
+      </w:r>
+    </w:p>
+    <w:p>
+      <w:pPr>
+        <w:pStyle w:val="Prrafodelista"/>
+        <w:numPr>
+          <w:ilvl w:val="0"/>
+          <w:numId w:val="3"/>
+        </w:numPr>
+        <w:jc w:val="both"/>
+        <w:rPr>
+          <w:rFonts w:ascii="Times New Roman" w:hAnsi="Times New Roman" w:cs="Times New Roman"/>
+          <w:kern w:val="0"/>
+          <w:sz w:val="24"/>
+          <w:szCs w:val="24"/>
+          <w:lang w:eastAsia="es-MX"/>
+        </w:rPr>
+      </w:pPr>
+      <w:r>
+        <w:rPr>
+          <w:rFonts w:ascii="Times New Roman" w:hAnsi="Times New Roman" w:cs="Times New Roman"/>
+          <w:kern w:val="0"/>
+          <w:sz w:val="24"/>
+          <w:szCs w:val="24"/>
+          <w:lang w:eastAsia="es-MX"/>
+        </w:rPr>
+        <w:t>Impacto Económico Local: Mantiene la riq</w:t>
+      </w:r>
+      <w:bookmarkStart w:id="0" w:name="_GoBack"/>
+      <w:bookmarkEnd w:id="0"/>
+      <w:r>
+        <w:rPr>
+          <w:rFonts w:ascii="Times New Roman" w:hAnsi="Times New Roman" w:cs="Times New Roman"/>
+          <w:kern w:val="0"/>
+          <w:sz w:val="24"/>
+          <w:szCs w:val="24"/>
+          <w:lang w:eastAsia="es-MX"/>
+        </w:rPr>
+        <w:t xml:space="preserve">ueza dentro de la comunidad incentivando el consumo en </w:t>
+      </w:r>
+      <w:proofErr w:type="spellStart"/>
+      <w:r>
+        <w:rPr>
+          <w:rFonts w:ascii="Times New Roman" w:hAnsi="Times New Roman" w:cs="Times New Roman"/>
+          <w:kern w:val="0"/>
+          <w:sz w:val="24"/>
+          <w:szCs w:val="24"/>
+          <w:lang w:eastAsia="es-MX"/>
+        </w:rPr>
+        <w:t>PyMEs</w:t>
+      </w:r>
+      <w:proofErr w:type="spellEnd"/>
+      <w:r>
+        <w:rPr>
+          <w:rFonts w:ascii="Times New Roman" w:hAnsi="Times New Roman" w:cs="Times New Roman"/>
+          <w:kern w:val="0"/>
+          <w:sz w:val="24"/>
+          <w:szCs w:val="24"/>
+          <w:lang w:eastAsia="es-MX"/>
+        </w:rPr>
+        <w:t xml:space="preserve"> mediante recompensas.</w:t>
+      </w:r>
+    </w:p>
+    <w:p>
+      <w:pPr>
+        <w:pStyle w:val="Prrafodelista"/>
+        <w:numPr>
+          <w:ilvl w:val="0"/>
+          <w:numId w:val="3"/>
+        </w:numPr>
+        <w:jc w:val="both"/>
+        <w:rPr>
+          <w:rFonts w:ascii="Times New Roman" w:hAnsi="Times New Roman" w:cs="Times New Roman"/>
+          <w:kern w:val="0"/>
+          <w:sz w:val="24"/>
+          <w:szCs w:val="24"/>
+          <w:lang w:eastAsia="es-MX"/>
+        </w:rPr>
+      </w:pPr>
+      <w:r>
+        <w:rPr>
+          <w:rFonts w:ascii="Times New Roman" w:hAnsi="Times New Roman" w:cs="Times New Roman"/>
+          <w:kern w:val="0"/>
+          <w:sz w:val="24"/>
+          <w:szCs w:val="24"/>
+          <w:lang w:eastAsia="es-MX"/>
+        </w:rPr>
+        <w:t>Modernización Digital: Ofrece a pequeños comercios un canal accesible de cobro y visibilidad sin requerir software propio costoso.</w:t>
+      </w:r>
+    </w:p>
+    <w:p>
+      <w:pPr>
+        <w:pStyle w:val="Prrafodelista"/>
+        <w:numPr>
+          <w:ilvl w:val="0"/>
+          <w:numId w:val="3"/>
+        </w:numPr>
+        <w:jc w:val="both"/>
+        <w:rPr>
+          <w:rFonts w:ascii="Times New Roman" w:hAnsi="Times New Roman" w:cs="Times New Roman"/>
+          <w:kern w:val="0"/>
+          <w:sz w:val="24"/>
+          <w:szCs w:val="24"/>
+          <w:lang w:eastAsia="es-MX"/>
+        </w:rPr>
+      </w:pPr>
+      <w:r>
+        <w:rPr>
+          <w:rFonts w:ascii="Times New Roman" w:hAnsi="Times New Roman" w:cs="Times New Roman"/>
+          <w:kern w:val="0"/>
+          <w:sz w:val="24"/>
+          <w:szCs w:val="24"/>
+          <w:lang w:eastAsia="es-MX"/>
+        </w:rPr>
+        <w:t>Experiencia Turística: Simplifica el descubrimiento y pago en comercios locales de manera fluida y segura.</w:t>
+      </w:r>
+    </w:p>
+    <w:p>
+      <w:pPr>
+        <w:pStyle w:val="Prrafodelista"/>
+        <w:numPr>
+          <w:ilvl w:val="0"/>
+          <w:numId w:val="3"/>
+        </w:numPr>
+        <w:jc w:val="both"/>
+        <w:rPr>
+          <w:rFonts w:ascii="Times New Roman" w:hAnsi="Times New Roman" w:cs="Times New Roman"/>
+          <w:kern w:val="0"/>
+          <w:sz w:val="24"/>
+          <w:szCs w:val="24"/>
+          <w:lang w:eastAsia="es-MX"/>
+        </w:rPr>
+      </w:pPr>
+      <w:r>
+        <w:rPr>
+          <w:rFonts w:ascii="Times New Roman" w:hAnsi="Times New Roman" w:cs="Times New Roman"/>
+          <w:kern w:val="0"/>
+          <w:sz w:val="24"/>
+          <w:szCs w:val="24"/>
+          <w:lang w:eastAsia="es-MX"/>
+        </w:rPr>
+        <w:t xml:space="preserve">Escalabilidad Técnica: Arquitectura de </w:t>
+      </w:r>
+      <w:proofErr w:type="spellStart"/>
+      <w:r>
+        <w:rPr>
+          <w:rFonts w:ascii="Times New Roman" w:hAnsi="Times New Roman" w:cs="Times New Roman"/>
+          <w:kern w:val="0"/>
+          <w:sz w:val="24"/>
+          <w:szCs w:val="24"/>
+          <w:lang w:eastAsia="es-MX"/>
+        </w:rPr>
+        <w:t>microservicios</w:t>
+      </w:r>
+      <w:proofErr w:type="spellEnd"/>
+      <w:r>
+        <w:rPr>
+          <w:rFonts w:ascii="Times New Roman" w:hAnsi="Times New Roman" w:cs="Times New Roman"/>
+          <w:kern w:val="0"/>
+          <w:sz w:val="24"/>
+          <w:szCs w:val="24"/>
+          <w:lang w:eastAsia="es-MX"/>
+        </w:rPr>
+        <w:t xml:space="preserve"> que permite escalar módulos de manera independiente según la demanda de tráfico.</w:t>
+      </w:r>
+    </w:p>
+    <w:p>
+      <w:pPr>
+        <w:jc w:val="both"/>
+        <w:rPr>
+          <w:rFonts w:ascii="Times New Roman" w:hAnsi="Times New Roman" w:cs="Times New Roman"/>
+          <w:kern w:val="0"/>
+          <w:sz w:val="24"/>
+          <w:szCs w:val="24"/>
+          <w:lang w:eastAsia="es-MX"/>
+        </w:rPr>
+      </w:pPr>
+    </w:p>
+    <w:p>
+      <w:pPr>
         <w:pStyle w:val="Ttulo1"/>
       </w:pPr>
       <w:r>
@@ -1427,7 +1941,15 @@
         </w:numPr>
       </w:pPr>
       <w:r>
-        <w:t xml:space="preserve">Permitir el registro, inicio de sesión y gestión de sesiones mediante tokens JWT. </w:t>
+        <w:t xml:space="preserve">Permitir el registro, inicio de sesión y gestión de sesiones mediante </w:t>
+      </w:r>
+      <w:proofErr w:type="spellStart"/>
+      <w:r>
+        <w:t>tokens</w:t>
+      </w:r>
+      <w:proofErr w:type="spellEnd"/>
+      <w:r>
+        <w:t xml:space="preserve"> JWT. </w:t>
       </w:r>
     </w:p>
     <w:p>
@@ -1467,7 +1989,15 @@
         </w:numPr>
       </w:pPr>
       <w:r>
-        <w:t xml:space="preserve">Almacenar y consultar la información de PyMEs mediante coordenadas geográficas nativas. </w:t>
+        <w:t xml:space="preserve">Almacenar y consultar la información de </w:t>
+      </w:r>
+      <w:proofErr w:type="spellStart"/>
+      <w:r>
+        <w:t>PyMEs</w:t>
+      </w:r>
+      <w:proofErr w:type="spellEnd"/>
+      <w:r>
+        <w:t xml:space="preserve"> mediante coordenadas geográficas nativas. </w:t>
       </w:r>
     </w:p>
     <w:p>
@@ -1495,6 +2025,7 @@
           <w:b/>
           <w:bCs/>
         </w:rPr>
+        <w:lastRenderedPageBreak/>
         <w:t>RF-03: Procesamiento de Pagos Digitales</w:t>
       </w:r>
     </w:p>
@@ -1519,7 +2050,15 @@
         </w:numPr>
       </w:pPr>
       <w:r>
-        <w:t xml:space="preserve">Permitir transacciones financieras integradas con Coppel Pay. </w:t>
+        <w:t xml:space="preserve">Permitir transacciones financieras integradas con Coppel </w:t>
+      </w:r>
+      <w:proofErr w:type="spellStart"/>
+      <w:r>
+        <w:t>Pay</w:t>
+      </w:r>
+      <w:proofErr w:type="spellEnd"/>
+      <w:r>
+        <w:t xml:space="preserve">. </w:t>
       </w:r>
     </w:p>
     <w:p>
@@ -1599,7 +2138,15 @@
         </w:numPr>
       </w:pPr>
       <w:r>
-        <w:t xml:space="preserve">Notificar a las PyMEs sobre compras completadas y mensajes entrantes. </w:t>
+        <w:t xml:space="preserve">Notificar a las </w:t>
+      </w:r>
+      <w:proofErr w:type="spellStart"/>
+      <w:r>
+        <w:t>PyMEs</w:t>
+      </w:r>
+      <w:proofErr w:type="spellEnd"/>
+      <w:r>
+        <w:t xml:space="preserve"> sobre compras completadas y mensajes entrantes. </w:t>
       </w:r>
     </w:p>
     <w:p>
@@ -1615,7 +2162,23 @@
           <w:b/>
           <w:bCs/>
         </w:rPr>
-        <w:t>RF-06: Asistente Virtual Inteligente (Chatbot LIA)</w:t>
+        <w:t>RF-06: Asistente Virtual Inteligente (</w:t>
+      </w:r>
+      <w:proofErr w:type="spellStart"/>
+      <w:r>
+        <w:rPr>
+          <w:b/>
+          <w:bCs/>
+        </w:rPr>
+        <w:t>Chatbot</w:t>
+      </w:r>
+      <w:proofErr w:type="spellEnd"/>
+      <w:r>
+        <w:rPr>
+          <w:b/>
+          <w:bCs/>
+        </w:rPr>
+        <w:t xml:space="preserve"> LIA)</w:t>
       </w:r>
     </w:p>
     <w:p>
@@ -1627,7 +2190,6 @@
         </w:numPr>
       </w:pPr>
       <w:r>
-        <w:lastRenderedPageBreak/>
         <w:t xml:space="preserve">Recomendar comercios y explicar platillos locales indicando ingredientes o alérgenos. </w:t>
       </w:r>
     </w:p>
@@ -1668,7 +2230,15 @@
         </w:numPr>
       </w:pPr>
       <w:r>
-        <w:t xml:space="preserve">Soportar un chat privado para el intercambio de mensajes entre el turista y la PyME. </w:t>
+        <w:t xml:space="preserve">Soportar un chat privado para el intercambio de mensajes entre el turista y la </w:t>
+      </w:r>
+      <w:proofErr w:type="spellStart"/>
+      <w:r>
+        <w:t>PyME</w:t>
+      </w:r>
+      <w:proofErr w:type="spellEnd"/>
+      <w:r>
+        <w:t xml:space="preserve">. </w:t>
       </w:r>
     </w:p>
     <w:p>
@@ -1687,7 +2257,7 @@
     </w:p>
     <w:tbl>
       <w:tblPr>
-        <w:tblStyle w:val="Tablaconcuadrcula4-nfasis5"/>
+        <w:tblStyle w:val="Tabladecuadrcula4-nfasis5"/>
         <w:tblW w:w="0" w:type="auto"/>
         <w:tblLook w:val="04A0" w:firstRow="1" w:lastRow="0" w:firstColumn="1" w:lastColumn="0" w:noHBand="0" w:noVBand="1"/>
       </w:tblPr>
@@ -1858,8 +2428,23 @@
                 <w:lang w:eastAsia="es-MX"/>
                 <w14:ligatures w14:val="none"/>
               </w:rPr>
-              <w:t>RNF-01: Microservicios</w:t>
+              <w:t xml:space="preserve">RNF-01: </w:t>
             </w:r>
+            <w:proofErr w:type="spellStart"/>
+            <w:r>
+              <w:rPr>
+                <w:rFonts w:ascii="Times New Roman" w:eastAsia="Times New Roman" w:hAnsi="Times New Roman" w:cs="Times New Roman"/>
+                <w:b/>
+                <w:bCs/>
+                <w:kern w:val="0"/>
+                <w:sz w:val="24"/>
+                <w:szCs w:val="24"/>
+                <w:lang w:eastAsia="es-MX"/>
+                <w14:ligatures w14:val="none"/>
+              </w:rPr>
+              <w:t>Microservicios</w:t>
+            </w:r>
+            <w:proofErr w:type="spellEnd"/>
           </w:p>
         </w:tc>
         <w:tc>
@@ -1984,7 +2569,55 @@
                 <w:lang w:eastAsia="es-MX"/>
                 <w14:ligatures w14:val="none"/>
               </w:rPr>
-              <w:t xml:space="preserve">Uso de PostgreSQL para la gestión relacional de usuarios y MongoDB para búsquedas geoespaciales. </w:t>
+              <w:t xml:space="preserve">Uso de </w:t>
+            </w:r>
+            <w:proofErr w:type="spellStart"/>
+            <w:r>
+              <w:rPr>
+                <w:rFonts w:ascii="Times New Roman" w:eastAsia="Times New Roman" w:hAnsi="Times New Roman" w:cs="Times New Roman"/>
+                <w:kern w:val="0"/>
+                <w:sz w:val="24"/>
+                <w:szCs w:val="24"/>
+                <w:lang w:eastAsia="es-MX"/>
+                <w14:ligatures w14:val="none"/>
+              </w:rPr>
+              <w:t>PostgreSQL</w:t>
+            </w:r>
+            <w:proofErr w:type="spellEnd"/>
+            <w:r>
+              <w:rPr>
+                <w:rFonts w:ascii="Times New Roman" w:eastAsia="Times New Roman" w:hAnsi="Times New Roman" w:cs="Times New Roman"/>
+                <w:kern w:val="0"/>
+                <w:sz w:val="24"/>
+                <w:szCs w:val="24"/>
+                <w:lang w:eastAsia="es-MX"/>
+                <w14:ligatures w14:val="none"/>
+              </w:rPr>
+              <w:t xml:space="preserve"> para la gestión relacional de usuarios y </w:t>
+            </w:r>
+            <w:proofErr w:type="spellStart"/>
+            <w:r>
+              <w:rPr>
+                <w:rFonts w:ascii="Times New Roman" w:eastAsia="Times New Roman" w:hAnsi="Times New Roman" w:cs="Times New Roman"/>
+                <w:kern w:val="0"/>
+                <w:sz w:val="24"/>
+                <w:szCs w:val="24"/>
+                <w:lang w:eastAsia="es-MX"/>
+                <w14:ligatures w14:val="none"/>
+              </w:rPr>
+              <w:t>MongoDB</w:t>
+            </w:r>
+            <w:proofErr w:type="spellEnd"/>
+            <w:r>
+              <w:rPr>
+                <w:rFonts w:ascii="Times New Roman" w:eastAsia="Times New Roman" w:hAnsi="Times New Roman" w:cs="Times New Roman"/>
+                <w:kern w:val="0"/>
+                <w:sz w:val="24"/>
+                <w:szCs w:val="24"/>
+                <w:lang w:eastAsia="es-MX"/>
+                <w14:ligatures w14:val="none"/>
+              </w:rPr>
+              <w:t xml:space="preserve"> para búsquedas geoespaciales. </w:t>
             </w:r>
           </w:p>
         </w:tc>
@@ -2082,7 +2715,31 @@
                 <w:lang w:eastAsia="es-MX"/>
                 <w14:ligatures w14:val="none"/>
               </w:rPr>
-              <w:t xml:space="preserve">Procesamiento de eventos transaccionales mediante bus de mensajería en RabbitMQ. </w:t>
+              <w:t xml:space="preserve">Procesamiento de eventos transaccionales mediante bus de mensajería en </w:t>
+            </w:r>
+            <w:proofErr w:type="spellStart"/>
+            <w:r>
+              <w:rPr>
+                <w:rFonts w:ascii="Times New Roman" w:eastAsia="Times New Roman" w:hAnsi="Times New Roman" w:cs="Times New Roman"/>
+                <w:kern w:val="0"/>
+                <w:sz w:val="24"/>
+                <w:szCs w:val="24"/>
+                <w:lang w:eastAsia="es-MX"/>
+                <w14:ligatures w14:val="none"/>
+              </w:rPr>
+              <w:t>RabbitMQ</w:t>
+            </w:r>
+            <w:proofErr w:type="spellEnd"/>
+            <w:r>
+              <w:rPr>
+                <w:rFonts w:ascii="Times New Roman" w:eastAsia="Times New Roman" w:hAnsi="Times New Roman" w:cs="Times New Roman"/>
+                <w:kern w:val="0"/>
+                <w:sz w:val="24"/>
+                <w:szCs w:val="24"/>
+                <w:lang w:eastAsia="es-MX"/>
+                <w14:ligatures w14:val="none"/>
+              </w:rPr>
+              <w:t xml:space="preserve">. </w:t>
             </w:r>
           </w:p>
         </w:tc>
@@ -2378,7 +3035,18 @@
     </w:tbl>
     <w:p>
       <w:pPr>
-        <w:pStyle w:val="NormalWeb"/>
+        <w:tabs>
+          <w:tab w:val="num" w:pos="720"/>
+        </w:tabs>
+        <w:jc w:val="both"/>
+        <w:rPr>
+          <w:rFonts w:ascii="Times New Roman" w:eastAsia="Times New Roman" w:hAnsi="Times New Roman" w:cs="Times New Roman"/>
+          <w:kern w:val="0"/>
+          <w:sz w:val="24"/>
+          <w:szCs w:val="24"/>
+          <w:lang w:eastAsia="es-MX"/>
+          <w14:ligatures w14:val="none"/>
+        </w:rPr>
       </w:pPr>
     </w:p>
     <w:p>
@@ -2434,8 +3102,229 @@
 </file>
 
 <file path=word/numbering.xml><?xml version="1.0" encoding="utf-8"?>
-<w:numbering xmlns:wpc="http://schemas.microsoft.com/office/word/2010/wordprocessingCanvas" xmlns:cx="http://schemas.microsoft.com/office/drawing/2014/chartex" xmlns:cx1="http://schemas.microsoft.com/office/drawing/2015/9/8/chartex" xmlns:cx2="http://schemas.microsoft.com/office/drawing/2015/10/21/chartex" xmlns:cx3="http://schemas.microsoft.com/office/drawing/2016/5/9/chartex" xmlns:cx4="http://schemas.microsoft.com/office/drawing/2016/5/10/chartex" xmlns:cx5="http://schemas.microsoft.com/office/drawing/2016/5/11/chartex" xmlns:cx6="http://schemas.microsoft.com/office/drawing/2016/5/12/chartex" xmlns:cx7="http://schemas.microsoft.com/office/drawing/2016/5/13/chartex" xmlns:cx8="http://schemas.microsoft.com/office/drawing/2016/5/14/chartex" xmlns:mc="http://schemas.openxmlformats.org/markup-compatibility/2006" xmlns:aink="http://schemas.microsoft.com/office/drawing/2016/ink" xmlns:am3d="http://schemas.microsoft.com/office/drawing/2017/model3d" xmlns:o="urn:schemas-microsoft-com:office:office" xmlns:r="http://schemas.openxmlformats.org/officeDocument/2006/relationships" xmlns:m="http://schemas.openxmlformats.org/officeDocument/2006/math" xmlns:v="urn:schemas-microsoft-com:vml" xmlns:wp14="http://schemas.microsoft.com/office/word/2010/wordprocessingDrawing" xmlns:wp="http://schemas.openxmlformats.org/drawingml/2006/wordprocessingDrawing" xmlns:w10="urn:schemas-microsoft-com:office:word" xmlns:w="http://schemas.openxmlformats.org/wordprocessingml/2006/main" xmlns:w14="http://schemas.microsoft.com/office/word/2010/wordml" xmlns:w15="http://schemas.microsoft.com/office/word/2012/wordml" xmlns:w16cex="http://schemas.microsoft.com/office/word/2018/wordml/cex" xmlns:w16cid="http://schemas.microsoft.com/office/word/2016/wordml/cid" xmlns:w16="http://schemas.microsoft.com/office/word/2018/wordml" xmlns:w16sdtdh="http://schemas.microsoft.com/office/word/2020/wordml/sdtdatahash" xmlns:w16se="http://schemas.microsoft.com/office/word/2015/wordml/symex" xmlns:wpg="http://schemas.microsoft.com/office/word/2010/wordprocessingGroup" xmlns:wpi="http://schemas.microsoft.com/office/word/2010/wordprocessingInk" xmlns:wne="http://schemas.microsoft.com/office/word/2006/wordml" xmlns:wps="http://schemas.microsoft.com/office/word/2010/wordprocessingShape" mc:Ignorable="w14 w15 w16se w16cid w16 w16cex w16sdtdh wp14">
+<w:numbering xmlns:wpc="http://schemas.microsoft.com/office/word/2010/wordprocessingCanvas" xmlns:cx="http://schemas.microsoft.com/office/drawing/2014/chartex" xmlns:cx1="http://schemas.microsoft.com/office/drawing/2015/9/8/chartex" xmlns:mc="http://schemas.openxmlformats.org/markup-compatibility/2006" xmlns:o="urn:schemas-microsoft-com:office:office" xmlns:r="http://schemas.openxmlformats.org/officeDocument/2006/relationships" xmlns:m="http://schemas.openxmlformats.org/officeDocument/2006/math" xmlns:v="urn:schemas-microsoft-com:vml" xmlns:wp14="http://schemas.microsoft.com/office/word/2010/wordprocessingDrawing" xmlns:wp="http://schemas.openxmlformats.org/drawingml/2006/wordprocessingDrawing" xmlns:w10="urn:schemas-microsoft-com:office:word" xmlns:w="http://schemas.openxmlformats.org/wordprocessingml/2006/main" xmlns:w14="http://schemas.microsoft.com/office/word/2010/wordml" xmlns:w15="http://schemas.microsoft.com/office/word/2012/wordml" xmlns:w16se="http://schemas.microsoft.com/office/word/2015/wordml/symex" xmlns:wpg="http://schemas.microsoft.com/office/word/2010/wordprocessingGroup" xmlns:wpi="http://schemas.microsoft.com/office/word/2010/wordprocessingInk" xmlns:wne="http://schemas.microsoft.com/office/word/2006/wordml" xmlns:wps="http://schemas.microsoft.com/office/word/2010/wordprocessingShape" mc:Ignorable="w14 w15 w16se wp14">
   <w:abstractNum w:abstractNumId="0" w15:restartNumberingAfterBreak="0">
+    <w:nsid w:val="04A31974"/>
+    <w:multiLevelType w:val="multilevel"/>
+    <w:tmpl w:val="4454CDE0"/>
+    <w:lvl w:ilvl="0">
+      <w:start w:val="1"/>
+      <w:numFmt w:val="bullet"/>
+      <w:lvlText w:val="●"/>
+      <w:lvlJc w:val="left"/>
+      <w:pPr>
+        <w:ind w:left="600" w:hanging="360"/>
+      </w:pPr>
+      <w:rPr>
+        <w:rFonts w:ascii="Arial" w:eastAsia="Arial" w:hAnsi="Arial" w:cs="Arial"/>
+        <w:b w:val="0"/>
+        <w:bCs w:val="0"/>
+        <w:i w:val="0"/>
+        <w:iCs w:val="0"/>
+        <w:smallCaps w:val="0"/>
+        <w:strike w:val="0"/>
+        <w:color w:val="000000"/>
+        <w:sz w:val="22"/>
+        <w:szCs w:val="22"/>
+        <w:u w:val="none"/>
+        <w:shd w:val="clear" w:color="auto" w:fill="auto"/>
+        <w:vertAlign w:val="baseline"/>
+      </w:rPr>
+    </w:lvl>
+    <w:lvl w:ilvl="1">
+      <w:start w:val="1"/>
+      <w:numFmt w:val="bullet"/>
+      <w:lvlText w:val="○"/>
+      <w:lvlJc w:val="left"/>
+      <w:pPr>
+        <w:ind w:left="1440" w:hanging="360"/>
+      </w:pPr>
+      <w:rPr>
+        <w:rFonts w:ascii="Arial" w:eastAsia="Arial" w:hAnsi="Arial" w:cs="Arial"/>
+        <w:b w:val="0"/>
+        <w:bCs w:val="0"/>
+        <w:i w:val="0"/>
+        <w:iCs w:val="0"/>
+        <w:smallCaps w:val="0"/>
+        <w:strike w:val="0"/>
+        <w:color w:val="000000"/>
+        <w:sz w:val="22"/>
+        <w:szCs w:val="22"/>
+        <w:u w:val="none"/>
+        <w:shd w:val="clear" w:color="auto" w:fill="auto"/>
+        <w:vertAlign w:val="baseline"/>
+      </w:rPr>
+    </w:lvl>
+    <w:lvl w:ilvl="2">
+      <w:start w:val="1"/>
+      <w:numFmt w:val="bullet"/>
+      <w:lvlText w:val="■"/>
+      <w:lvlJc w:val="left"/>
+      <w:pPr>
+        <w:ind w:left="2160" w:hanging="360"/>
+      </w:pPr>
+      <w:rPr>
+        <w:rFonts w:ascii="Arial" w:eastAsia="Arial" w:hAnsi="Arial" w:cs="Arial"/>
+        <w:b w:val="0"/>
+        <w:bCs w:val="0"/>
+        <w:i w:val="0"/>
+        <w:iCs w:val="0"/>
+        <w:smallCaps w:val="0"/>
+        <w:strike w:val="0"/>
+        <w:color w:val="000000"/>
+        <w:sz w:val="22"/>
+        <w:szCs w:val="22"/>
+        <w:u w:val="none"/>
+        <w:shd w:val="clear" w:color="auto" w:fill="auto"/>
+        <w:vertAlign w:val="baseline"/>
+      </w:rPr>
+    </w:lvl>
+    <w:lvl w:ilvl="3">
+      <w:start w:val="1"/>
+      <w:numFmt w:val="bullet"/>
+      <w:lvlText w:val="■"/>
+      <w:lvlJc w:val="left"/>
+      <w:pPr>
+        <w:ind w:left="2880" w:hanging="360"/>
+      </w:pPr>
+      <w:rPr>
+        <w:rFonts w:ascii="Arial" w:eastAsia="Arial" w:hAnsi="Arial" w:cs="Arial"/>
+        <w:b w:val="0"/>
+        <w:bCs w:val="0"/>
+        <w:i w:val="0"/>
+        <w:iCs w:val="0"/>
+        <w:smallCaps w:val="0"/>
+        <w:strike w:val="0"/>
+        <w:color w:val="000000"/>
+        <w:sz w:val="22"/>
+        <w:szCs w:val="22"/>
+        <w:u w:val="none"/>
+        <w:shd w:val="clear" w:color="auto" w:fill="auto"/>
+        <w:vertAlign w:val="baseline"/>
+      </w:rPr>
+    </w:lvl>
+    <w:lvl w:ilvl="4">
+      <w:start w:val="1"/>
+      <w:numFmt w:val="bullet"/>
+      <w:lvlText w:val="■"/>
+      <w:lvlJc w:val="left"/>
+      <w:pPr>
+        <w:ind w:left="3600" w:hanging="360"/>
+      </w:pPr>
+      <w:rPr>
+        <w:rFonts w:ascii="Arial" w:eastAsia="Arial" w:hAnsi="Arial" w:cs="Arial"/>
+        <w:b w:val="0"/>
+        <w:bCs w:val="0"/>
+        <w:i w:val="0"/>
+        <w:iCs w:val="0"/>
+        <w:smallCaps w:val="0"/>
+        <w:strike w:val="0"/>
+        <w:color w:val="000000"/>
+        <w:sz w:val="22"/>
+        <w:szCs w:val="22"/>
+        <w:u w:val="none"/>
+        <w:shd w:val="clear" w:color="auto" w:fill="auto"/>
+        <w:vertAlign w:val="baseline"/>
+      </w:rPr>
+    </w:lvl>
+    <w:lvl w:ilvl="5">
+      <w:start w:val="1"/>
+      <w:numFmt w:val="bullet"/>
+      <w:lvlText w:val="■"/>
+      <w:lvlJc w:val="left"/>
+      <w:pPr>
+        <w:ind w:left="4320" w:hanging="360"/>
+      </w:pPr>
+      <w:rPr>
+        <w:rFonts w:ascii="Arial" w:eastAsia="Arial" w:hAnsi="Arial" w:cs="Arial"/>
+        <w:b w:val="0"/>
+        <w:bCs w:val="0"/>
+        <w:i w:val="0"/>
+        <w:iCs w:val="0"/>
+        <w:smallCaps w:val="0"/>
+        <w:strike w:val="0"/>
+        <w:color w:val="000000"/>
+        <w:sz w:val="22"/>
+        <w:szCs w:val="22"/>
+        <w:u w:val="none"/>
+        <w:shd w:val="clear" w:color="auto" w:fill="auto"/>
+        <w:vertAlign w:val="baseline"/>
+      </w:rPr>
+    </w:lvl>
+    <w:lvl w:ilvl="6">
+      <w:start w:val="1"/>
+      <w:numFmt w:val="bullet"/>
+      <w:lvlText w:val="■"/>
+      <w:lvlJc w:val="left"/>
+      <w:pPr>
+        <w:ind w:left="5040" w:hanging="360"/>
+      </w:pPr>
+      <w:rPr>
+        <w:rFonts w:ascii="Arial" w:eastAsia="Arial" w:hAnsi="Arial" w:cs="Arial"/>
+        <w:b w:val="0"/>
+        <w:bCs w:val="0"/>
+        <w:i w:val="0"/>
+        <w:iCs w:val="0"/>
+        <w:smallCaps w:val="0"/>
+        <w:strike w:val="0"/>
+        <w:color w:val="000000"/>
+        <w:sz w:val="22"/>
+        <w:szCs w:val="22"/>
+        <w:u w:val="none"/>
+        <w:shd w:val="clear" w:color="auto" w:fill="auto"/>
+        <w:vertAlign w:val="baseline"/>
+      </w:rPr>
+    </w:lvl>
+    <w:lvl w:ilvl="7">
+      <w:start w:val="1"/>
+      <w:numFmt w:val="bullet"/>
+      <w:lvlText w:val="■"/>
+      <w:lvlJc w:val="left"/>
+      <w:pPr>
+        <w:ind w:left="5760" w:hanging="360"/>
+      </w:pPr>
+      <w:rPr>
+        <w:rFonts w:ascii="Arial" w:eastAsia="Arial" w:hAnsi="Arial" w:cs="Arial"/>
+        <w:b w:val="0"/>
+        <w:bCs w:val="0"/>
+        <w:i w:val="0"/>
+        <w:iCs w:val="0"/>
+        <w:smallCaps w:val="0"/>
+        <w:strike w:val="0"/>
+        <w:color w:val="000000"/>
+        <w:sz w:val="22"/>
+        <w:szCs w:val="22"/>
+        <w:u w:val="none"/>
+        <w:shd w:val="clear" w:color="auto" w:fill="auto"/>
+        <w:vertAlign w:val="baseline"/>
+      </w:rPr>
+    </w:lvl>
+    <w:lvl w:ilvl="8">
+      <w:start w:val="1"/>
+      <w:numFmt w:val="bullet"/>
+      <w:lvlText w:val="■"/>
+      <w:lvlJc w:val="left"/>
+      <w:pPr>
+        <w:ind w:left="6480" w:hanging="360"/>
+      </w:pPr>
+      <w:rPr>
+        <w:rFonts w:ascii="Arial" w:eastAsia="Arial" w:hAnsi="Arial" w:cs="Arial"/>
+        <w:b w:val="0"/>
+        <w:bCs w:val="0"/>
+        <w:i w:val="0"/>
+        <w:iCs w:val="0"/>
+        <w:smallCaps w:val="0"/>
+        <w:strike w:val="0"/>
+        <w:color w:val="000000"/>
+        <w:sz w:val="22"/>
+        <w:szCs w:val="22"/>
+        <w:u w:val="none"/>
+        <w:shd w:val="clear" w:color="auto" w:fill="auto"/>
+        <w:vertAlign w:val="baseline"/>
+      </w:rPr>
+    </w:lvl>
+  </w:abstractNum>
+  <w:abstractNum w:abstractNumId="1" w15:restartNumberingAfterBreak="0">
     <w:nsid w:val="0F642C9D"/>
     <w:multiLevelType w:val="multilevel"/>
     <w:tmpl w:val="63C883A4"/>
@@ -2584,7 +3473,7 @@
       </w:rPr>
     </w:lvl>
   </w:abstractNum>
-  <w:abstractNum w:abstractNumId="1" w15:restartNumberingAfterBreak="0">
+  <w:abstractNum w:abstractNumId="2" w15:restartNumberingAfterBreak="0">
     <w:nsid w:val="438D4760"/>
     <w:multiLevelType w:val="hybridMultilevel"/>
     <w:tmpl w:val="C666B85A"/>
@@ -2697,7 +3586,7 @@
       </w:rPr>
     </w:lvl>
   </w:abstractNum>
-  <w:abstractNum w:abstractNumId="2" w15:restartNumberingAfterBreak="0">
+  <w:abstractNum w:abstractNumId="3" w15:restartNumberingAfterBreak="0">
     <w:nsid w:val="4C61728A"/>
     <w:multiLevelType w:val="hybridMultilevel"/>
     <w:tmpl w:val="EACE7172"/>
@@ -2810,7 +3699,7 @@
       </w:rPr>
     </w:lvl>
   </w:abstractNum>
-  <w:abstractNum w:abstractNumId="3" w15:restartNumberingAfterBreak="0">
+  <w:abstractNum w:abstractNumId="4" w15:restartNumberingAfterBreak="0">
     <w:nsid w:val="53C74621"/>
     <w:multiLevelType w:val="multilevel"/>
     <w:tmpl w:val="3BEC1E2C"/>
@@ -2959,7 +3848,7 @@
       </w:rPr>
     </w:lvl>
   </w:abstractNum>
-  <w:abstractNum w:abstractNumId="4" w15:restartNumberingAfterBreak="0">
+  <w:abstractNum w:abstractNumId="5" w15:restartNumberingAfterBreak="0">
     <w:nsid w:val="7E775DBD"/>
     <w:multiLevelType w:val="multilevel"/>
     <w:tmpl w:val="EE8C3AFE"/>
@@ -3109,25 +3998,28 @@
     </w:lvl>
   </w:abstractNum>
   <w:num w:numId="1">
+    <w:abstractNumId w:val="5"/>
+  </w:num>
+  <w:num w:numId="2">
     <w:abstractNumId w:val="4"/>
   </w:num>
-  <w:num w:numId="2">
+  <w:num w:numId="3">
     <w:abstractNumId w:val="3"/>
   </w:num>
-  <w:num w:numId="3">
+  <w:num w:numId="4">
     <w:abstractNumId w:val="2"/>
   </w:num>
-  <w:num w:numId="4">
+  <w:num w:numId="5">
     <w:abstractNumId w:val="1"/>
   </w:num>
-  <w:num w:numId="5">
+  <w:num w:numId="6">
     <w:abstractNumId w:val="0"/>
   </w:num>
 </w:numbering>
 </file>
 
 <file path=word/styles.xml><?xml version="1.0" encoding="utf-8"?>
-<w:styles xmlns:mc="http://schemas.openxmlformats.org/markup-compatibility/2006" xmlns:r="http://schemas.openxmlformats.org/officeDocument/2006/relationships" xmlns:w="http://schemas.openxmlformats.org/wordprocessingml/2006/main" xmlns:w14="http://schemas.microsoft.com/office/word/2010/wordml" xmlns:w15="http://schemas.microsoft.com/office/word/2012/wordml" xmlns:w16cex="http://schemas.microsoft.com/office/word/2018/wordml/cex" xmlns:w16cid="http://schemas.microsoft.com/office/word/2016/wordml/cid" xmlns:w16="http://schemas.microsoft.com/office/word/2018/wordml" xmlns:w16sdtdh="http://schemas.microsoft.com/office/word/2020/wordml/sdtdatahash" xmlns:w16se="http://schemas.microsoft.com/office/word/2015/wordml/symex" mc:Ignorable="w14 w15 w16se w16cid w16 w16cex w16sdtdh">
+<w:styles xmlns:mc="http://schemas.openxmlformats.org/markup-compatibility/2006" xmlns:r="http://schemas.openxmlformats.org/officeDocument/2006/relationships" xmlns:w="http://schemas.openxmlformats.org/wordprocessingml/2006/main" xmlns:w14="http://schemas.microsoft.com/office/word/2010/wordml" xmlns:w15="http://schemas.microsoft.com/office/word/2012/wordml" xmlns:w16se="http://schemas.microsoft.com/office/word/2015/wordml/symex" mc:Ignorable="w14 w15 w16se">
   <w:docDefaults>
     <w:rPrDefault>
       <w:rPr>
@@ -3145,7 +4037,7 @@
       </w:pPr>
     </w:pPrDefault>
   </w:docDefaults>
-  <w:latentStyles w:defLockedState="0" w:defUIPriority="99" w:defSemiHidden="0" w:defUnhideWhenUsed="0" w:defQFormat="0" w:count="376">
+  <w:latentStyles w:defLockedState="0" w:defUIPriority="99" w:defSemiHidden="0" w:defUnhideWhenUsed="0" w:defQFormat="0" w:count="371">
     <w:lsdException w:name="Normal" w:uiPriority="0" w:qFormat="1"/>
     <w:lsdException w:name="heading 1" w:uiPriority="9" w:qFormat="1"/>
     <w:lsdException w:name="heading 2" w:semiHidden="1" w:uiPriority="9" w:unhideWhenUsed="1" w:qFormat="1"/>
@@ -3251,6 +4143,7 @@
     <w:lsdException w:name="HTML Sample" w:semiHidden="1" w:unhideWhenUsed="1"/>
     <w:lsdException w:name="HTML Typewriter" w:semiHidden="1" w:unhideWhenUsed="1"/>
     <w:lsdException w:name="HTML Variable" w:semiHidden="1" w:unhideWhenUsed="1"/>
+    <w:lsdException w:name="Normal Table" w:semiHidden="1" w:unhideWhenUsed="1"/>
     <w:lsdException w:name="annotation subject" w:semiHidden="1" w:unhideWhenUsed="1"/>
     <w:lsdException w:name="No List" w:semiHidden="1" w:unhideWhenUsed="1"/>
     <w:lsdException w:name="Outline List 1" w:semiHidden="1" w:unhideWhenUsed="1"/>
@@ -3293,8 +4186,11 @@
     <w:lsdException w:name="Table Contemporary" w:semiHidden="1" w:unhideWhenUsed="1"/>
     <w:lsdException w:name="Table Elegant" w:semiHidden="1" w:unhideWhenUsed="1"/>
     <w:lsdException w:name="Table Professional" w:semiHidden="1" w:unhideWhenUsed="1"/>
+    <w:lsdException w:name="Table Subtle 1" w:semiHidden="1" w:unhideWhenUsed="1"/>
     <w:lsdException w:name="Table Subtle 2" w:semiHidden="1" w:unhideWhenUsed="1"/>
     <w:lsdException w:name="Table Web 1" w:semiHidden="1" w:unhideWhenUsed="1"/>
+    <w:lsdException w:name="Table Web 2" w:semiHidden="1" w:unhideWhenUsed="1"/>
+    <w:lsdException w:name="Table Web 3" w:semiHidden="1" w:unhideWhenUsed="1"/>
     <w:lsdException w:name="Balloon Text" w:semiHidden="1" w:unhideWhenUsed="1"/>
     <w:lsdException w:name="Table Grid" w:uiPriority="39"/>
     <w:lsdException w:name="Table Theme" w:semiHidden="1" w:unhideWhenUsed="1"/>
@@ -3513,11 +4409,6 @@
     <w:lsdException w:name="List Table 5 Dark Accent 6" w:uiPriority="50"/>
     <w:lsdException w:name="List Table 6 Colorful Accent 6" w:uiPriority="51"/>
     <w:lsdException w:name="List Table 7 Colorful Accent 6" w:uiPriority="52"/>
-    <w:lsdException w:name="Mention" w:semiHidden="1" w:unhideWhenUsed="1"/>
-    <w:lsdException w:name="Smart Hyperlink" w:semiHidden="1" w:unhideWhenUsed="1"/>
-    <w:lsdException w:name="Hashtag" w:semiHidden="1" w:unhideWhenUsed="1"/>
-    <w:lsdException w:name="Unresolved Mention" w:semiHidden="1" w:unhideWhenUsed="1"/>
-    <w:lsdException w:name="Smart Link" w:semiHidden="1" w:unhideWhenUsed="1"/>
   </w:latentStyles>
   <w:style w:type="paragraph" w:default="1" w:styleId="Normal">
     <w:name w:val="Normal"/>
@@ -3696,7 +4587,7 @@
       <w:contextualSpacing/>
     </w:pPr>
   </w:style>
-  <w:style w:type="table" w:styleId="Tablaconcuadrcula4-nfasis5">
+  <w:style w:type="table" w:styleId="Tabladecuadrcula4-nfasis5">
     <w:name w:val="Grid Table 4 Accent 5"/>
     <w:basedOn w:val="Tablanormal"/>
     <w:uiPriority w:val="49"/>

</xml_diff>

<commit_message>
Se definieron los perfiles de los usuarios
</commit_message>
<xml_diff>
--- a/documentacion/SRS LOCALIA.docx
+++ b/documentacion/SRS LOCALIA.docx
@@ -1756,19 +1756,7 @@
           <w:szCs w:val="24"/>
           <w:lang w:eastAsia="es-MX"/>
         </w:rPr>
-        <w:t>Impacto Económico Local: Mantiene la riq</w:t>
-      </w:r>
-      <w:bookmarkStart w:id="0" w:name="_GoBack"/>
-      <w:bookmarkEnd w:id="0"/>
-      <w:r>
-        <w:rPr>
-          <w:rFonts w:ascii="Times New Roman" w:hAnsi="Times New Roman" w:cs="Times New Roman"/>
-          <w:kern w:val="0"/>
-          <w:sz w:val="24"/>
-          <w:szCs w:val="24"/>
-          <w:lang w:eastAsia="es-MX"/>
-        </w:rPr>
-        <w:t xml:space="preserve">ueza dentro de la comunidad incentivando el consumo en </w:t>
+        <w:t xml:space="preserve">Impacto Económico Local: Mantiene la riqueza dentro de la comunidad incentivando el consumo en </w:t>
       </w:r>
       <w:proofErr w:type="spellStart"/>
       <w:r>
@@ -1898,15 +1886,126 @@
     </w:p>
     <w:p>
       <w:pPr>
+        <w:pStyle w:val="Ttulo2"/>
         <w:jc w:val="both"/>
-        <w:rPr>
-          <w:rFonts w:ascii="Times New Roman" w:hAnsi="Times New Roman" w:cs="Times New Roman"/>
-          <w:kern w:val="0"/>
-          <w:sz w:val="24"/>
-          <w:szCs w:val="24"/>
-          <w:lang w:eastAsia="es-MX"/>
-        </w:rPr>
-      </w:pPr>
+      </w:pPr>
+      <w:r>
+        <w:t>2.3</w:t>
+      </w:r>
+      <w:r>
+        <w:t xml:space="preserve"> P</w:t>
+      </w:r>
+      <w:r>
+        <w:t>erfiles</w:t>
+      </w:r>
+      <w:r>
+        <w:t xml:space="preserve"> definidos</w:t>
+      </w:r>
+      <w:bookmarkStart w:id="0" w:name="_GoBack"/>
+      <w:bookmarkEnd w:id="0"/>
+    </w:p>
+    <w:p>
+      <w:pPr>
+        <w:pStyle w:val="Prrafodelista"/>
+        <w:numPr>
+          <w:ilvl w:val="0"/>
+          <w:numId w:val="3"/>
+        </w:numPr>
+        <w:jc w:val="both"/>
+        <w:rPr>
+          <w:rFonts w:ascii="Times New Roman" w:hAnsi="Times New Roman" w:cs="Times New Roman"/>
+          <w:kern w:val="0"/>
+          <w:sz w:val="24"/>
+          <w:szCs w:val="24"/>
+          <w:lang w:eastAsia="es-MX"/>
+        </w:rPr>
+      </w:pPr>
+      <w:r>
+        <w:rPr>
+          <w:rFonts w:ascii="Times New Roman" w:hAnsi="Times New Roman" w:cs="Times New Roman"/>
+          <w:kern w:val="0"/>
+          <w:sz w:val="24"/>
+          <w:szCs w:val="24"/>
+          <w:lang w:eastAsia="es-MX"/>
+        </w:rPr>
+        <w:t>Turista: Explora el mapa de negocios cercanos, realiza pagos mediante código QR y acumula/consulta puntos de recompensa.</w:t>
+      </w:r>
+    </w:p>
+    <w:p>
+      <w:pPr>
+        <w:pStyle w:val="Prrafodelista"/>
+        <w:numPr>
+          <w:ilvl w:val="0"/>
+          <w:numId w:val="3"/>
+        </w:numPr>
+        <w:jc w:val="both"/>
+        <w:rPr>
+          <w:rFonts w:ascii="Times New Roman" w:hAnsi="Times New Roman" w:cs="Times New Roman"/>
+          <w:kern w:val="0"/>
+          <w:sz w:val="24"/>
+          <w:szCs w:val="24"/>
+          <w:lang w:eastAsia="es-MX"/>
+        </w:rPr>
+      </w:pPr>
+      <w:r>
+        <w:rPr>
+          <w:rFonts w:ascii="Times New Roman" w:hAnsi="Times New Roman" w:cs="Times New Roman"/>
+          <w:kern w:val="0"/>
+          <w:sz w:val="24"/>
+          <w:szCs w:val="24"/>
+          <w:lang w:eastAsia="es-MX"/>
+        </w:rPr>
+        <w:t>Dueño de Negocio (</w:t>
+      </w:r>
+      <w:proofErr w:type="spellStart"/>
+      <w:r>
+        <w:rPr>
+          <w:rFonts w:ascii="Times New Roman" w:hAnsi="Times New Roman" w:cs="Times New Roman"/>
+          <w:kern w:val="0"/>
+          <w:sz w:val="24"/>
+          <w:szCs w:val="24"/>
+          <w:lang w:eastAsia="es-MX"/>
+        </w:rPr>
+        <w:t>PyME</w:t>
+      </w:r>
+      <w:proofErr w:type="spellEnd"/>
+      <w:r>
+        <w:rPr>
+          <w:rFonts w:ascii="Times New Roman" w:hAnsi="Times New Roman" w:cs="Times New Roman"/>
+          <w:kern w:val="0"/>
+          <w:sz w:val="24"/>
+          <w:szCs w:val="24"/>
+          <w:lang w:eastAsia="es-MX"/>
+        </w:rPr>
+        <w:t>): Registra y gestiona la información de su establecimiento, genera códigos QR para cobros y consulta el historial de transacciones recibidas.</w:t>
+      </w:r>
+    </w:p>
+    <w:p>
+      <w:pPr>
+        <w:pStyle w:val="Prrafodelista"/>
+        <w:numPr>
+          <w:ilvl w:val="0"/>
+          <w:numId w:val="3"/>
+        </w:numPr>
+        <w:jc w:val="both"/>
+        <w:rPr>
+          <w:rFonts w:ascii="Times New Roman" w:hAnsi="Times New Roman" w:cs="Times New Roman"/>
+          <w:kern w:val="0"/>
+          <w:sz w:val="24"/>
+          <w:szCs w:val="24"/>
+          <w:lang w:eastAsia="es-MX"/>
+        </w:rPr>
+      </w:pPr>
+      <w:r>
+        <w:rPr>
+          <w:rFonts w:ascii="Times New Roman" w:hAnsi="Times New Roman" w:cs="Times New Roman"/>
+          <w:kern w:val="0"/>
+          <w:sz w:val="24"/>
+          <w:szCs w:val="24"/>
+          <w:lang w:eastAsia="es-MX"/>
+        </w:rPr>
+        <w:t>Administrador: Gestiona permisos, valida la autenticidad de los negocios registrados y supervisa la estabilidad global de la plataforma.</w:t>
+      </w:r>
     </w:p>
     <w:p>
       <w:pPr>
@@ -1941,6 +2040,7 @@
         </w:numPr>
       </w:pPr>
       <w:r>
+        <w:lastRenderedPageBreak/>
         <w:t xml:space="preserve">Permitir el registro, inicio de sesión y gestión de sesiones mediante </w:t>
       </w:r>
       <w:proofErr w:type="spellStart"/>
@@ -2025,7 +2125,6 @@
           <w:b/>
           <w:bCs/>
         </w:rPr>
-        <w:lastRenderedPageBreak/>
         <w:t>RF-03: Procesamiento de Pagos Digitales</w:t>
       </w:r>
     </w:p>
@@ -2771,6 +2870,7 @@
                 <w:lang w:eastAsia="es-MX"/>
                 <w14:ligatures w14:val="none"/>
               </w:rPr>
+              <w:lastRenderedPageBreak/>
               <w:t>Seguridad</w:t>
             </w:r>
           </w:p>

</xml_diff>